<commit_message>
Second commit: Implemented a 4 state FSM for the device status on the Fabric ledger.
</commit_message>
<xml_diff>
--- a/Walkthrough.docx
+++ b/Walkthrough.docx
@@ -18,8 +18,6 @@
         </w:rPr>
         <w:t>Testing Walkthrough — Decentralized IoT Auth</w:t>
       </w:r>
-      <w:bookmarkStart w:id="0" w:name="_GoBack"/>
-      <w:bookmarkEnd w:id="0"/>
     </w:p>
     <w:p>
       <w:r>
@@ -43,7 +41,7 @@
     <w:p>
       <w:r>
         <w:pict>
-          <v:rect id="_x0000_i1081" style="width:386.75pt;height:.75pt" o:hrpct="0" o:hralign="center" o:hrstd="t" o:hr="t" fillcolor="#a0a0a0" stroked="f"/>
+          <v:rect id="_x0000_i1025" style="width:386.75pt;height:.75pt" o:hrpct="0" o:hralign="center" o:hrstd="t" o:hr="t" fillcolor="#a0a0a0" stroked="f"/>
         </w:pict>
       </w:r>
     </w:p>
@@ -68,7 +66,15 @@
       </w:r>
     </w:p>
     <w:p>
-      <w:r>
+      <w:pPr>
+        <w:rPr>
+          <w:color w:val="00B050"/>
+        </w:rPr>
+      </w:pPr>
+      <w:r>
+        <w:rPr>
+          <w:color w:val="00B050"/>
+        </w:rPr>
         <w:t>taskkill /im node.exe /f 2&gt;nul</w:t>
       </w:r>
     </w:p>
@@ -83,7 +89,15 @@
       </w:r>
     </w:p>
     <w:p>
-      <w:r>
+      <w:pPr>
+        <w:rPr>
+          <w:color w:val="00B050"/>
+        </w:rPr>
+      </w:pPr>
+      <w:r>
+        <w:rPr>
+          <w:color w:val="00B050"/>
+        </w:rPr>
         <w:t>netstat -aon | findstr :3000</w:t>
       </w:r>
     </w:p>
@@ -95,7 +109,7 @@
     <w:p>
       <w:r>
         <w:pict>
-          <v:rect id="_x0000_i1082" style="width:386.75pt;height:.75pt" o:hrpct="0" o:hralign="center" o:hrstd="t" o:hr="t" fillcolor="#a0a0a0" stroked="f"/>
+          <v:rect id="_x0000_i1026" style="width:386.75pt;height:.75pt" o:hrpct="0" o:hralign="center" o:hrstd="t" o:hr="t" fillcolor="#a0a0a0" stroked="f"/>
         </w:pict>
       </w:r>
     </w:p>
@@ -120,7 +134,15 @@
       </w:r>
     </w:p>
     <w:p>
-      <w:r>
+      <w:pPr>
+        <w:rPr>
+          <w:color w:val="00B050"/>
+        </w:rPr>
+      </w:pPr>
+      <w:r>
+        <w:rPr>
+          <w:color w:val="00B050"/>
+        </w:rPr>
         <w:t>wsl bash ./startNetwork.sh</w:t>
       </w:r>
     </w:p>
@@ -169,7 +191,7 @@
     <w:p>
       <w:r>
         <w:pict>
-          <v:rect id="_x0000_i1083" style="width:386.75pt;height:.75pt" o:hrpct="0" o:hralign="center" o:hrstd="t" o:hr="t" fillcolor="#a0a0a0" stroked="f"/>
+          <v:rect id="_x0000_i1027" style="width:386.75pt;height:.75pt" o:hrpct="0" o:hralign="center" o:hrstd="t" o:hr="t" fillcolor="#a0a0a0" stroked="f"/>
         </w:pict>
       </w:r>
     </w:p>
@@ -194,7 +216,15 @@
       </w:r>
     </w:p>
     <w:p>
-      <w:r>
+      <w:pPr>
+        <w:rPr>
+          <w:color w:val="00B050"/>
+        </w:rPr>
+      </w:pPr>
+      <w:r>
+        <w:rPr>
+          <w:color w:val="00B050"/>
+        </w:rPr>
         <w:t>wsl bash ./deployChaincode.sh</w:t>
       </w:r>
     </w:p>
@@ -237,7 +267,7 @@
     <w:p>
       <w:r>
         <w:pict>
-          <v:rect id="_x0000_i1084" style="width:386.75pt;height:.75pt" o:hrpct="0" o:hralign="center" o:hrstd="t" o:hr="t" fillcolor="#a0a0a0" stroked="f"/>
+          <v:rect id="_x0000_i1028" style="width:386.75pt;height:.75pt" o:hrpct="0" o:hralign="center" o:hrstd="t" o:hr="t" fillcolor="#a0a0a0" stroked="f"/>
         </w:pict>
       </w:r>
     </w:p>
@@ -297,7 +327,15 @@
       </w:r>
     </w:p>
     <w:p>
-      <w:r>
+      <w:pPr>
+        <w:rPr>
+          <w:color w:val="00B050"/>
+        </w:rPr>
+      </w:pPr>
+      <w:r>
+        <w:rPr>
+          <w:color w:val="00B050"/>
+        </w:rPr>
         <w:lastRenderedPageBreak/>
         <w:t>node src/app.js</w:t>
       </w:r>
@@ -361,7 +399,7 @@
     <w:p>
       <w:r>
         <w:pict>
-          <v:rect id="_x0000_i1085" style="width:386.75pt;height:.75pt" o:hrpct="0" o:hralign="center" o:hrstd="t" o:hr="t" fillcolor="#a0a0a0" stroked="f"/>
+          <v:rect id="_x0000_i1029" style="width:386.75pt;height:.75pt" o:hrpct="0" o:hralign="center" o:hrstd="t" o:hr="t" fillcolor="#a0a0a0" stroked="f"/>
         </w:pict>
       </w:r>
     </w:p>
@@ -406,7 +444,15 @@
       </w:r>
     </w:p>
     <w:p>
-      <w:r>
+      <w:pPr>
+        <w:rPr>
+          <w:color w:val="00B050"/>
+        </w:rPr>
+      </w:pPr>
+      <w:r>
+        <w:rPr>
+          <w:color w:val="00B050"/>
+        </w:rPr>
         <w:t>npm run dev</w:t>
       </w:r>
     </w:p>
@@ -425,7 +471,7 @@
     <w:p>
       <w:r>
         <w:pict>
-          <v:rect id="_x0000_i1086" style="width:386.75pt;height:.75pt" o:hrpct="0" o:hralign="center" o:hrstd="t" o:hr="t" fillcolor="#a0a0a0" stroked="f"/>
+          <v:rect id="_x0000_i1030" style="width:386.75pt;height:.75pt" o:hrpct="0" o:hralign="center" o:hrstd="t" o:hr="t" fillcolor="#a0a0a0" stroked="f"/>
         </w:pict>
       </w:r>
     </w:p>
@@ -572,7 +618,7 @@
     <w:p>
       <w:r>
         <w:pict>
-          <v:rect id="_x0000_i1087" style="width:386.75pt;height:.75pt" o:hrpct="0" o:hralign="center" o:hrstd="t" o:hr="t" fillcolor="#a0a0a0" stroked="f"/>
+          <v:rect id="_x0000_i1031" style="width:386.75pt;height:.75pt" o:hrpct="0" o:hralign="center" o:hrstd="t" o:hr="t" fillcolor="#a0a0a0" stroked="f"/>
         </w:pict>
       </w:r>
     </w:p>
@@ -602,7 +648,15 @@
       </w:r>
     </w:p>
     <w:p>
-      <w:r>
+      <w:pPr>
+        <w:rPr>
+          <w:color w:val="00B050"/>
+        </w:rPr>
+      </w:pPr>
+      <w:r>
+        <w:rPr>
+          <w:color w:val="00B050"/>
+        </w:rPr>
         <w:lastRenderedPageBreak/>
         <w:t>wsl bash /mnt/c/Users/Marius/OneDrive/Desktop/Dizertatie/AuthApp/query_device.sh &lt;device-id&gt;</w:t>
       </w:r>
@@ -636,11 +690,13 @@
       <w:r>
         <w:t>true</w:t>
       </w:r>
+      <w:bookmarkStart w:id="0" w:name="_GoBack"/>
+      <w:bookmarkEnd w:id="0"/>
     </w:p>
     <w:p>
       <w:r>
         <w:pict>
-          <v:rect id="_x0000_i1088" style="width:386.75pt;height:.75pt" o:hrpct="0" o:hralign="center" o:hrstd="t" o:hr="t" fillcolor="#a0a0a0" stroked="f"/>
+          <v:rect id="_x0000_i1032" style="width:386.75pt;height:.75pt" o:hrpct="0" o:hralign="center" o:hrstd="t" o:hr="t" fillcolor="#a0a0a0" stroked="f"/>
         </w:pict>
       </w:r>
     </w:p>
@@ -705,7 +761,7 @@
     <w:p>
       <w:r>
         <w:pict>
-          <v:rect id="_x0000_i1089" style="width:386.75pt;height:.75pt" o:hrpct="0" o:hralign="center" o:hrstd="t" o:hr="t" fillcolor="#a0a0a0" stroked="f"/>
+          <v:rect id="_x0000_i1033" style="width:386.75pt;height:.75pt" o:hrpct="0" o:hralign="center" o:hrstd="t" o:hr="t" fillcolor="#a0a0a0" stroked="f"/>
         </w:pict>
       </w:r>
     </w:p>
@@ -735,12 +791,28 @@
       </w:r>
     </w:p>
     <w:p>
-      <w:r>
+      <w:pPr>
+        <w:rPr>
+          <w:color w:val="00B050"/>
+        </w:rPr>
+      </w:pPr>
+      <w:r>
+        <w:rPr>
+          <w:color w:val="00B050"/>
+        </w:rPr>
         <w:t>taskkill /im node.exe /f</w:t>
       </w:r>
     </w:p>
     <w:p>
-      <w:r>
+      <w:pPr>
+        <w:rPr>
+          <w:color w:val="00B050"/>
+        </w:rPr>
+      </w:pPr>
+      <w:r>
+        <w:rPr>
+          <w:color w:val="00B050"/>
+        </w:rPr>
         <w:t>wsl bash -c "cd /mnt/c/Users/Marius/OneDrive/Desktop/Dizertatie/Hyperledger-Fabric/fabric-samples/test-network &amp;&amp; ./network.sh down"</w:t>
       </w:r>
     </w:p>
@@ -1546,6 +1618,7 @@
   <w:style w:type="character" w:default="1" w:styleId="DefaultParagraphFont">
     <w:name w:val="Default Paragraph Font"/>
     <w:uiPriority w:val="1"/>
+    <w:semiHidden/>
     <w:unhideWhenUsed/>
   </w:style>
   <w:style w:type="table" w:default="1" w:styleId="TableNormal">

</xml_diff>

<commit_message>
Third commit: Implemented metrics for the Dashboard to view the Performance of Fabric Authentication.
</commit_message>
<xml_diff>
--- a/Walkthrough.docx
+++ b/Walkthrough.docx
@@ -387,7 +387,15 @@
       </w:r>
     </w:p>
     <w:p>
-      <w:r>
+      <w:pPr>
+        <w:rPr>
+          <w:color w:val="FF0000"/>
+        </w:rPr>
+      </w:pPr>
+      <w:r>
+        <w:rPr>
+          <w:color w:val="FF0000"/>
+        </w:rPr>
         <w:t>netstat -aon | findstr :3000</w:t>
       </w:r>
     </w:p>
@@ -690,8 +698,6 @@
       <w:r>
         <w:t>true</w:t>
       </w:r>
-      <w:bookmarkStart w:id="0" w:name="_GoBack"/>
-      <w:bookmarkEnd w:id="0"/>
     </w:p>
     <w:p>
       <w:r>
@@ -816,6 +822,40 @@
         <w:t>wsl bash -c "cd /mnt/c/Users/Marius/OneDrive/Desktop/Dizertatie/Hyperledger-Fabric/fabric-samples/test-network &amp;&amp; ./network.sh down"</w:t>
       </w:r>
     </w:p>
+    <w:p>
+      <w:pPr>
+        <w:rPr>
+          <w:b/>
+        </w:rPr>
+      </w:pPr>
+      <w:r>
+        <w:rPr>
+          <w:b/>
+        </w:rPr>
+        <w:br/>
+        <w:t>Block Height check</w:t>
+      </w:r>
+    </w:p>
+    <w:p>
+      <w:r>
+        <w:t>cmd:</w:t>
+      </w:r>
+    </w:p>
+    <w:p>
+      <w:pPr>
+        <w:rPr>
+          <w:color w:val="7030A0"/>
+        </w:rPr>
+      </w:pPr>
+      <w:bookmarkStart w:id="0" w:name="_GoBack"/>
+      <w:r>
+        <w:rPr>
+          <w:color w:val="7030A0"/>
+        </w:rPr>
+        <w:t>docker exec -it peer0.org1.example.com peer channel getinfo -c mychannel</w:t>
+      </w:r>
+    </w:p>
+    <w:bookmarkEnd w:id="0"/>
     <w:p/>
     <w:sectPr>
       <w:pgSz w:w="11906" w:h="16838"/>

</xml_diff>

<commit_message>
Docker Fleet IoT simulation created, together with chart.
</commit_message>
<xml_diff>
--- a/Walkthrough.docx
+++ b/Walkthrough.docx
@@ -389,12 +389,12 @@
     <w:p>
       <w:pPr>
         <w:rPr>
-          <w:color w:val="FF0000"/>
-        </w:rPr>
-      </w:pPr>
-      <w:r>
-        <w:rPr>
-          <w:color w:val="FF0000"/>
+          <w:color w:val="00B050"/>
+        </w:rPr>
+      </w:pPr>
+      <w:r>
+        <w:rPr>
+          <w:color w:val="00B050"/>
         </w:rPr>
         <w:t>netstat -aon | findstr :3000</w:t>
       </w:r>
@@ -485,144 +485,97 @@
     </w:p>
     <w:p>
       <w:pPr>
-        <w:rPr>
-          <w:b/>
-          <w:bCs/>
-        </w:rPr>
-      </w:pPr>
-      <w:r>
-        <w:rPr>
-          <w:b/>
-          <w:bCs/>
-        </w:rPr>
-        <w:t>Step 6 — Register a Device</w:t>
-      </w:r>
-    </w:p>
-    <w:p>
-      <w:pPr>
-        <w:numPr>
-          <w:ilvl w:val="0"/>
-          <w:numId w:val="2"/>
-        </w:numPr>
-      </w:pPr>
-      <w:r>
-        <w:t>Open http://localhost:5173 in your browser</w:t>
-      </w:r>
-    </w:p>
-    <w:p>
-      <w:pPr>
-        <w:numPr>
-          <w:ilvl w:val="0"/>
-          <w:numId w:val="2"/>
-        </w:numPr>
-      </w:pPr>
-      <w:r>
-        <w:t>Click </w:t>
-      </w:r>
-      <w:r>
-        <w:rPr>
-          <w:b/>
-          <w:bCs/>
-        </w:rPr>
-        <w:t>"Run Simulation"</w:t>
-      </w:r>
-    </w:p>
-    <w:p>
-      <w:pPr>
-        <w:numPr>
-          <w:ilvl w:val="0"/>
-          <w:numId w:val="2"/>
-        </w:numPr>
-      </w:pPr>
-      <w:r>
-        <w:t>Wait ~3 seconds — the audit log should show:</w:t>
-      </w:r>
-    </w:p>
-    <w:p>
-      <w:pPr>
-        <w:numPr>
-          <w:ilvl w:val="1"/>
-          <w:numId w:val="2"/>
-        </w:numPr>
-      </w:pPr>
-      <w:r>
-        <w:t>Simulating [Sensor Type] → [device-id]</w:t>
-      </w:r>
-    </w:p>
-    <w:p>
-      <w:pPr>
-        <w:numPr>
-          <w:ilvl w:val="1"/>
-          <w:numId w:val="2"/>
-        </w:numPr>
-      </w:pPr>
-      <w:r>
-        <w:t>Device [device-id] registered successfully</w:t>
-      </w:r>
-    </w:p>
-    <w:p>
-      <w:pPr>
-        <w:numPr>
-          <w:ilvl w:val="1"/>
-          <w:numId w:val="2"/>
-        </w:numPr>
-      </w:pPr>
-      <w:r>
-        <w:t xml:space="preserve">[device-id] authenticated by Smart Contract </w:t>
-      </w:r>
-      <w:r>
-        <w:rPr>
-          <w:rFonts w:ascii="Segoe UI Symbol" w:hAnsi="Segoe UI Symbol" w:cs="Segoe UI Symbol"/>
-        </w:rPr>
-        <w:t>✓</w:t>
-      </w:r>
-    </w:p>
-    <w:p>
-      <w:pPr>
-        <w:numPr>
-          <w:ilvl w:val="0"/>
-          <w:numId w:val="2"/>
-        </w:numPr>
-      </w:pPr>
-      <w:r>
-        <w:t>The device appears in the </w:t>
-      </w:r>
-      <w:r>
-        <w:rPr>
-          <w:b/>
-          <w:bCs/>
-        </w:rPr>
-        <w:t>Active Devices</w:t>
-      </w:r>
-      <w:r>
-        <w:t> panel with status </w:t>
-      </w:r>
-      <w:r>
-        <w:rPr>
-          <w:b/>
-          <w:bCs/>
-        </w:rPr>
-        <w:t>ACTIVE</w:t>
-      </w:r>
-    </w:p>
-    <w:p>
-      <w:pPr>
-        <w:numPr>
-          <w:ilvl w:val="0"/>
-          <w:numId w:val="2"/>
-        </w:numPr>
-      </w:pPr>
-      <w:r>
-        <w:rPr>
-          <w:b/>
-          <w:bCs/>
-        </w:rPr>
-        <w:t>Note down the device ID</w:t>
-      </w:r>
-      <w:r>
-        <w:t> (e.g. pres-9705)</w:t>
-      </w:r>
-    </w:p>
+        <w:pStyle w:val="Heading2"/>
+        <w:rPr>
+          <w:b/>
+        </w:rPr>
+      </w:pPr>
+      <w:r>
+        <w:rPr>
+          <w:b/>
+        </w:rPr>
+        <w:t>Simulation:</w:t>
+      </w:r>
+    </w:p>
+    <w:p>
+      <w:pPr>
+        <w:pStyle w:val="Heading2"/>
+      </w:pPr>
+      <w:r>
+        <w:br/>
+        <w:t>1. Fleet Simulation</w:t>
+      </w:r>
+    </w:p>
+    <w:p/>
+    <w:p>
+      <w:r>
+        <w:t>A</w:t>
+      </w:r>
+      <w:r>
+        <w:t>uthApp/simulator</w:t>
+      </w:r>
+      <w:r>
+        <w:t xml:space="preserve"> cmd:</w:t>
+      </w:r>
+      <w:r>
+        <w:t xml:space="preserve"> (5, 10 ,50)</w:t>
+      </w:r>
+      <w:bookmarkStart w:id="0" w:name="_GoBack"/>
+      <w:bookmarkEnd w:id="0"/>
+    </w:p>
+    <w:p>
+      <w:pPr>
+        <w:rPr>
+          <w:color w:val="00B050"/>
+        </w:rPr>
+      </w:pPr>
+      <w:r>
+        <w:rPr>
+          <w:color w:val="00B050"/>
+        </w:rPr>
+        <w:t xml:space="preserve">docker-compose up --build --scale </w:t>
+      </w:r>
+      <w:r>
+        <w:rPr>
+          <w:color w:val="00B050"/>
+        </w:rPr>
+        <w:t xml:space="preserve">sensor=5 </w:t>
+      </w:r>
+    </w:p>
+    <w:p>
+      <w:r>
+        <w:rPr>
+          <w:b/>
+        </w:rPr>
+        <w:t>Clean</w:t>
+      </w:r>
+      <w:r>
+        <w:t xml:space="preserve"> (/simulator cmd):</w:t>
+      </w:r>
+    </w:p>
+    <w:p>
+      <w:pPr>
+        <w:rPr>
+          <w:color w:val="FF0000"/>
+        </w:rPr>
+      </w:pPr>
+      <w:r>
+        <w:rPr>
+          <w:color w:val="FF0000"/>
+        </w:rPr>
+        <w:t>bash clean-sensors.sh</w:t>
+      </w:r>
+    </w:p>
+    <w:p>
+      <w:pPr>
+        <w:pStyle w:val="Heading2"/>
+      </w:pPr>
+      <w:r>
+        <w:t>2. QEMU (realistic simulation)</w:t>
+      </w:r>
+    </w:p>
+    <w:p/>
+    <w:p/>
     <w:p>
       <w:r>
         <w:pict>
@@ -652,6 +605,7 @@
     </w:p>
     <w:p>
       <w:r>
+        <w:lastRenderedPageBreak/>
         <w:t>cmd</w:t>
       </w:r>
     </w:p>
@@ -665,7 +619,6 @@
         <w:rPr>
           <w:color w:val="00B050"/>
         </w:rPr>
-        <w:lastRenderedPageBreak/>
         <w:t>wsl bash /mnt/c/Users/Marius/OneDrive/Desktop/Dizertatie/AuthApp/query_device.sh &lt;device-id&gt;</w:t>
       </w:r>
     </w:p>
@@ -697,71 +650,6 @@
     <w:p>
       <w:r>
         <w:t>true</w:t>
-      </w:r>
-    </w:p>
-    <w:p>
-      <w:r>
-        <w:pict>
-          <v:rect id="_x0000_i1032" style="width:386.75pt;height:.75pt" o:hrpct="0" o:hralign="center" o:hrstd="t" o:hr="t" fillcolor="#a0a0a0" stroked="f"/>
-        </w:pict>
-      </w:r>
-    </w:p>
-    <w:p>
-      <w:pPr>
-        <w:rPr>
-          <w:b/>
-          <w:bCs/>
-        </w:rPr>
-      </w:pPr>
-      <w:r>
-        <w:rPr>
-          <w:b/>
-          <w:bCs/>
-        </w:rPr>
-        <w:t>Step 8 — Revoke a Device (Optional)</w:t>
-      </w:r>
-    </w:p>
-    <w:p>
-      <w:pPr>
-        <w:numPr>
-          <w:ilvl w:val="0"/>
-          <w:numId w:val="3"/>
-        </w:numPr>
-      </w:pPr>
-      <w:r>
-        <w:t>In the browser, click the </w:t>
-      </w:r>
-      <w:r>
-        <w:rPr>
-          <w:b/>
-          <w:bCs/>
-        </w:rPr>
-        <w:t>Revoke</w:t>
-      </w:r>
-      <w:r>
-        <w:t> button on a device</w:t>
-      </w:r>
-    </w:p>
-    <w:p>
-      <w:pPr>
-        <w:numPr>
-          <w:ilvl w:val="0"/>
-          <w:numId w:val="3"/>
-        </w:numPr>
-      </w:pPr>
-      <w:r>
-        <w:t>Re-run the query from Step 7</w:t>
-      </w:r>
-    </w:p>
-    <w:p>
-      <w:pPr>
-        <w:numPr>
-          <w:ilvl w:val="0"/>
-          <w:numId w:val="3"/>
-        </w:numPr>
-      </w:pPr>
-      <w:r>
-        <w:t>Check the "status" field — it should now be "revoked"</w:t>
       </w:r>
     </w:p>
     <w:p>
@@ -799,12 +687,12 @@
     <w:p>
       <w:pPr>
         <w:rPr>
-          <w:color w:val="00B050"/>
-        </w:rPr>
-      </w:pPr>
-      <w:r>
-        <w:rPr>
-          <w:color w:val="00B050"/>
+          <w:color w:val="FF0000"/>
+        </w:rPr>
+      </w:pPr>
+      <w:r>
+        <w:rPr>
+          <w:color w:val="FF0000"/>
         </w:rPr>
         <w:t>taskkill /im node.exe /f</w:t>
       </w:r>
@@ -812,12 +700,12 @@
     <w:p>
       <w:pPr>
         <w:rPr>
-          <w:color w:val="00B050"/>
-        </w:rPr>
-      </w:pPr>
-      <w:r>
-        <w:rPr>
-          <w:color w:val="00B050"/>
+          <w:color w:val="FF0000"/>
+        </w:rPr>
+      </w:pPr>
+      <w:r>
+        <w:rPr>
+          <w:color w:val="FF0000"/>
         </w:rPr>
         <w:t>wsl bash -c "cd /mnt/c/Users/Marius/OneDrive/Desktop/Dizertatie/Hyperledger-Fabric/fabric-samples/test-network &amp;&amp; ./network.sh down"</w:t>
       </w:r>
@@ -847,7 +735,6 @@
           <w:color w:val="7030A0"/>
         </w:rPr>
       </w:pPr>
-      <w:bookmarkStart w:id="0" w:name="_GoBack"/>
       <w:r>
         <w:rPr>
           <w:color w:val="7030A0"/>
@@ -855,7 +742,6 @@
         <w:t>docker exec -it peer0.org1.example.com peer channel getinfo -c mychannel</w:t>
       </w:r>
     </w:p>
-    <w:bookmarkEnd w:id="0"/>
     <w:p/>
     <w:sectPr>
       <w:pgSz w:w="11906" w:h="16838"/>
@@ -1655,6 +1541,49 @@
     <w:qFormat/>
     <w:rsid w:val="007B743F"/>
   </w:style>
+  <w:style w:type="paragraph" w:styleId="Heading1">
+    <w:name w:val="heading 1"/>
+    <w:basedOn w:val="Normal"/>
+    <w:next w:val="Normal"/>
+    <w:link w:val="Heading1Char"/>
+    <w:uiPriority w:val="9"/>
+    <w:qFormat/>
+    <w:rsid w:val="00CB7A25"/>
+    <w:pPr>
+      <w:keepNext/>
+      <w:keepLines/>
+      <w:spacing w:before="240" w:after="0"/>
+      <w:outlineLvl w:val="0"/>
+    </w:pPr>
+    <w:rPr>
+      <w:rFonts w:asciiTheme="majorHAnsi" w:eastAsiaTheme="majorEastAsia" w:hAnsiTheme="majorHAnsi" w:cstheme="majorBidi"/>
+      <w:color w:val="2E74B5" w:themeColor="accent1" w:themeShade="BF"/>
+      <w:sz w:val="32"/>
+      <w:szCs w:val="32"/>
+    </w:rPr>
+  </w:style>
+  <w:style w:type="paragraph" w:styleId="Heading2">
+    <w:name w:val="heading 2"/>
+    <w:basedOn w:val="Normal"/>
+    <w:next w:val="Normal"/>
+    <w:link w:val="Heading2Char"/>
+    <w:uiPriority w:val="9"/>
+    <w:unhideWhenUsed/>
+    <w:qFormat/>
+    <w:rsid w:val="00CB7A25"/>
+    <w:pPr>
+      <w:keepNext/>
+      <w:keepLines/>
+      <w:spacing w:before="40" w:after="0"/>
+      <w:outlineLvl w:val="1"/>
+    </w:pPr>
+    <w:rPr>
+      <w:rFonts w:asciiTheme="majorHAnsi" w:eastAsiaTheme="majorEastAsia" w:hAnsiTheme="majorHAnsi" w:cstheme="majorBidi"/>
+      <w:color w:val="2E74B5" w:themeColor="accent1" w:themeShade="BF"/>
+      <w:sz w:val="26"/>
+      <w:szCs w:val="26"/>
+    </w:rPr>
+  </w:style>
   <w:style w:type="character" w:default="1" w:styleId="DefaultParagraphFont">
     <w:name w:val="Default Paragraph Font"/>
     <w:uiPriority w:val="1"/>
@@ -1681,6 +1610,32 @@
     <w:uiPriority w:val="99"/>
     <w:semiHidden/>
     <w:unhideWhenUsed/>
+  </w:style>
+  <w:style w:type="character" w:customStyle="1" w:styleId="Heading1Char">
+    <w:name w:val="Heading 1 Char"/>
+    <w:basedOn w:val="DefaultParagraphFont"/>
+    <w:link w:val="Heading1"/>
+    <w:uiPriority w:val="9"/>
+    <w:rsid w:val="00CB7A25"/>
+    <w:rPr>
+      <w:rFonts w:asciiTheme="majorHAnsi" w:eastAsiaTheme="majorEastAsia" w:hAnsiTheme="majorHAnsi" w:cstheme="majorBidi"/>
+      <w:color w:val="2E74B5" w:themeColor="accent1" w:themeShade="BF"/>
+      <w:sz w:val="32"/>
+      <w:szCs w:val="32"/>
+    </w:rPr>
+  </w:style>
+  <w:style w:type="character" w:customStyle="1" w:styleId="Heading2Char">
+    <w:name w:val="Heading 2 Char"/>
+    <w:basedOn w:val="DefaultParagraphFont"/>
+    <w:link w:val="Heading2"/>
+    <w:uiPriority w:val="9"/>
+    <w:rsid w:val="00CB7A25"/>
+    <w:rPr>
+      <w:rFonts w:asciiTheme="majorHAnsi" w:eastAsiaTheme="majorEastAsia" w:hAnsiTheme="majorHAnsi" w:cstheme="majorBidi"/>
+      <w:color w:val="2E74B5" w:themeColor="accent1" w:themeShade="BF"/>
+      <w:sz w:val="26"/>
+      <w:szCs w:val="26"/>
+    </w:rPr>
   </w:style>
 </w:styles>
 </file>

</xml_diff>

<commit_message>
QEMU ARM Simulation and Latency Metrics
</commit_message>
<xml_diff>
--- a/Walkthrough.docx
+++ b/Walkthrough.docx
@@ -500,9 +500,17 @@
     <w:p>
       <w:pPr>
         <w:pStyle w:val="Heading2"/>
+        <w:rPr>
+          <w:u w:val="single"/>
+        </w:rPr>
       </w:pPr>
       <w:r>
         <w:br/>
+      </w:r>
+      <w:r>
+        <w:rPr>
+          <w:u w:val="single"/>
+        </w:rPr>
         <w:t>1. Fleet Simulation</w:t>
       </w:r>
     </w:p>
@@ -520,8 +528,6 @@
       <w:r>
         <w:t xml:space="preserve"> (5, 10 ,50)</w:t>
       </w:r>
-      <w:bookmarkStart w:id="0" w:name="_GoBack"/>
-      <w:bookmarkEnd w:id="0"/>
     </w:p>
     <w:p>
       <w:pPr>
@@ -569,12 +575,143 @@
     <w:p>
       <w:pPr>
         <w:pStyle w:val="Heading2"/>
-      </w:pPr>
-      <w:r>
+        <w:rPr>
+          <w:u w:val="single"/>
+        </w:rPr>
+      </w:pPr>
+      <w:r>
+        <w:rPr>
+          <w:u w:val="single"/>
+        </w:rPr>
         <w:t>2. QEMU (realistic simulation)</w:t>
       </w:r>
     </w:p>
     <w:p/>
+    <w:p>
+      <w:pPr>
+        <w:pStyle w:val="ListParagraph"/>
+        <w:numPr>
+          <w:ilvl w:val="0"/>
+          <w:numId w:val="5"/>
+        </w:numPr>
+      </w:pPr>
+      <w:r>
+        <w:t xml:space="preserve">Run </w:t>
+      </w:r>
+      <w:r>
+        <w:rPr>
+          <w:color w:val="00B050"/>
+        </w:rPr>
+        <w:t xml:space="preserve">docker-compose -f docker-compose-qemu.yml up -d </w:t>
+      </w:r>
+      <w:r>
+        <w:t>to boot the ARM emulator.</w:t>
+      </w:r>
+    </w:p>
+    <w:p>
+      <w:pPr>
+        <w:pStyle w:val="ListParagraph"/>
+        <w:numPr>
+          <w:ilvl w:val="0"/>
+          <w:numId w:val="5"/>
+        </w:numPr>
+      </w:pPr>
+      <w:r>
+        <w:t xml:space="preserve">Execute </w:t>
+      </w:r>
+      <w:r>
+        <w:rPr>
+          <w:color w:val="00B050"/>
+        </w:rPr>
+        <w:t xml:space="preserve">./qemu-setup.sh </w:t>
+      </w:r>
+      <w:r>
+        <w:t>to install dependencies and trigger an authentication request from the VM.</w:t>
+      </w:r>
+    </w:p>
+    <w:p>
+      <w:pPr>
+        <w:pStyle w:val="ListParagraph"/>
+        <w:ind w:left="0"/>
+      </w:pPr>
+      <w:r>
+        <w:rPr>
+          <w:highlight w:val="yellow"/>
+        </w:rPr>
+        <w:t>Note:</w:t>
+      </w:r>
+      <w:r>
+        <w:t xml:space="preserve"> sshpass must be installed in your WSL/Git Bash environment (sudo apt install sshpass). The script will auto-retry SSH for up to ~2.5 minutes while the VM boots.</w:t>
+      </w:r>
+    </w:p>
+    <w:p>
+      <w:r>
+        <w:lastRenderedPageBreak/>
+        <w:t># 1. Boot the QEMU ARM emulator</w:t>
+      </w:r>
+    </w:p>
+    <w:p>
+      <w:r>
+        <w:t>cd AuthApp/simulator</w:t>
+      </w:r>
+    </w:p>
+    <w:p>
+      <w:r>
+        <w:rPr>
+          <w:highlight w:val="yellow"/>
+        </w:rPr>
+        <w:t>! First break down the last network!</w:t>
+      </w:r>
+    </w:p>
+    <w:p>
+      <w:pPr>
+        <w:rPr>
+          <w:color w:val="FF0000"/>
+        </w:rPr>
+      </w:pPr>
+      <w:r>
+        <w:rPr>
+          <w:color w:val="FF0000"/>
+        </w:rPr>
+        <w:t>docker-compose -f docker-compose-qemu.yml down</w:t>
+      </w:r>
+    </w:p>
+    <w:p>
+      <w:pPr>
+        <w:rPr>
+          <w:color w:val="00B050"/>
+        </w:rPr>
+      </w:pPr>
+      <w:r>
+        <w:rPr>
+          <w:color w:val="00B050"/>
+        </w:rPr>
+        <w:t>docker-compose -f docker-compose-qemu.yml up -d</w:t>
+      </w:r>
+    </w:p>
+    <w:p/>
+    <w:p>
+      <w:r>
+        <w:t># 2. Wait ~60 seconds for the emulated OS to boot, then run:</w:t>
+      </w:r>
+    </w:p>
+    <w:p>
+      <w:r>
+        <w:rPr>
+          <w:color w:val="00B050"/>
+        </w:rPr>
+        <w:t xml:space="preserve">bash qemu-setup.sh 5    </w:t>
+      </w:r>
+      <w:r>
+        <w:t># runs 5 sequential authentications from ARM</w:t>
+      </w:r>
+    </w:p>
+    <w:p/>
+    <w:p>
+      <w:r>
+        <w:t># 3. Watch the frontend dashboard — the purple QEMU card and chart line will populate!</w:t>
+      </w:r>
+    </w:p>
     <w:p/>
     <w:p>
       <w:r>
@@ -605,121 +742,131 @@
     </w:p>
     <w:p>
       <w:r>
+        <w:t>cmd</w:t>
+      </w:r>
+    </w:p>
+    <w:p>
+      <w:pPr>
+        <w:rPr>
+          <w:color w:val="00B050"/>
+        </w:rPr>
+      </w:pPr>
+      <w:r>
+        <w:rPr>
+          <w:color w:val="00B050"/>
+        </w:rPr>
+        <w:t>wsl bash /mnt/c/Users/Marius/OneDrive/Desktop/Dizertatie/AuthApp/query_device.sh &lt;device-id&gt;</w:t>
+      </w:r>
+    </w:p>
+    <w:p>
+      <w:r>
+        <w:t>Replace &lt;device-id&gt; with the ID from Step 6. Expected output:</w:t>
+      </w:r>
+    </w:p>
+    <w:p>
+      <w:r>
+        <w:t>json</w:t>
+      </w:r>
+    </w:p>
+    <w:p>
+      <w:r>
+        <w:t>=== Querying Device '&lt;device-id&gt;' from Fabric Ledger ===</w:t>
+      </w:r>
+    </w:p>
+    <w:p>
+      <w:r>
+        <w:t>{"docType":"device","deviceId":"&lt;device-id&gt;","deviceType":"...","publicKey":"-----BEGIN PUBLIC KEY-----\n...","status":"active","registeredAt":"..."}</w:t>
+      </w:r>
+    </w:p>
+    <w:p>
+      <w:r>
+        <w:t>=== Checking if Device Exists ===</w:t>
+      </w:r>
+    </w:p>
+    <w:p>
+      <w:r>
+        <w:t>true</w:t>
+      </w:r>
+    </w:p>
+    <w:p>
+      <w:r>
+        <w:pict>
+          <v:rect id="_x0000_i1032" style="width:386.75pt;height:.75pt" o:hrpct="0" o:hralign="center" o:hrstd="t" o:hr="t" fillcolor="#a0a0a0" stroked="f"/>
+        </w:pict>
+      </w:r>
+    </w:p>
+    <w:p>
+      <w:pPr>
+        <w:rPr>
+          <w:b/>
+          <w:bCs/>
+        </w:rPr>
+      </w:pPr>
+      <w:r>
+        <w:rPr>
+          <w:b/>
+          <w:bCs/>
+        </w:rPr>
+        <w:t>Cleanup</w:t>
+      </w:r>
+    </w:p>
+    <w:p>
+      <w:r>
+        <w:t>To stop everything:</w:t>
+      </w:r>
+    </w:p>
+    <w:p>
+      <w:r>
+        <w:t>cmd</w:t>
+      </w:r>
+    </w:p>
+    <w:p>
+      <w:pPr>
+        <w:rPr>
+          <w:color w:val="FF0000"/>
+        </w:rPr>
+      </w:pPr>
+      <w:r>
+        <w:rPr>
+          <w:color w:val="FF0000"/>
+        </w:rPr>
+        <w:t>taskkill /im node.exe /f</w:t>
+      </w:r>
+    </w:p>
+    <w:p>
+      <w:bookmarkStart w:id="0" w:name="_GoBack"/>
+      <w:bookmarkEnd w:id="0"/>
+      <w:r>
+        <w:rPr>
+          <w:highlight w:val="yellow"/>
+        </w:rPr>
+        <w:t>Fabric down:</w:t>
+      </w:r>
+    </w:p>
+    <w:p>
+      <w:pPr>
+        <w:rPr>
+          <w:color w:val="FF0000"/>
+        </w:rPr>
+      </w:pPr>
+      <w:r>
+        <w:rPr>
+          <w:color w:val="FF0000"/>
+        </w:rPr>
+        <w:t>wsl bash -c "cd /mnt/c/Users/Marius/OneDrive/Desktop/Dizertatie/Hyperledger-Fabric/fabric-samples/test-network &amp;&amp; ./network.sh down"</w:t>
+      </w:r>
+    </w:p>
+    <w:p>
+      <w:pPr>
+        <w:rPr>
+          <w:b/>
+        </w:rPr>
+      </w:pPr>
+      <w:r>
+        <w:rPr>
+          <w:b/>
+        </w:rPr>
         <w:lastRenderedPageBreak/>
-        <w:t>cmd</w:t>
-      </w:r>
-    </w:p>
-    <w:p>
-      <w:pPr>
-        <w:rPr>
-          <w:color w:val="00B050"/>
-        </w:rPr>
-      </w:pPr>
-      <w:r>
-        <w:rPr>
-          <w:color w:val="00B050"/>
-        </w:rPr>
-        <w:t>wsl bash /mnt/c/Users/Marius/OneDrive/Desktop/Dizertatie/AuthApp/query_device.sh &lt;device-id&gt;</w:t>
-      </w:r>
-    </w:p>
-    <w:p>
-      <w:r>
-        <w:t>Replace &lt;device-id&gt; with the ID from Step 6. Expected output:</w:t>
-      </w:r>
-    </w:p>
-    <w:p>
-      <w:r>
-        <w:t>json</w:t>
-      </w:r>
-    </w:p>
-    <w:p>
-      <w:r>
-        <w:t>=== Querying Device '&lt;device-id&gt;' from Fabric Ledger ===</w:t>
-      </w:r>
-    </w:p>
-    <w:p>
-      <w:r>
-        <w:t>{"docType":"device","deviceId":"&lt;device-id&gt;","deviceType":"...","publicKey":"-----BEGIN PUBLIC KEY-----\n...","status":"active","registeredAt":"..."}</w:t>
-      </w:r>
-    </w:p>
-    <w:p>
-      <w:r>
-        <w:t>=== Checking if Device Exists ===</w:t>
-      </w:r>
-    </w:p>
-    <w:p>
-      <w:r>
-        <w:t>true</w:t>
-      </w:r>
-    </w:p>
-    <w:p>
-      <w:r>
-        <w:pict>
-          <v:rect id="_x0000_i1033" style="width:386.75pt;height:.75pt" o:hrpct="0" o:hralign="center" o:hrstd="t" o:hr="t" fillcolor="#a0a0a0" stroked="f"/>
-        </w:pict>
-      </w:r>
-    </w:p>
-    <w:p>
-      <w:pPr>
-        <w:rPr>
-          <w:b/>
-          <w:bCs/>
-        </w:rPr>
-      </w:pPr>
-      <w:r>
-        <w:rPr>
-          <w:b/>
-          <w:bCs/>
-        </w:rPr>
-        <w:t>Cleanup</w:t>
-      </w:r>
-    </w:p>
-    <w:p>
-      <w:r>
-        <w:t>To stop everything:</w:t>
-      </w:r>
-    </w:p>
-    <w:p>
-      <w:r>
-        <w:t>cmd</w:t>
-      </w:r>
-    </w:p>
-    <w:p>
-      <w:pPr>
-        <w:rPr>
-          <w:color w:val="FF0000"/>
-        </w:rPr>
-      </w:pPr>
-      <w:r>
-        <w:rPr>
-          <w:color w:val="FF0000"/>
-        </w:rPr>
-        <w:t>taskkill /im node.exe /f</w:t>
-      </w:r>
-    </w:p>
-    <w:p>
-      <w:pPr>
-        <w:rPr>
-          <w:color w:val="FF0000"/>
-        </w:rPr>
-      </w:pPr>
-      <w:r>
-        <w:rPr>
-          <w:color w:val="FF0000"/>
-        </w:rPr>
-        <w:t>wsl bash -c "cd /mnt/c/Users/Marius/OneDrive/Desktop/Dizertatie/Hyperledger-Fabric/fabric-samples/test-network &amp;&amp; ./network.sh down"</w:t>
-      </w:r>
-    </w:p>
-    <w:p>
-      <w:pPr>
-        <w:rPr>
-          <w:b/>
-        </w:rPr>
-      </w:pPr>
-      <w:r>
-        <w:rPr>
-          <w:b/>
-        </w:rPr>
         <w:br/>
         <w:t>Block Height check</w:t>
       </w:r>
@@ -756,6 +903,95 @@
 <file path=word/numbering.xml><?xml version="1.0" encoding="utf-8"?>
 <w:numbering xmlns:wpc="http://schemas.microsoft.com/office/word/2010/wordprocessingCanvas" xmlns:cx="http://schemas.microsoft.com/office/drawing/2014/chartex" xmlns:mc="http://schemas.openxmlformats.org/markup-compatibility/2006" xmlns:o="urn:schemas-microsoft-com:office:office" xmlns:r="http://schemas.openxmlformats.org/officeDocument/2006/relationships" xmlns:m="http://schemas.openxmlformats.org/officeDocument/2006/math" xmlns:v="urn:schemas-microsoft-com:vml" xmlns:wp14="http://schemas.microsoft.com/office/word/2010/wordprocessingDrawing" xmlns:wp="http://schemas.openxmlformats.org/drawingml/2006/wordprocessingDrawing" xmlns:w10="urn:schemas-microsoft-com:office:word" xmlns:w="http://schemas.openxmlformats.org/wordprocessingml/2006/main" xmlns:w14="http://schemas.microsoft.com/office/word/2010/wordml" xmlns:w15="http://schemas.microsoft.com/office/word/2012/wordml" xmlns:w16se="http://schemas.microsoft.com/office/word/2015/wordml/symex" xmlns:wpg="http://schemas.microsoft.com/office/word/2010/wordprocessingGroup" xmlns:wpi="http://schemas.microsoft.com/office/word/2010/wordprocessingInk" xmlns:wne="http://schemas.microsoft.com/office/word/2006/wordml" xmlns:wps="http://schemas.microsoft.com/office/word/2010/wordprocessingShape" mc:Ignorable="w14 w15 w16se wp14">
   <w:abstractNum w:abstractNumId="0" w15:restartNumberingAfterBreak="0">
+    <w:nsid w:val="01A723C1"/>
+    <w:multiLevelType w:val="hybridMultilevel"/>
+    <w:tmpl w:val="4838FC40"/>
+    <w:lvl w:ilvl="0" w:tplc="0418000F">
+      <w:start w:val="1"/>
+      <w:numFmt w:val="decimal"/>
+      <w:lvlText w:val="%1."/>
+      <w:lvlJc w:val="left"/>
+      <w:pPr>
+        <w:ind w:left="720" w:hanging="360"/>
+      </w:pPr>
+      <w:rPr>
+        <w:rFonts w:hint="default"/>
+      </w:rPr>
+    </w:lvl>
+    <w:lvl w:ilvl="1" w:tplc="04180019" w:tentative="1">
+      <w:start w:val="1"/>
+      <w:numFmt w:val="lowerLetter"/>
+      <w:lvlText w:val="%2."/>
+      <w:lvlJc w:val="left"/>
+      <w:pPr>
+        <w:ind w:left="1440" w:hanging="360"/>
+      </w:pPr>
+    </w:lvl>
+    <w:lvl w:ilvl="2" w:tplc="0418001B" w:tentative="1">
+      <w:start w:val="1"/>
+      <w:numFmt w:val="lowerRoman"/>
+      <w:lvlText w:val="%3."/>
+      <w:lvlJc w:val="right"/>
+      <w:pPr>
+        <w:ind w:left="2160" w:hanging="180"/>
+      </w:pPr>
+    </w:lvl>
+    <w:lvl w:ilvl="3" w:tplc="0418000F" w:tentative="1">
+      <w:start w:val="1"/>
+      <w:numFmt w:val="decimal"/>
+      <w:lvlText w:val="%4."/>
+      <w:lvlJc w:val="left"/>
+      <w:pPr>
+        <w:ind w:left="2880" w:hanging="360"/>
+      </w:pPr>
+    </w:lvl>
+    <w:lvl w:ilvl="4" w:tplc="04180019" w:tentative="1">
+      <w:start w:val="1"/>
+      <w:numFmt w:val="lowerLetter"/>
+      <w:lvlText w:val="%5."/>
+      <w:lvlJc w:val="left"/>
+      <w:pPr>
+        <w:ind w:left="3600" w:hanging="360"/>
+      </w:pPr>
+    </w:lvl>
+    <w:lvl w:ilvl="5" w:tplc="0418001B" w:tentative="1">
+      <w:start w:val="1"/>
+      <w:numFmt w:val="lowerRoman"/>
+      <w:lvlText w:val="%6."/>
+      <w:lvlJc w:val="right"/>
+      <w:pPr>
+        <w:ind w:left="4320" w:hanging="180"/>
+      </w:pPr>
+    </w:lvl>
+    <w:lvl w:ilvl="6" w:tplc="0418000F" w:tentative="1">
+      <w:start w:val="1"/>
+      <w:numFmt w:val="decimal"/>
+      <w:lvlText w:val="%7."/>
+      <w:lvlJc w:val="left"/>
+      <w:pPr>
+        <w:ind w:left="5040" w:hanging="360"/>
+      </w:pPr>
+    </w:lvl>
+    <w:lvl w:ilvl="7" w:tplc="04180019" w:tentative="1">
+      <w:start w:val="1"/>
+      <w:numFmt w:val="lowerLetter"/>
+      <w:lvlText w:val="%8."/>
+      <w:lvlJc w:val="left"/>
+      <w:pPr>
+        <w:ind w:left="5760" w:hanging="360"/>
+      </w:pPr>
+    </w:lvl>
+    <w:lvl w:ilvl="8" w:tplc="0418001B" w:tentative="1">
+      <w:start w:val="1"/>
+      <w:numFmt w:val="lowerRoman"/>
+      <w:lvlText w:val="%9."/>
+      <w:lvlJc w:val="right"/>
+      <w:pPr>
+        <w:ind w:left="6480" w:hanging="180"/>
+      </w:pPr>
+    </w:lvl>
+  </w:abstractNum>
+  <w:abstractNum w:abstractNumId="1" w15:restartNumberingAfterBreak="0">
     <w:nsid w:val="2BBF08AD"/>
     <w:multiLevelType w:val="multilevel"/>
     <w:tmpl w:val="2D98AEA4"/>
@@ -904,7 +1140,7 @@
       </w:rPr>
     </w:lvl>
   </w:abstractNum>
-  <w:abstractNum w:abstractNumId="1" w15:restartNumberingAfterBreak="0">
+  <w:abstractNum w:abstractNumId="2" w15:restartNumberingAfterBreak="0">
     <w:nsid w:val="30171016"/>
     <w:multiLevelType w:val="multilevel"/>
     <w:tmpl w:val="8E8C0DC4"/>
@@ -1021,7 +1257,96 @@
       </w:pPr>
     </w:lvl>
   </w:abstractNum>
-  <w:abstractNum w:abstractNumId="2" w15:restartNumberingAfterBreak="0">
+  <w:abstractNum w:abstractNumId="3" w15:restartNumberingAfterBreak="0">
+    <w:nsid w:val="5F410964"/>
+    <w:multiLevelType w:val="hybridMultilevel"/>
+    <w:tmpl w:val="B13AA2A8"/>
+    <w:lvl w:ilvl="0" w:tplc="0418000F">
+      <w:start w:val="1"/>
+      <w:numFmt w:val="decimal"/>
+      <w:lvlText w:val="%1."/>
+      <w:lvlJc w:val="left"/>
+      <w:pPr>
+        <w:ind w:left="360" w:hanging="360"/>
+      </w:pPr>
+      <w:rPr>
+        <w:rFonts w:hint="default"/>
+      </w:rPr>
+    </w:lvl>
+    <w:lvl w:ilvl="1" w:tplc="04180019" w:tentative="1">
+      <w:start w:val="1"/>
+      <w:numFmt w:val="lowerLetter"/>
+      <w:lvlText w:val="%2."/>
+      <w:lvlJc w:val="left"/>
+      <w:pPr>
+        <w:ind w:left="1080" w:hanging="360"/>
+      </w:pPr>
+    </w:lvl>
+    <w:lvl w:ilvl="2" w:tplc="0418001B" w:tentative="1">
+      <w:start w:val="1"/>
+      <w:numFmt w:val="lowerRoman"/>
+      <w:lvlText w:val="%3."/>
+      <w:lvlJc w:val="right"/>
+      <w:pPr>
+        <w:ind w:left="1800" w:hanging="180"/>
+      </w:pPr>
+    </w:lvl>
+    <w:lvl w:ilvl="3" w:tplc="0418000F" w:tentative="1">
+      <w:start w:val="1"/>
+      <w:numFmt w:val="decimal"/>
+      <w:lvlText w:val="%4."/>
+      <w:lvlJc w:val="left"/>
+      <w:pPr>
+        <w:ind w:left="2520" w:hanging="360"/>
+      </w:pPr>
+    </w:lvl>
+    <w:lvl w:ilvl="4" w:tplc="04180019" w:tentative="1">
+      <w:start w:val="1"/>
+      <w:numFmt w:val="lowerLetter"/>
+      <w:lvlText w:val="%5."/>
+      <w:lvlJc w:val="left"/>
+      <w:pPr>
+        <w:ind w:left="3240" w:hanging="360"/>
+      </w:pPr>
+    </w:lvl>
+    <w:lvl w:ilvl="5" w:tplc="0418001B" w:tentative="1">
+      <w:start w:val="1"/>
+      <w:numFmt w:val="lowerRoman"/>
+      <w:lvlText w:val="%6."/>
+      <w:lvlJc w:val="right"/>
+      <w:pPr>
+        <w:ind w:left="3960" w:hanging="180"/>
+      </w:pPr>
+    </w:lvl>
+    <w:lvl w:ilvl="6" w:tplc="0418000F" w:tentative="1">
+      <w:start w:val="1"/>
+      <w:numFmt w:val="decimal"/>
+      <w:lvlText w:val="%7."/>
+      <w:lvlJc w:val="left"/>
+      <w:pPr>
+        <w:ind w:left="4680" w:hanging="360"/>
+      </w:pPr>
+    </w:lvl>
+    <w:lvl w:ilvl="7" w:tplc="04180019" w:tentative="1">
+      <w:start w:val="1"/>
+      <w:numFmt w:val="lowerLetter"/>
+      <w:lvlText w:val="%8."/>
+      <w:lvlJc w:val="left"/>
+      <w:pPr>
+        <w:ind w:left="5400" w:hanging="360"/>
+      </w:pPr>
+    </w:lvl>
+    <w:lvl w:ilvl="8" w:tplc="0418001B" w:tentative="1">
+      <w:start w:val="1"/>
+      <w:numFmt w:val="lowerRoman"/>
+      <w:lvlText w:val="%9."/>
+      <w:lvlJc w:val="right"/>
+      <w:pPr>
+        <w:ind w:left="6120" w:hanging="180"/>
+      </w:pPr>
+    </w:lvl>
+  </w:abstractNum>
+  <w:abstractNum w:abstractNumId="4" w15:restartNumberingAfterBreak="0">
     <w:nsid w:val="61F834EC"/>
     <w:multiLevelType w:val="multilevel"/>
     <w:tmpl w:val="ED28DCA4"/>
@@ -1135,13 +1460,19 @@
     </w:lvl>
   </w:abstractNum>
   <w:num w:numId="1">
+    <w:abstractNumId w:val="1"/>
+  </w:num>
+  <w:num w:numId="2">
+    <w:abstractNumId w:val="2"/>
+  </w:num>
+  <w:num w:numId="3">
+    <w:abstractNumId w:val="4"/>
+  </w:num>
+  <w:num w:numId="4">
     <w:abstractNumId w:val="0"/>
   </w:num>
-  <w:num w:numId="2">
-    <w:abstractNumId w:val="1"/>
-  </w:num>
-  <w:num w:numId="3">
-    <w:abstractNumId w:val="2"/>
+  <w:num w:numId="5">
+    <w:abstractNumId w:val="3"/>
   </w:num>
 </w:numbering>
 </file>
@@ -1637,6 +1968,17 @@
       <w:szCs w:val="26"/>
     </w:rPr>
   </w:style>
+  <w:style w:type="paragraph" w:styleId="ListParagraph">
+    <w:name w:val="List Paragraph"/>
+    <w:basedOn w:val="Normal"/>
+    <w:uiPriority w:val="34"/>
+    <w:qFormat/>
+    <w:rsid w:val="00236E9A"/>
+    <w:pPr>
+      <w:ind w:left="720"/>
+      <w:contextualSpacing/>
+    </w:pPr>
+  </w:style>
 </w:styles>
 </file>
 

</xml_diff>

<commit_message>
Added CoAP to the backend server. Now it's a dual-protocol backend.
</commit_message>
<xml_diff>
--- a/Walkthrough.docx
+++ b/Walkthrough.docx
@@ -337,7 +337,13 @@
           <w:color w:val="00B050"/>
         </w:rPr>
         <w:lastRenderedPageBreak/>
-        <w:t>node src/app.js</w:t>
+        <w:t>npm</w:t>
+      </w:r>
+      <w:r>
+        <w:rPr>
+          <w:color w:val="00B050"/>
+        </w:rPr>
+        <w:t xml:space="preserve"> start</w:t>
       </w:r>
     </w:p>
     <w:p>
@@ -399,6 +405,21 @@
         <w:t>netstat -aon | findstr :3000</w:t>
       </w:r>
     </w:p>
+    <w:p>
+      <w:pPr>
+        <w:rPr>
+          <w:color w:val="00B050"/>
+        </w:rPr>
+      </w:pPr>
+      <w:bookmarkStart w:id="0" w:name="_GoBack"/>
+      <w:r>
+        <w:rPr>
+          <w:color w:val="00B050"/>
+        </w:rPr>
+        <w:t>netstat -aon | findstr :5683</w:t>
+      </w:r>
+    </w:p>
+    <w:bookmarkEnd w:id="0"/>
     <w:p>
       <w:r>
         <w:t>You should see a LISTENING entry on port 3000.</w:t>
@@ -638,6 +659,7 @@
         <w:rPr>
           <w:highlight w:val="yellow"/>
         </w:rPr>
+        <w:lastRenderedPageBreak/>
         <w:t>Note:</w:t>
       </w:r>
       <w:r>
@@ -646,7 +668,6 @@
     </w:p>
     <w:p>
       <w:r>
-        <w:lastRenderedPageBreak/>
         <w:t># 1. Boot the QEMU ARM emulator</w:t>
       </w:r>
     </w:p>
@@ -834,8 +855,6 @@
       </w:r>
     </w:p>
     <w:p>
-      <w:bookmarkStart w:id="0" w:name="_GoBack"/>
-      <w:bookmarkEnd w:id="0"/>
       <w:r>
         <w:rPr>
           <w:highlight w:val="yellow"/>
@@ -853,6 +872,7 @@
         <w:rPr>
           <w:color w:val="FF0000"/>
         </w:rPr>
+        <w:lastRenderedPageBreak/>
         <w:t>wsl bash -c "cd /mnt/c/Users/Marius/OneDrive/Desktop/Dizertatie/Hyperledger-Fabric/fabric-samples/test-network &amp;&amp; ./network.sh down"</w:t>
       </w:r>
     </w:p>
@@ -866,7 +886,6 @@
         <w:rPr>
           <w:b/>
         </w:rPr>
-        <w:lastRenderedPageBreak/>
         <w:br/>
         <w:t>Block Height check</w:t>
       </w:r>

</xml_diff>

<commit_message>
More tests and results.
</commit_message>
<xml_diff>
--- a/Walkthrough.docx
+++ b/Walkthrough.docx
@@ -16,7 +16,7 @@
           <w:sz w:val="28"/>
           <w:szCs w:val="28"/>
         </w:rPr>
-        <w:t>Testing Walkthrough — Decentralized IoT Auth</w:t>
+        <w:t>esting Walkthrough — Decentralized IoT Auth</w:t>
       </w:r>
     </w:p>
     <w:p>
@@ -411,7 +411,6 @@
           <w:color w:val="00B050"/>
         </w:rPr>
       </w:pPr>
-      <w:bookmarkStart w:id="0" w:name="_GoBack"/>
       <w:r>
         <w:rPr>
           <w:color w:val="00B050"/>
@@ -419,7 +418,6 @@
         <w:t>netstat -aon | findstr :5683</w:t>
       </w:r>
     </w:p>
-    <w:bookmarkEnd w:id="0"/>
     <w:p>
       <w:r>
         <w:t>You should see a LISTENING entry on port 3000.</w:t>
@@ -868,6 +866,7 @@
           <w:color w:val="FF0000"/>
         </w:rPr>
       </w:pPr>
+      <w:bookmarkStart w:id="0" w:name="_GoBack"/>
       <w:r>
         <w:rPr>
           <w:color w:val="FF0000"/>
@@ -876,6 +875,7 @@
         <w:t>wsl bash -c "cd /mnt/c/Users/Marius/OneDrive/Desktop/Dizertatie/Hyperledger-Fabric/fabric-samples/test-network &amp;&amp; ./network.sh down"</w:t>
       </w:r>
     </w:p>
+    <w:bookmarkEnd w:id="0"/>
     <w:p>
       <w:pPr>
         <w:rPr>

</xml_diff>

<commit_message>
Implemented dual-gateway architecture to show decentralization.
</commit_message>
<xml_diff>
--- a/Walkthrough.docx
+++ b/Walkthrough.docx
@@ -16,6 +16,15 @@
           <w:sz w:val="28"/>
           <w:szCs w:val="28"/>
         </w:rPr>
+        <w:t>T</w:t>
+      </w:r>
+      <w:r>
+        <w:rPr>
+          <w:b/>
+          <w:bCs/>
+          <w:sz w:val="28"/>
+          <w:szCs w:val="28"/>
+        </w:rPr>
         <w:t>esting Walkthrough — Decentralized IoT Auth</w:t>
       </w:r>
     </w:p>
@@ -61,8 +70,32 @@
       </w:r>
     </w:p>
     <w:p>
-      <w:r>
-        <w:t>cmd</w:t>
+      <w:pPr>
+        <w:rPr>
+          <w:b/>
+          <w:bCs/>
+        </w:rPr>
+      </w:pPr>
+    </w:p>
+    <w:p>
+      <w:r>
+        <w:rPr>
+          <w:highlight w:val="yellow"/>
+        </w:rPr>
+        <w:t>Both: Windows and WSL</w:t>
+      </w:r>
+    </w:p>
+    <w:p>
+      <w:pPr>
+        <w:rPr>
+          <w:color w:val="7030A0"/>
+        </w:rPr>
+      </w:pPr>
+      <w:r>
+        <w:rPr>
+          <w:color w:val="7030A0"/>
+        </w:rPr>
+        <w:t>taskkill /im node.exe /f 2&gt;$null; wsl -- bash -c "pkill -f 'node src/app.js'" 2&gt;$null</w:t>
       </w:r>
     </w:p>
     <w:p>
@@ -75,18 +108,16 @@
         <w:rPr>
           <w:color w:val="00B050"/>
         </w:rPr>
-        <w:t>taskkill /im node.exe /f 2&gt;nul</w:t>
-      </w:r>
-    </w:p>
-    <w:p>
-      <w:r>
-        <w:t>Verify port 3000 is free:</w:t>
-      </w:r>
-    </w:p>
-    <w:p>
-      <w:r>
-        <w:t>cmd</w:t>
-      </w:r>
+        <w:br/>
+      </w:r>
+      <w:r>
+        <w:rPr>
+          <w:highlight w:val="yellow"/>
+        </w:rPr>
+        <w:t># Kill the Node process inside WSL</w:t>
+      </w:r>
+      <w:bookmarkStart w:id="0" w:name="_GoBack"/>
+      <w:bookmarkEnd w:id="0"/>
     </w:p>
     <w:p>
       <w:pPr>
@@ -98,12 +129,41 @@
         <w:rPr>
           <w:color w:val="00B050"/>
         </w:rPr>
-        <w:t>netstat -aon | findstr :3000</w:t>
-      </w:r>
-    </w:p>
-    <w:p>
-      <w:r>
-        <w:t>Expected: no output (port is free).</w:t>
+        <w:t>wsl -- bash -c "pkill -f 'node src/app.js'"</w:t>
+      </w:r>
+    </w:p>
+    <w:p>
+      <w:r>
+        <w:rPr>
+          <w:highlight w:val="yellow"/>
+        </w:rPr>
+        <w:t># Kill by PID on the listening port (in Windows Powershell)</w:t>
+      </w:r>
+    </w:p>
+    <w:p>
+      <w:pPr>
+        <w:rPr>
+          <w:color w:val="00B050"/>
+        </w:rPr>
+      </w:pPr>
+      <w:r>
+        <w:rPr>
+          <w:color w:val="00B050"/>
+        </w:rPr>
+        <w:t>$pid = (Get-NetTCPConnection -LocalPort 3000 -State Listen -ErrorAction SilentlyContinue).OwningProcess</w:t>
+      </w:r>
+    </w:p>
+    <w:p>
+      <w:pPr>
+        <w:rPr>
+          <w:color w:val="00B050"/>
+        </w:rPr>
+      </w:pPr>
+      <w:r>
+        <w:rPr>
+          <w:color w:val="00B050"/>
+        </w:rPr>
+        <w:t>if ($pid) { Stop-Process -Id $pid -Force; Write-Host "Killed PID $pid" } else { Write-Host "Nothing listening on :3000" }</w:t>
       </w:r>
     </w:p>
     <w:p>
@@ -283,113 +343,220 @@
           <w:b/>
           <w:bCs/>
         </w:rPr>
+        <w:lastRenderedPageBreak/>
         <w:t>Step 4 — Start the Backend Server</w:t>
       </w:r>
     </w:p>
     <w:p>
       <w:pPr>
         <w:rPr>
-          <w:color w:val="FF0000"/>
-        </w:rPr>
-      </w:pPr>
-      <w:r>
-        <w:rPr>
-          <w:color w:val="FF0000"/>
+          <w:bCs/>
+        </w:rPr>
+      </w:pPr>
+      <w:r>
+        <w:rPr>
+          <w:bCs/>
           <w:highlight w:val="yellow"/>
         </w:rPr>
-        <w:t>Open a </w:t>
-      </w:r>
-      <w:r>
-        <w:rPr>
-          <w:b/>
-          <w:bCs/>
-          <w:color w:val="FF0000"/>
+        <w:t>Windows Backend (from root</w:t>
+      </w:r>
+      <w:r>
+        <w:rPr>
+          <w:bCs/>
           <w:highlight w:val="yellow"/>
         </w:rPr>
-        <w:t>new CMD window</w:t>
-      </w:r>
-      <w:r>
-        <w:rPr>
-          <w:color w:val="FF0000"/>
+        <w:t xml:space="preserve"> AuthApp</w:t>
+      </w:r>
+      <w:r>
+        <w:rPr>
+          <w:bCs/>
           <w:highlight w:val="yellow"/>
         </w:rPr>
-        <w:t> (keep it open):</w:t>
-      </w:r>
-    </w:p>
-    <w:p>
-      <w:r>
-        <w:t>cmd</w:t>
-      </w:r>
-    </w:p>
-    <w:p>
-      <w:r>
-        <w:t>cd C:\Users\Marius\OneDrive\Desktop\Dizertatie\AuthApp\backend</w:t>
-      </w:r>
-    </w:p>
-    <w:p>
-      <w:pPr>
-        <w:rPr>
+        <w:t>):</w:t>
+      </w:r>
+    </w:p>
+    <w:p>
+      <w:pPr>
+        <w:rPr>
+          <w:b/>
+          <w:bCs/>
+        </w:rPr>
+      </w:pPr>
+      <w:r>
+        <w:rPr>
+          <w:b/>
+          <w:bCs/>
+        </w:rPr>
+        <w:t>Org 1</w:t>
+      </w:r>
+      <w:r>
+        <w:rPr>
+          <w:b/>
+          <w:bCs/>
+        </w:rPr>
+        <w:t>:</w:t>
+      </w:r>
+    </w:p>
+    <w:p>
+      <w:pPr>
+        <w:rPr>
+          <w:bCs/>
           <w:color w:val="00B050"/>
         </w:rPr>
       </w:pPr>
       <w:r>
         <w:rPr>
+          <w:bCs/>
           <w:color w:val="00B050"/>
         </w:rPr>
-        <w:lastRenderedPageBreak/>
-        <w:t>npm</w:t>
-      </w:r>
-      <w:r>
-        <w:rPr>
+        <w:t>powershell -NoProfile -ExecutionPolicy Bypass -File .\backend\startGateway.ps1</w:t>
+      </w:r>
+    </w:p>
+    <w:p>
+      <w:pPr>
+        <w:rPr>
+          <w:b/>
+          <w:bCs/>
+        </w:rPr>
+      </w:pPr>
+      <w:r>
+        <w:rPr>
+          <w:b/>
+          <w:bCs/>
+        </w:rPr>
+        <w:t>Org 2</w:t>
+      </w:r>
+      <w:r>
+        <w:rPr>
+          <w:b/>
+          <w:bCs/>
+        </w:rPr>
+        <w:t>:</w:t>
+      </w:r>
+    </w:p>
+    <w:p>
+      <w:pPr>
+        <w:rPr>
+          <w:bCs/>
           <w:color w:val="00B050"/>
         </w:rPr>
-        <w:t xml:space="preserve"> start</w:t>
-      </w:r>
-    </w:p>
-    <w:p>
-      <w:r>
-        <w:t>Expected output:</w:t>
-      </w:r>
-    </w:p>
-    <w:p>
-      <w:r>
-        <w:t>Initializing Fabric connections...</w:t>
-      </w:r>
-    </w:p>
-    <w:p>
-      <w:r>
-        <w:t>Successfully connected to Fabric Gateway</w:t>
-      </w:r>
-    </w:p>
-    <w:p>
-      <w:r>
-        <w:t>Backend Server listening on port 3000 (0.0.0.0)</w:t>
-      </w:r>
-    </w:p>
-    <w:p>
-      <w:r>
-        <w:t>Verify the backend is running</w:t>
-      </w:r>
-    </w:p>
-    <w:p>
-      <w:pPr>
-        <w:rPr>
-          <w:b/>
-          <w:color w:val="FF0000"/>
-        </w:rPr>
-      </w:pPr>
-      <w:r>
-        <w:rPr>
-          <w:b/>
-          <w:color w:val="FF0000"/>
+      </w:pPr>
+      <w:r>
+        <w:rPr>
+          <w:bCs/>
+          <w:color w:val="00B050"/>
+        </w:rPr>
+        <w:t>powershell -NoProfile -ExecutionPolicy Bypass -File .\backend\startGateway.ps1</w:t>
+      </w:r>
+      <w:r>
+        <w:t xml:space="preserve"> </w:t>
+      </w:r>
+      <w:r>
+        <w:rPr>
+          <w:bCs/>
+          <w:color w:val="00B050"/>
+        </w:rPr>
+        <w:t>-Org org2</w:t>
+      </w:r>
+    </w:p>
+    <w:p>
+      <w:pPr>
+        <w:rPr>
+          <w:bCs/>
+          <w:color w:val="00B050"/>
+        </w:rPr>
+      </w:pPr>
+      <w:r>
+        <w:rPr>
+          <w:b/>
+          <w:bCs/>
+        </w:rPr>
+        <w:t>Start both orgs backends:</w:t>
+      </w:r>
+      <w:r>
+        <w:rPr>
+          <w:bCs/>
+          <w:color w:val="00B050"/>
+        </w:rPr>
+        <w:br/>
+      </w:r>
+      <w:r>
+        <w:rPr>
+          <w:bCs/>
+          <w:color w:val="00B050"/>
+        </w:rPr>
+        <w:br/>
+      </w:r>
+      <w:r>
+        <w:rPr>
+          <w:bCs/>
+          <w:color w:val="00B050"/>
+        </w:rPr>
+        <w:t>powershell -NoProfile -ExecutionPolicy Bypass -File .\ba</w:t>
+      </w:r>
+      <w:r>
+        <w:rPr>
+          <w:bCs/>
+          <w:color w:val="00B050"/>
+        </w:rPr>
+        <w:t>ckend\startGateway.ps1 -Org both</w:t>
+      </w:r>
+    </w:p>
+    <w:p>
+      <w:r>
+        <w:rPr>
           <w:highlight w:val="yellow"/>
         </w:rPr>
-        <w:t>In another CMD window:</w:t>
-      </w:r>
-    </w:p>
-    <w:p>
-      <w:r>
-        <w:t>cmd</w:t>
+        <w:t>Start both gateways (WSL</w:t>
+      </w:r>
+      <w:r>
+        <w:rPr>
+          <w:highlight w:val="yellow"/>
+        </w:rPr>
+        <w:t xml:space="preserve"> in</w:t>
+      </w:r>
+      <w:r>
+        <w:rPr>
+          <w:highlight w:val="yellow"/>
+        </w:rPr>
+        <w:t xml:space="preserve"> root</w:t>
+      </w:r>
+      <w:r>
+        <w:rPr>
+          <w:highlight w:val="yellow"/>
+        </w:rPr>
+        <w:t xml:space="preserve"> AuthApp</w:t>
+      </w:r>
+      <w:r>
+        <w:rPr>
+          <w:highlight w:val="yellow"/>
+        </w:rPr>
+        <w:t>):</w:t>
+      </w:r>
+    </w:p>
+    <w:p>
+      <w:pPr>
+        <w:rPr>
+          <w:color w:val="7030A0"/>
+        </w:rPr>
+      </w:pPr>
+      <w:r>
+        <w:rPr>
+          <w:color w:val="7030A0"/>
+        </w:rPr>
+        <w:t>w</w:t>
+      </w:r>
+      <w:r>
+        <w:rPr>
+          <w:color w:val="7030A0"/>
+        </w:rPr>
+        <w:t xml:space="preserve">sl bash </w:t>
+      </w:r>
+      <w:r>
+        <w:rPr>
+          <w:color w:val="7030A0"/>
+        </w:rPr>
+        <w:t xml:space="preserve">./startGateways.sh </w:t>
       </w:r>
     </w:p>
     <w:p>
@@ -400,6 +567,18 @@
       </w:pPr>
       <w:r>
         <w:rPr>
+          <w:b/>
+        </w:rPr>
+        <w:t>Check ports:</w:t>
+      </w:r>
+      <w:r>
+        <w:rPr>
+          <w:color w:val="7030A0"/>
+        </w:rPr>
+        <w:br/>
+      </w:r>
+      <w:r>
+        <w:rPr>
           <w:color w:val="00B050"/>
         </w:rPr>
         <w:t>netstat -aon | findstr :3000</w:t>
@@ -416,11 +595,6 @@
           <w:color w:val="00B050"/>
         </w:rPr>
         <w:t>netstat -aon | findstr :5683</w:t>
-      </w:r>
-    </w:p>
-    <w:p>
-      <w:r>
-        <w:t>You should see a LISTENING entry on port 3000.</w:t>
       </w:r>
     </w:p>
     <w:p>
@@ -506,12 +680,50 @@
       <w:pPr>
         <w:pStyle w:val="Heading2"/>
         <w:rPr>
-          <w:b/>
-        </w:rPr>
-      </w:pPr>
-      <w:r>
-        <w:rPr>
-          <w:b/>
+          <w:rFonts w:asciiTheme="minorHAnsi" w:hAnsiTheme="minorHAnsi" w:cstheme="minorHAnsi"/>
+          <w:b/>
+          <w:color w:val="auto"/>
+          <w:sz w:val="22"/>
+          <w:szCs w:val="22"/>
+        </w:rPr>
+      </w:pPr>
+      <w:r>
+        <w:rPr>
+          <w:rFonts w:asciiTheme="minorHAnsi" w:hAnsiTheme="minorHAnsi" w:cstheme="minorHAnsi"/>
+          <w:b/>
+          <w:color w:val="auto"/>
+          <w:sz w:val="22"/>
+          <w:szCs w:val="22"/>
+        </w:rPr>
+        <w:t>Step 6 -</w:t>
+      </w:r>
+      <w:r>
+        <w:rPr>
+          <w:rFonts w:asciiTheme="minorHAnsi" w:hAnsiTheme="minorHAnsi" w:cstheme="minorHAnsi"/>
+          <w:b/>
+          <w:color w:val="auto"/>
+          <w:sz w:val="22"/>
+          <w:szCs w:val="22"/>
+        </w:rPr>
+        <w:t>-</w:t>
+      </w:r>
+      <w:r>
+        <w:rPr>
+          <w:rFonts w:asciiTheme="minorHAnsi" w:hAnsiTheme="minorHAnsi" w:cstheme="minorHAnsi"/>
+          <w:b/>
+          <w:color w:val="auto"/>
+          <w:sz w:val="22"/>
+          <w:szCs w:val="22"/>
+        </w:rPr>
+        <w:t xml:space="preserve"> </w:t>
+      </w:r>
+      <w:r>
+        <w:rPr>
+          <w:rFonts w:asciiTheme="minorHAnsi" w:hAnsiTheme="minorHAnsi" w:cstheme="minorHAnsi"/>
+          <w:b/>
+          <w:color w:val="auto"/>
+          <w:sz w:val="22"/>
+          <w:szCs w:val="22"/>
         </w:rPr>
         <w:t>Simulation:</w:t>
       </w:r>
@@ -535,46 +747,191 @@
     </w:p>
     <w:p/>
     <w:p>
-      <w:r>
-        <w:t>A</w:t>
-      </w:r>
-      <w:r>
-        <w:t>uthApp/simulator</w:t>
-      </w:r>
-      <w:r>
-        <w:t xml:space="preserve"> cmd:</w:t>
-      </w:r>
-      <w:r>
+      <w:pPr>
+        <w:rPr>
+          <w:color w:val="FF0000"/>
+        </w:rPr>
+      </w:pPr>
+      <w:r>
+        <w:rPr>
+          <w:b/>
+          <w:highlight w:val="yellow"/>
+        </w:rPr>
+        <w:t>Clean Network:</w:t>
+      </w:r>
+      <w:r>
+        <w:br/>
+      </w:r>
+      <w:r>
+        <w:rPr>
+          <w:color w:val="FF0000"/>
+        </w:rPr>
+        <w:t>docker-compose down --remove-orphans</w:t>
+      </w:r>
+    </w:p>
+    <w:p>
+      <w:r>
+        <w:rPr>
+          <w:highlight w:val="yellow"/>
+        </w:rPr>
+        <w:t>AuthApp/simulator</w:t>
+      </w:r>
+      <w:r>
+        <w:rPr>
+          <w:highlight w:val="yellow"/>
+        </w:rPr>
+        <w:t xml:space="preserve"> (1 gateway – </w:t>
+      </w:r>
+      <w:r>
+        <w:rPr>
+          <w:b/>
+          <w:highlight w:val="yellow"/>
+        </w:rPr>
+        <w:t>HTTP</w:t>
+      </w:r>
+      <w:r>
+        <w:rPr>
+          <w:highlight w:val="yellow"/>
+        </w:rPr>
+        <w:t>)</w:t>
+      </w:r>
+      <w:r>
+        <w:rPr>
+          <w:highlight w:val="yellow"/>
+        </w:rPr>
+        <w:t>:</w:t>
+      </w:r>
+      <w:r>
+        <w:rPr>
+          <w:highlight w:val="yellow"/>
+        </w:rPr>
         <w:t xml:space="preserve"> (5, 10 ,50)</w:t>
       </w:r>
     </w:p>
     <w:p>
       <w:pPr>
         <w:rPr>
+          <w:color w:val="7030A0"/>
+        </w:rPr>
+      </w:pPr>
+      <w:r>
+        <w:rPr>
+          <w:color w:val="7030A0"/>
+        </w:rPr>
+        <w:t xml:space="preserve">docker-compose up --build --scale </w:t>
+      </w:r>
+      <w:r>
+        <w:rPr>
+          <w:color w:val="7030A0"/>
+        </w:rPr>
+        <w:t xml:space="preserve">sensor=5 </w:t>
+      </w:r>
+    </w:p>
+    <w:p>
+      <w:pPr>
+        <w:rPr>
           <w:color w:val="00B050"/>
         </w:rPr>
       </w:pPr>
-      <w:r>
+    </w:p>
+    <w:p>
+      <w:r>
+        <w:rPr>
+          <w:highlight w:val="cyan"/>
+        </w:rPr>
+        <w:t xml:space="preserve">AuthApp/simulator (1 gateway – </w:t>
+      </w:r>
+      <w:r>
+        <w:rPr>
+          <w:b/>
+          <w:highlight w:val="cyan"/>
+        </w:rPr>
+        <w:t>CoAP</w:t>
+      </w:r>
+      <w:r>
+        <w:rPr>
+          <w:highlight w:val="cyan"/>
+        </w:rPr>
+        <w:t>): (5, 10 ,50)</w:t>
+      </w:r>
+    </w:p>
+    <w:p>
+      <w:pPr>
         <w:rPr>
           <w:color w:val="00B050"/>
         </w:rPr>
-        <w:t xml:space="preserve">docker-compose up --build --scale </w:t>
-      </w:r>
+      </w:pPr>
       <w:r>
         <w:rPr>
           <w:color w:val="00B050"/>
         </w:rPr>
-        <w:t xml:space="preserve">sensor=5 </w:t>
-      </w:r>
-    </w:p>
-    <w:p>
-      <w:r>
-        <w:rPr>
-          <w:b/>
+        <w:t>docker-compose -f docker-compose.coap.yml up --build --scale sensor=5</w:t>
+      </w:r>
+    </w:p>
+    <w:p>
+      <w:pPr>
+        <w:rPr>
+          <w:color w:val="7030A0"/>
+        </w:rPr>
+      </w:pPr>
+      <w:r>
+        <w:rPr>
+          <w:color w:val="00B050"/>
+        </w:rPr>
+        <w:lastRenderedPageBreak/>
+        <w:br/>
+      </w:r>
+      <w:r>
+        <w:rPr>
+          <w:b/>
+          <w:highlight w:val="cyan"/>
+        </w:rPr>
+        <w:t>Run against both ga</w:t>
+      </w:r>
+      <w:r>
+        <w:rPr>
+          <w:b/>
+          <w:highlight w:val="cyan"/>
+        </w:rPr>
+        <w:t>teways (needs Windows implementation):</w:t>
+      </w:r>
+      <w:r>
+        <w:rPr>
+          <w:b/>
+        </w:rPr>
+        <w:t xml:space="preserve"> </w:t>
+      </w:r>
+      <w:r>
+        <w:rPr>
+          <w:color w:val="00B050"/>
+        </w:rPr>
+        <w:br/>
+      </w:r>
+      <w:r>
+        <w:rPr>
+          <w:color w:val="00B050"/>
+        </w:rPr>
+        <w:t>wsl bash</w:t>
+      </w:r>
+      <w:r>
+        <w:rPr>
+          <w:color w:val="00B050"/>
+        </w:rPr>
+        <w:t xml:space="preserve"> ./demo-dual-gateway.sh 5</w:t>
+      </w:r>
+    </w:p>
+    <w:p>
+      <w:r>
+        <w:rPr>
+          <w:b/>
+          <w:highlight w:val="yellow"/>
         </w:rPr>
         <w:t>Clean</w:t>
       </w:r>
       <w:r>
+        <w:rPr>
+          <w:highlight w:val="yellow"/>
+        </w:rPr>
         <w:t xml:space="preserve"> (/simulator cmd):</w:t>
       </w:r>
     </w:p>
@@ -657,7 +1014,6 @@
         <w:rPr>
           <w:highlight w:val="yellow"/>
         </w:rPr>
-        <w:lastRenderedPageBreak/>
         <w:t>Note:</w:t>
       </w:r>
       <w:r>
@@ -804,6 +1160,7 @@
     </w:p>
     <w:p>
       <w:r>
+        <w:lastRenderedPageBreak/>
         <w:t>true</w:t>
       </w:r>
     </w:p>
@@ -866,16 +1223,13 @@
           <w:color w:val="FF0000"/>
         </w:rPr>
       </w:pPr>
-      <w:bookmarkStart w:id="0" w:name="_GoBack"/>
       <w:r>
         <w:rPr>
           <w:color w:val="FF0000"/>
         </w:rPr>
-        <w:lastRenderedPageBreak/>
         <w:t>wsl bash -c "cd /mnt/c/Users/Marius/OneDrive/Desktop/Dizertatie/Hyperledger-Fabric/fabric-samples/test-network &amp;&amp; ./network.sh down"</w:t>
       </w:r>
     </w:p>
-    <w:bookmarkEnd w:id="0"/>
     <w:p>
       <w:pPr>
         <w:rPr>
@@ -906,6 +1260,880 @@
           <w:color w:val="7030A0"/>
         </w:rPr>
         <w:t>docker exec -it peer0.org1.example.com peer channel getinfo -c mychannel</w:t>
+      </w:r>
+    </w:p>
+    <w:p/>
+    <w:p/>
+    <w:p/>
+    <w:p/>
+    <w:p/>
+    <w:p/>
+    <w:p/>
+    <w:p/>
+    <w:p/>
+    <w:p/>
+    <w:p/>
+    <w:p/>
+    <w:p/>
+    <w:p/>
+    <w:p/>
+    <w:p/>
+    <w:p/>
+    <w:p/>
+    <w:p/>
+    <w:p/>
+    <w:p/>
+    <w:p/>
+    <w:p/>
+    <w:p/>
+    <w:p/>
+    <w:p/>
+    <w:p>
+      <w:pPr>
+        <w:rPr>
+          <w:b/>
+          <w:sz w:val="28"/>
+          <w:szCs w:val="28"/>
+          <w:u w:val="single"/>
+        </w:rPr>
+      </w:pPr>
+      <w:r>
+        <w:rPr>
+          <w:b/>
+          <w:sz w:val="28"/>
+          <w:szCs w:val="28"/>
+          <w:u w:val="single"/>
+        </w:rPr>
+        <w:t>Presentation</w:t>
+      </w:r>
+      <w:r>
+        <w:rPr>
+          <w:b/>
+          <w:sz w:val="28"/>
+          <w:szCs w:val="28"/>
+          <w:u w:val="single"/>
+        </w:rPr>
+        <w:t>:</w:t>
+      </w:r>
+    </w:p>
+    <w:p>
+      <w:pPr>
+        <w:rPr>
+          <w:b/>
+          <w:bCs/>
+        </w:rPr>
+      </w:pPr>
+      <w:r>
+        <w:rPr>
+          <w:b/>
+          <w:bCs/>
+        </w:rPr>
+        <w:t>1. Introduction &amp; Problem (1 min)</w:t>
+      </w:r>
+    </w:p>
+    <w:p>
+      <w:r>
+        <w:rPr>
+          <w:b/>
+          <w:bCs/>
+        </w:rPr>
+        <w:t>Action:</w:t>
+      </w:r>
+      <w:r>
+        <w:t> Have the document open at the </w:t>
+      </w:r>
+      <w:r>
+        <w:rPr>
+          <w:b/>
+          <w:bCs/>
+        </w:rPr>
+        <w:t>Title and Abstract</w:t>
+      </w:r>
+      <w:r>
+        <w:t>. </w:t>
+      </w:r>
+      <w:r>
+        <w:rPr>
+          <w:b/>
+          <w:bCs/>
+        </w:rPr>
+        <w:t>Goal:</w:t>
+      </w:r>
+      <w:r>
+        <w:t> Hook the audience, define the exact problem, and explain why it matters.</w:t>
+      </w:r>
+    </w:p>
+    <w:p>
+      <w:pPr>
+        <w:numPr>
+          <w:ilvl w:val="0"/>
+          <w:numId w:val="6"/>
+        </w:numPr>
+      </w:pPr>
+      <w:r>
+        <w:rPr>
+          <w:b/>
+          <w:bCs/>
+        </w:rPr>
+        <w:t>The IoT Authentication Problem (Section 1.1)</w:t>
+      </w:r>
+    </w:p>
+    <w:p>
+      <w:pPr>
+        <w:numPr>
+          <w:ilvl w:val="1"/>
+          <w:numId w:val="6"/>
+        </w:numPr>
+      </w:pPr>
+      <w:r>
+        <w:rPr>
+          <w:b/>
+          <w:bCs/>
+        </w:rPr>
+        <w:t>What problem are you solving?</w:t>
+      </w:r>
+      <w:r>
+        <w:t> We are securing IoT devices (sensors, smart homes, industrial) by fixing how they authenticate.</w:t>
+      </w:r>
+    </w:p>
+    <w:p>
+      <w:pPr>
+        <w:numPr>
+          <w:ilvl w:val="1"/>
+          <w:numId w:val="6"/>
+        </w:numPr>
+      </w:pPr>
+      <w:r>
+        <w:rPr>
+          <w:b/>
+          <w:bCs/>
+        </w:rPr>
+        <w:t>Why is it important?</w:t>
+      </w:r>
+      <w:r>
+        <w:t> The current standard relies on centralized servers. If that server goes down (or is attacked via DDoS), the entire fleet of devices goes offline.</w:t>
+      </w:r>
+    </w:p>
+    <w:p>
+      <w:pPr>
+        <w:numPr>
+          <w:ilvl w:val="1"/>
+          <w:numId w:val="6"/>
+        </w:numPr>
+      </w:pPr>
+      <w:r>
+        <w:rPr>
+          <w:b/>
+          <w:bCs/>
+        </w:rPr>
+        <w:t>The Vulnerability:</w:t>
+      </w:r>
+      <w:r>
+        <w:t> Centralized databases are a single point of failure and a massive target for identity spoofing.</w:t>
+      </w:r>
+    </w:p>
+    <w:p>
+      <w:r>
+        <w:pict>
+          <v:rect id="_x0000_i1033" style="width:9in;height:.75pt" o:hrpct="0" o:hralign="center" o:hrstd="t" o:hr="t" fillcolor="#a0a0a0" stroked="f"/>
+        </w:pict>
+      </w:r>
+    </w:p>
+    <w:p>
+      <w:pPr>
+        <w:rPr>
+          <w:b/>
+          <w:bCs/>
+        </w:rPr>
+      </w:pPr>
+      <w:r>
+        <w:rPr>
+          <w:b/>
+          <w:bCs/>
+        </w:rPr>
+        <w:t>2. Motivation &amp; Related Work (1 min)</w:t>
+      </w:r>
+    </w:p>
+    <w:p>
+      <w:r>
+        <w:rPr>
+          <w:b/>
+          <w:bCs/>
+        </w:rPr>
+        <w:t>Action:</w:t>
+      </w:r>
+      <w:r>
+        <w:t> Scroll briefly to </w:t>
+      </w:r>
+      <w:r>
+        <w:rPr>
+          <w:b/>
+          <w:bCs/>
+        </w:rPr>
+        <w:t>Section 1.2 (Motivation)</w:t>
+      </w:r>
+      <w:r>
+        <w:t> or </w:t>
+      </w:r>
+      <w:r>
+        <w:rPr>
+          <w:b/>
+          <w:bCs/>
+        </w:rPr>
+        <w:t>Section 2.1 (Existing Solutions)</w:t>
+      </w:r>
+      <w:r>
+        <w:t>. </w:t>
+      </w:r>
+      <w:r>
+        <w:rPr>
+          <w:b/>
+          <w:bCs/>
+        </w:rPr>
+        <w:t>Goal:</w:t>
+      </w:r>
+      <w:r>
+        <w:t> Show what exists and why your approach is needed.</w:t>
+      </w:r>
+    </w:p>
+    <w:p>
+      <w:pPr>
+        <w:numPr>
+          <w:ilvl w:val="0"/>
+          <w:numId w:val="7"/>
+        </w:numPr>
+      </w:pPr>
+      <w:r>
+        <w:rPr>
+          <w:b/>
+          <w:bCs/>
+        </w:rPr>
+        <w:t>Why Current Solutions are Insufficient</w:t>
+      </w:r>
+    </w:p>
+    <w:p>
+      <w:pPr>
+        <w:numPr>
+          <w:ilvl w:val="1"/>
+          <w:numId w:val="7"/>
+        </w:numPr>
+      </w:pPr>
+      <w:r>
+        <w:rPr>
+          <w:b/>
+          <w:bCs/>
+        </w:rPr>
+        <w:t>What already exists?</w:t>
+      </w:r>
+      <w:r>
+        <w:t> Centralized credential servers and traditional heavy public blockchains (like Ethereum).</w:t>
+      </w:r>
+    </w:p>
+    <w:p>
+      <w:pPr>
+        <w:numPr>
+          <w:ilvl w:val="1"/>
+          <w:numId w:val="7"/>
+        </w:numPr>
+      </w:pPr>
+      <w:r>
+        <w:rPr>
+          <w:b/>
+          <w:bCs/>
+        </w:rPr>
+        <w:t>Why is it insufficient?</w:t>
+      </w:r>
+      <w:r>
+        <w:t> Centralized servers are fragile at the edge (where connectivity drops). Public blockchains are too slow and consume too much energy for lightweight IoT sensors.</w:t>
+      </w:r>
+    </w:p>
+    <w:p>
+      <w:pPr>
+        <w:numPr>
+          <w:ilvl w:val="1"/>
+          <w:numId w:val="7"/>
+        </w:numPr>
+      </w:pPr>
+      <w:r>
+        <w:rPr>
+          <w:b/>
+          <w:bCs/>
+        </w:rPr>
+        <w:t>The Gap:</w:t>
+      </w:r>
+      <w:r>
+        <w:t> We need a system that offers the security of a blockchain without requiring the edge devices to do the heavy crypto-mining.</w:t>
+      </w:r>
+    </w:p>
+    <w:p>
+      <w:r>
+        <w:pict>
+          <v:rect id="_x0000_i1034" style="width:9in;height:.75pt" o:hrpct="0" o:hralign="center" o:hrstd="t" o:hr="t" fillcolor="#a0a0a0" stroked="f"/>
+        </w:pict>
+      </w:r>
+    </w:p>
+    <w:p>
+      <w:pPr>
+        <w:rPr>
+          <w:b/>
+          <w:bCs/>
+        </w:rPr>
+      </w:pPr>
+      <w:r>
+        <w:rPr>
+          <w:b/>
+          <w:bCs/>
+        </w:rPr>
+        <w:t>3. Proposed Solution / Methodology (2.5 min)</w:t>
+      </w:r>
+    </w:p>
+    <w:p>
+      <w:r>
+        <w:rPr>
+          <w:b/>
+          <w:bCs/>
+        </w:rPr>
+        <w:t>Action:</w:t>
+      </w:r>
+      <w:r>
+        <w:t> Scroll to </w:t>
+      </w:r>
+      <w:r>
+        <w:rPr>
+          <w:b/>
+          <w:bCs/>
+        </w:rPr>
+        <w:t>Figure 1 (Architecture)</w:t>
+      </w:r>
+      <w:r>
+        <w:t> and then to </w:t>
+      </w:r>
+      <w:r>
+        <w:rPr>
+          <w:b/>
+          <w:bCs/>
+        </w:rPr>
+        <w:t>Figure 7 (Sequence Diagram)</w:t>
+      </w:r>
+      <w:r>
+        <w:t>. </w:t>
+      </w:r>
+      <w:r>
+        <w:rPr>
+          <w:b/>
+          <w:bCs/>
+        </w:rPr>
+        <w:t>Goal:</w:t>
+      </w:r>
+      <w:r>
+        <w:t> Explain your architecture, technologies, and design decisions clearly by pointing at the diagrams.</w:t>
+      </w:r>
+    </w:p>
+    <w:p>
+      <w:pPr>
+        <w:numPr>
+          <w:ilvl w:val="0"/>
+          <w:numId w:val="8"/>
+        </w:numPr>
+      </w:pPr>
+      <w:r>
+        <w:rPr>
+          <w:b/>
+          <w:bCs/>
+        </w:rPr>
+        <w:lastRenderedPageBreak/>
+        <w:t>The Architecture &amp; Innovation (Show Figure 1)</w:t>
+      </w:r>
+    </w:p>
+    <w:p>
+      <w:pPr>
+        <w:numPr>
+          <w:ilvl w:val="1"/>
+          <w:numId w:val="8"/>
+        </w:numPr>
+      </w:pPr>
+      <w:r>
+        <w:rPr>
+          <w:b/>
+          <w:bCs/>
+        </w:rPr>
+        <w:t>What is innovative?</w:t>
+      </w:r>
+      <w:r>
+        <w:t> A 4-layer hybrid architecture that completely offloads blockchain consensus away from the weak edge devices.</w:t>
+      </w:r>
+    </w:p>
+    <w:p>
+      <w:pPr>
+        <w:numPr>
+          <w:ilvl w:val="1"/>
+          <w:numId w:val="8"/>
+        </w:numPr>
+      </w:pPr>
+      <w:r>
+        <w:rPr>
+          <w:b/>
+          <w:bCs/>
+        </w:rPr>
+        <w:t>Technologies:</w:t>
+      </w:r>
+      <w:r>
+        <w:t> Hyperledger Fabric (permissioned, fast), Node.js middleware, React dashboard.</w:t>
+      </w:r>
+    </w:p>
+    <w:p>
+      <w:pPr>
+        <w:numPr>
+          <w:ilvl w:val="1"/>
+          <w:numId w:val="8"/>
+        </w:numPr>
+      </w:pPr>
+      <w:r>
+        <w:rPr>
+          <w:b/>
+          <w:bCs/>
+        </w:rPr>
+        <w:t>Design Decision:</w:t>
+      </w:r>
+      <w:r>
+        <w:t> We use a dual-protocol gateway. Legacy devices can use HTTP/TCP, while modern constrained devices use lightweight CoAP/UDP.</w:t>
+      </w:r>
+    </w:p>
+    <w:p>
+      <w:pPr>
+        <w:numPr>
+          <w:ilvl w:val="0"/>
+          <w:numId w:val="8"/>
+        </w:numPr>
+      </w:pPr>
+      <w:r>
+        <w:rPr>
+          <w:b/>
+          <w:bCs/>
+        </w:rPr>
+        <w:t>The Workflow &amp; State Machine (Section 3.2)</w:t>
+      </w:r>
+    </w:p>
+    <w:p>
+      <w:pPr>
+        <w:numPr>
+          <w:ilvl w:val="1"/>
+          <w:numId w:val="8"/>
+        </w:numPr>
+      </w:pPr>
+      <w:r>
+        <w:rPr>
+          <w:b/>
+          <w:bCs/>
+        </w:rPr>
+        <w:t>Explanation:</w:t>
+      </w:r>
+      <w:r>
+        <w:t> The Hyperledger Smart Contract (DeviceAuthContract) mathematically enforces a 4-state lifecycle (Registered → Active → Suspended → Revoked) directly on-chain.</w:t>
+      </w:r>
+    </w:p>
+    <w:p>
+      <w:pPr>
+        <w:numPr>
+          <w:ilvl w:val="0"/>
+          <w:numId w:val="8"/>
+        </w:numPr>
+      </w:pPr>
+      <w:r>
+        <w:rPr>
+          <w:b/>
+          <w:bCs/>
+        </w:rPr>
+        <w:t>Challenge-Response Protocol (Show Figure 7)</w:t>
+      </w:r>
+    </w:p>
+    <w:p>
+      <w:pPr>
+        <w:numPr>
+          <w:ilvl w:val="1"/>
+          <w:numId w:val="8"/>
+        </w:numPr>
+      </w:pPr>
+      <w:r>
+        <w:rPr>
+          <w:b/>
+          <w:bCs/>
+        </w:rPr>
+        <w:t>Why trust it?</w:t>
+      </w:r>
+      <w:r>
+        <w:t> Walk them through the sequence diagram. Private keys never leave the IoT device. The gateway issues a random nonce (challenge), the device signs it using ECDSA secp256r1, and Fabric verifies the signature on-chain.</w:t>
+      </w:r>
+    </w:p>
+    <w:p>
+      <w:r>
+        <w:pict>
+          <v:rect id="_x0000_i1035" style="width:9in;height:.75pt" o:hrpct="0" o:hralign="center" o:hrstd="t" o:hr="t" fillcolor="#a0a0a0" stroked="f"/>
+        </w:pict>
+      </w:r>
+    </w:p>
+    <w:p>
+      <w:pPr>
+        <w:rPr>
+          <w:b/>
+          <w:bCs/>
+        </w:rPr>
+      </w:pPr>
+      <w:r>
+        <w:rPr>
+          <w:b/>
+          <w:bCs/>
+        </w:rPr>
+        <w:t>4. Results / Demo / Evaluation (2.5 min)</w:t>
+      </w:r>
+    </w:p>
+    <w:p>
+      <w:r>
+        <w:rPr>
+          <w:b/>
+          <w:bCs/>
+        </w:rPr>
+        <w:t>Action:</w:t>
+      </w:r>
+      <w:r>
+        <w:t> Scroll to the </w:t>
+      </w:r>
+      <w:r>
+        <w:rPr>
+          <w:b/>
+          <w:bCs/>
+        </w:rPr>
+        <w:t>Methodology (Section 4)</w:t>
+      </w:r>
+      <w:r>
+        <w:t> and </w:t>
+      </w:r>
+      <w:r>
+        <w:rPr>
+          <w:b/>
+          <w:bCs/>
+        </w:rPr>
+        <w:t>Results (Section 5 / Figure 5)</w:t>
+      </w:r>
+      <w:r>
+        <w:t>. If you have a live demo or a separate screenshot of the Dashboard (Figure 3), switch to it here. </w:t>
+      </w:r>
+      <w:r>
+        <w:rPr>
+          <w:b/>
+          <w:bCs/>
+        </w:rPr>
+        <w:t>Goal:</w:t>
+      </w:r>
+      <w:r>
+        <w:t> Prove that your system works under realistic constraints.</w:t>
+      </w:r>
+    </w:p>
+    <w:p>
+      <w:pPr>
+        <w:numPr>
+          <w:ilvl w:val="0"/>
+          <w:numId w:val="9"/>
+        </w:numPr>
+      </w:pPr>
+      <w:r>
+        <w:rPr>
+          <w:b/>
+          <w:bCs/>
+        </w:rPr>
+        <w:t>Experiment Logic &amp; Setup (Section 4.2)</w:t>
+      </w:r>
+    </w:p>
+    <w:p>
+      <w:pPr>
+        <w:numPr>
+          <w:ilvl w:val="1"/>
+          <w:numId w:val="9"/>
+        </w:numPr>
+      </w:pPr>
+      <w:r>
+        <w:rPr>
+          <w:b/>
+          <w:bCs/>
+        </w:rPr>
+        <w:t>Methodology:</w:t>
+      </w:r>
+      <w:r>
+        <w:t> Explain that you simulated real-world edge constraints using three environments: Browser (baseline), Docker Fleet (CoAP stress-test), and QEMU ARM Emulator (legacy hardware).</w:t>
+      </w:r>
+    </w:p>
+    <w:p>
+      <w:pPr>
+        <w:numPr>
+          <w:ilvl w:val="0"/>
+          <w:numId w:val="9"/>
+        </w:numPr>
+      </w:pPr>
+      <w:r>
+        <w:rPr>
+          <w:b/>
+          <w:bCs/>
+        </w:rPr>
+        <w:t>The Results (Latency &amp; Payload - Section 5.1/5.2)</w:t>
+      </w:r>
+    </w:p>
+    <w:p>
+      <w:pPr>
+        <w:numPr>
+          <w:ilvl w:val="1"/>
+          <w:numId w:val="9"/>
+        </w:numPr>
+      </w:pPr>
+      <w:r>
+        <w:rPr>
+          <w:b/>
+          <w:bCs/>
+        </w:rPr>
+        <w:t>What are the results?</w:t>
+      </w:r>
+    </w:p>
+    <w:p>
+      <w:pPr>
+        <w:numPr>
+          <w:ilvl w:val="2"/>
+          <w:numId w:val="9"/>
+        </w:numPr>
+      </w:pPr>
+      <w:r>
+        <w:rPr>
+          <w:b/>
+          <w:bCs/>
+        </w:rPr>
+        <w:t>Speed:</w:t>
+      </w:r>
+      <w:r>
+        <w:t> Even with up to 200 concurrent devices, end-to-end authentication stabilized at ~1.8 seconds.</w:t>
+      </w:r>
+    </w:p>
+    <w:p>
+      <w:pPr>
+        <w:numPr>
+          <w:ilvl w:val="2"/>
+          <w:numId w:val="9"/>
+        </w:numPr>
+      </w:pPr>
+      <w:r>
+        <w:rPr>
+          <w:b/>
+          <w:bCs/>
+        </w:rPr>
+        <w:t>Payload:</w:t>
+      </w:r>
+      <w:r>
+        <w:t> Using CoAP/CBOR drastically reduced the network payload compared to HTTP/JSON.</w:t>
+      </w:r>
+    </w:p>
+    <w:p>
+      <w:pPr>
+        <w:numPr>
+          <w:ilvl w:val="2"/>
+          <w:numId w:val="9"/>
+        </w:numPr>
+      </w:pPr>
+      <w:r>
+        <w:rPr>
+          <w:b/>
+          <w:bCs/>
+        </w:rPr>
+        <w:t>Crypto Overhead:</w:t>
+      </w:r>
+      <w:r>
+        <w:t> Even emulated old ARM processors handled the ECDSA signature efficiently.</w:t>
+      </w:r>
+    </w:p>
+    <w:p>
+      <w:pPr>
+        <w:numPr>
+          <w:ilvl w:val="0"/>
+          <w:numId w:val="9"/>
+        </w:numPr>
+      </w:pPr>
+      <w:r>
+        <w:rPr>
+          <w:b/>
+          <w:bCs/>
+        </w:rPr>
+        <w:t>The Dashboard (Demo or Figure 3)</w:t>
+      </w:r>
+    </w:p>
+    <w:p>
+      <w:pPr>
+        <w:numPr>
+          <w:ilvl w:val="1"/>
+          <w:numId w:val="9"/>
+        </w:numPr>
+      </w:pPr>
+      <w:r>
+        <w:rPr>
+          <w:b/>
+          <w:bCs/>
+        </w:rPr>
+        <w:t>Explanation:</w:t>
+      </w:r>
+      <w:r>
+        <w:t> Point out the real-time blockchain height and device state distribution, showing how administrators get a cryptographically proven audit trail.</w:t>
+      </w:r>
+    </w:p>
+    <w:p>
+      <w:r>
+        <w:pict>
+          <v:rect id="_x0000_i1036" style="width:9in;height:.75pt" o:hrpct="0" o:hralign="center" o:hrstd="t" o:hr="t" fillcolor="#a0a0a0" stroked="f"/>
+        </w:pict>
+      </w:r>
+    </w:p>
+    <w:p>
+      <w:pPr>
+        <w:rPr>
+          <w:b/>
+          <w:bCs/>
+        </w:rPr>
+      </w:pPr>
+      <w:r>
+        <w:rPr>
+          <w:b/>
+          <w:bCs/>
+        </w:rPr>
+        <w:lastRenderedPageBreak/>
+        <w:t>5. Conclusion &amp; Future Work (1 min)</w:t>
+      </w:r>
+    </w:p>
+    <w:p>
+      <w:r>
+        <w:rPr>
+          <w:b/>
+          <w:bCs/>
+        </w:rPr>
+        <w:t>Action:</w:t>
+      </w:r>
+      <w:r>
+        <w:t> Scroll to </w:t>
+      </w:r>
+      <w:r>
+        <w:rPr>
+          <w:b/>
+          <w:bCs/>
+        </w:rPr>
+        <w:t>Section 6 (Conclusion) and Figure 8 (Future Architecture)</w:t>
+      </w:r>
+      <w:r>
+        <w:t>. </w:t>
+      </w:r>
+      <w:r>
+        <w:rPr>
+          <w:b/>
+          <w:bCs/>
+        </w:rPr>
+        <w:t>Goal:</w:t>
+      </w:r>
+      <w:r>
+        <w:t> Wrap up strongly and show vision.</w:t>
+      </w:r>
+    </w:p>
+    <w:p>
+      <w:pPr>
+        <w:numPr>
+          <w:ilvl w:val="0"/>
+          <w:numId w:val="10"/>
+        </w:numPr>
+      </w:pPr>
+      <w:r>
+        <w:rPr>
+          <w:b/>
+          <w:bCs/>
+        </w:rPr>
+        <w:t>Conclusion (Section 6.1)</w:t>
+      </w:r>
+    </w:p>
+    <w:p>
+      <w:pPr>
+        <w:numPr>
+          <w:ilvl w:val="1"/>
+          <w:numId w:val="10"/>
+        </w:numPr>
+      </w:pPr>
+      <w:r>
+        <w:rPr>
+          <w:b/>
+          <w:bCs/>
+        </w:rPr>
+        <w:t>Summary:</w:t>
+      </w:r>
+      <w:r>
+        <w:t> We successfully decentralized IoT authentication, eliminated the single point of failure using Hyperledger Fabric, and proved it runs efficiently even on constrained legacy hardware.</w:t>
+      </w:r>
+    </w:p>
+    <w:p>
+      <w:pPr>
+        <w:numPr>
+          <w:ilvl w:val="1"/>
+          <w:numId w:val="10"/>
+        </w:numPr>
+      </w:pPr>
+      <w:r>
+        <w:rPr>
+          <w:b/>
+          <w:bCs/>
+        </w:rPr>
+        <w:t>Impact:</w:t>
+      </w:r>
+      <w:r>
+        <w:t> Factories can retrofit existing sensors with modern security without ripping out physical hardware.</w:t>
+      </w:r>
+    </w:p>
+    <w:p>
+      <w:pPr>
+        <w:numPr>
+          <w:ilvl w:val="0"/>
+          <w:numId w:val="10"/>
+        </w:numPr>
+      </w:pPr>
+      <w:r>
+        <w:rPr>
+          <w:b/>
+          <w:bCs/>
+        </w:rPr>
+        <w:t>Future Work (Show Figure 8)</w:t>
+      </w:r>
+    </w:p>
+    <w:p>
+      <w:pPr>
+        <w:numPr>
+          <w:ilvl w:val="1"/>
+          <w:numId w:val="10"/>
+        </w:numPr>
+      </w:pPr>
+      <w:r>
+        <w:rPr>
+          <w:b/>
+          <w:bCs/>
+        </w:rPr>
+        <w:t>Hardware Security:</w:t>
+      </w:r>
+      <w:r>
+        <w:t> Integrating physical Trusted Platform Modules (TPMs).</w:t>
+      </w:r>
+    </w:p>
+    <w:p>
+      <w:pPr>
+        <w:numPr>
+          <w:ilvl w:val="1"/>
+          <w:numId w:val="10"/>
+        </w:numPr>
+      </w:pPr>
+      <w:r>
+        <w:rPr>
+          <w:b/>
+          <w:bCs/>
+        </w:rPr>
+        <w:t>Post-Quantum:</w:t>
+      </w:r>
+      <w:r>
+        <w:t> Upgrading to quantum-resistant algorithms to future-proof against upcoming threats.</w:t>
       </w:r>
     </w:p>
     <w:p/>
@@ -1160,6 +2388,155 @@
     </w:lvl>
   </w:abstractNum>
   <w:abstractNum w:abstractNumId="2" w15:restartNumberingAfterBreak="0">
+    <w:nsid w:val="2F3E1831"/>
+    <w:multiLevelType w:val="multilevel"/>
+    <w:tmpl w:val="84261470"/>
+    <w:lvl w:ilvl="0">
+      <w:start w:val="1"/>
+      <w:numFmt w:val="bullet"/>
+      <w:lvlText w:val=""/>
+      <w:lvlJc w:val="left"/>
+      <w:pPr>
+        <w:tabs>
+          <w:tab w:val="num" w:pos="720"/>
+        </w:tabs>
+        <w:ind w:left="720" w:hanging="360"/>
+      </w:pPr>
+      <w:rPr>
+        <w:rFonts w:ascii="Symbol" w:hAnsi="Symbol" w:hint="default"/>
+        <w:sz w:val="20"/>
+      </w:rPr>
+    </w:lvl>
+    <w:lvl w:ilvl="1">
+      <w:start w:val="1"/>
+      <w:numFmt w:val="bullet"/>
+      <w:lvlText w:val=""/>
+      <w:lvlJc w:val="left"/>
+      <w:pPr>
+        <w:tabs>
+          <w:tab w:val="num" w:pos="1440"/>
+        </w:tabs>
+        <w:ind w:left="1440" w:hanging="360"/>
+      </w:pPr>
+      <w:rPr>
+        <w:rFonts w:ascii="Symbol" w:hAnsi="Symbol" w:hint="default"/>
+        <w:sz w:val="20"/>
+      </w:rPr>
+    </w:lvl>
+    <w:lvl w:ilvl="2" w:tentative="1">
+      <w:start w:val="1"/>
+      <w:numFmt w:val="bullet"/>
+      <w:lvlText w:val=""/>
+      <w:lvlJc w:val="left"/>
+      <w:pPr>
+        <w:tabs>
+          <w:tab w:val="num" w:pos="2160"/>
+        </w:tabs>
+        <w:ind w:left="2160" w:hanging="360"/>
+      </w:pPr>
+      <w:rPr>
+        <w:rFonts w:ascii="Symbol" w:hAnsi="Symbol" w:hint="default"/>
+        <w:sz w:val="20"/>
+      </w:rPr>
+    </w:lvl>
+    <w:lvl w:ilvl="3" w:tentative="1">
+      <w:start w:val="1"/>
+      <w:numFmt w:val="bullet"/>
+      <w:lvlText w:val=""/>
+      <w:lvlJc w:val="left"/>
+      <w:pPr>
+        <w:tabs>
+          <w:tab w:val="num" w:pos="2880"/>
+        </w:tabs>
+        <w:ind w:left="2880" w:hanging="360"/>
+      </w:pPr>
+      <w:rPr>
+        <w:rFonts w:ascii="Symbol" w:hAnsi="Symbol" w:hint="default"/>
+        <w:sz w:val="20"/>
+      </w:rPr>
+    </w:lvl>
+    <w:lvl w:ilvl="4" w:tentative="1">
+      <w:start w:val="1"/>
+      <w:numFmt w:val="bullet"/>
+      <w:lvlText w:val=""/>
+      <w:lvlJc w:val="left"/>
+      <w:pPr>
+        <w:tabs>
+          <w:tab w:val="num" w:pos="3600"/>
+        </w:tabs>
+        <w:ind w:left="3600" w:hanging="360"/>
+      </w:pPr>
+      <w:rPr>
+        <w:rFonts w:ascii="Symbol" w:hAnsi="Symbol" w:hint="default"/>
+        <w:sz w:val="20"/>
+      </w:rPr>
+    </w:lvl>
+    <w:lvl w:ilvl="5" w:tentative="1">
+      <w:start w:val="1"/>
+      <w:numFmt w:val="bullet"/>
+      <w:lvlText w:val=""/>
+      <w:lvlJc w:val="left"/>
+      <w:pPr>
+        <w:tabs>
+          <w:tab w:val="num" w:pos="4320"/>
+        </w:tabs>
+        <w:ind w:left="4320" w:hanging="360"/>
+      </w:pPr>
+      <w:rPr>
+        <w:rFonts w:ascii="Symbol" w:hAnsi="Symbol" w:hint="default"/>
+        <w:sz w:val="20"/>
+      </w:rPr>
+    </w:lvl>
+    <w:lvl w:ilvl="6" w:tentative="1">
+      <w:start w:val="1"/>
+      <w:numFmt w:val="bullet"/>
+      <w:lvlText w:val=""/>
+      <w:lvlJc w:val="left"/>
+      <w:pPr>
+        <w:tabs>
+          <w:tab w:val="num" w:pos="5040"/>
+        </w:tabs>
+        <w:ind w:left="5040" w:hanging="360"/>
+      </w:pPr>
+      <w:rPr>
+        <w:rFonts w:ascii="Symbol" w:hAnsi="Symbol" w:hint="default"/>
+        <w:sz w:val="20"/>
+      </w:rPr>
+    </w:lvl>
+    <w:lvl w:ilvl="7" w:tentative="1">
+      <w:start w:val="1"/>
+      <w:numFmt w:val="bullet"/>
+      <w:lvlText w:val=""/>
+      <w:lvlJc w:val="left"/>
+      <w:pPr>
+        <w:tabs>
+          <w:tab w:val="num" w:pos="5760"/>
+        </w:tabs>
+        <w:ind w:left="5760" w:hanging="360"/>
+      </w:pPr>
+      <w:rPr>
+        <w:rFonts w:ascii="Symbol" w:hAnsi="Symbol" w:hint="default"/>
+        <w:sz w:val="20"/>
+      </w:rPr>
+    </w:lvl>
+    <w:lvl w:ilvl="8" w:tentative="1">
+      <w:start w:val="1"/>
+      <w:numFmt w:val="bullet"/>
+      <w:lvlText w:val=""/>
+      <w:lvlJc w:val="left"/>
+      <w:pPr>
+        <w:tabs>
+          <w:tab w:val="num" w:pos="6480"/>
+        </w:tabs>
+        <w:ind w:left="6480" w:hanging="360"/>
+      </w:pPr>
+      <w:rPr>
+        <w:rFonts w:ascii="Symbol" w:hAnsi="Symbol" w:hint="default"/>
+        <w:sz w:val="20"/>
+      </w:rPr>
+    </w:lvl>
+  </w:abstractNum>
+  <w:abstractNum w:abstractNumId="3" w15:restartNumberingAfterBreak="0">
     <w:nsid w:val="30171016"/>
     <w:multiLevelType w:val="multilevel"/>
     <w:tmpl w:val="8E8C0DC4"/>
@@ -1276,7 +2653,305 @@
       </w:pPr>
     </w:lvl>
   </w:abstractNum>
-  <w:abstractNum w:abstractNumId="3" w15:restartNumberingAfterBreak="0">
+  <w:abstractNum w:abstractNumId="4" w15:restartNumberingAfterBreak="0">
+    <w:nsid w:val="400A033A"/>
+    <w:multiLevelType w:val="multilevel"/>
+    <w:tmpl w:val="F4B0A0A6"/>
+    <w:lvl w:ilvl="0">
+      <w:start w:val="1"/>
+      <w:numFmt w:val="bullet"/>
+      <w:lvlText w:val=""/>
+      <w:lvlJc w:val="left"/>
+      <w:pPr>
+        <w:tabs>
+          <w:tab w:val="num" w:pos="720"/>
+        </w:tabs>
+        <w:ind w:left="720" w:hanging="360"/>
+      </w:pPr>
+      <w:rPr>
+        <w:rFonts w:ascii="Symbol" w:hAnsi="Symbol" w:hint="default"/>
+        <w:sz w:val="20"/>
+      </w:rPr>
+    </w:lvl>
+    <w:lvl w:ilvl="1">
+      <w:start w:val="1"/>
+      <w:numFmt w:val="bullet"/>
+      <w:lvlText w:val=""/>
+      <w:lvlJc w:val="left"/>
+      <w:pPr>
+        <w:tabs>
+          <w:tab w:val="num" w:pos="1440"/>
+        </w:tabs>
+        <w:ind w:left="1440" w:hanging="360"/>
+      </w:pPr>
+      <w:rPr>
+        <w:rFonts w:ascii="Symbol" w:hAnsi="Symbol" w:hint="default"/>
+        <w:sz w:val="20"/>
+      </w:rPr>
+    </w:lvl>
+    <w:lvl w:ilvl="2" w:tentative="1">
+      <w:start w:val="1"/>
+      <w:numFmt w:val="bullet"/>
+      <w:lvlText w:val=""/>
+      <w:lvlJc w:val="left"/>
+      <w:pPr>
+        <w:tabs>
+          <w:tab w:val="num" w:pos="2160"/>
+        </w:tabs>
+        <w:ind w:left="2160" w:hanging="360"/>
+      </w:pPr>
+      <w:rPr>
+        <w:rFonts w:ascii="Symbol" w:hAnsi="Symbol" w:hint="default"/>
+        <w:sz w:val="20"/>
+      </w:rPr>
+    </w:lvl>
+    <w:lvl w:ilvl="3" w:tentative="1">
+      <w:start w:val="1"/>
+      <w:numFmt w:val="bullet"/>
+      <w:lvlText w:val=""/>
+      <w:lvlJc w:val="left"/>
+      <w:pPr>
+        <w:tabs>
+          <w:tab w:val="num" w:pos="2880"/>
+        </w:tabs>
+        <w:ind w:left="2880" w:hanging="360"/>
+      </w:pPr>
+      <w:rPr>
+        <w:rFonts w:ascii="Symbol" w:hAnsi="Symbol" w:hint="default"/>
+        <w:sz w:val="20"/>
+      </w:rPr>
+    </w:lvl>
+    <w:lvl w:ilvl="4" w:tentative="1">
+      <w:start w:val="1"/>
+      <w:numFmt w:val="bullet"/>
+      <w:lvlText w:val=""/>
+      <w:lvlJc w:val="left"/>
+      <w:pPr>
+        <w:tabs>
+          <w:tab w:val="num" w:pos="3600"/>
+        </w:tabs>
+        <w:ind w:left="3600" w:hanging="360"/>
+      </w:pPr>
+      <w:rPr>
+        <w:rFonts w:ascii="Symbol" w:hAnsi="Symbol" w:hint="default"/>
+        <w:sz w:val="20"/>
+      </w:rPr>
+    </w:lvl>
+    <w:lvl w:ilvl="5" w:tentative="1">
+      <w:start w:val="1"/>
+      <w:numFmt w:val="bullet"/>
+      <w:lvlText w:val=""/>
+      <w:lvlJc w:val="left"/>
+      <w:pPr>
+        <w:tabs>
+          <w:tab w:val="num" w:pos="4320"/>
+        </w:tabs>
+        <w:ind w:left="4320" w:hanging="360"/>
+      </w:pPr>
+      <w:rPr>
+        <w:rFonts w:ascii="Symbol" w:hAnsi="Symbol" w:hint="default"/>
+        <w:sz w:val="20"/>
+      </w:rPr>
+    </w:lvl>
+    <w:lvl w:ilvl="6" w:tentative="1">
+      <w:start w:val="1"/>
+      <w:numFmt w:val="bullet"/>
+      <w:lvlText w:val=""/>
+      <w:lvlJc w:val="left"/>
+      <w:pPr>
+        <w:tabs>
+          <w:tab w:val="num" w:pos="5040"/>
+        </w:tabs>
+        <w:ind w:left="5040" w:hanging="360"/>
+      </w:pPr>
+      <w:rPr>
+        <w:rFonts w:ascii="Symbol" w:hAnsi="Symbol" w:hint="default"/>
+        <w:sz w:val="20"/>
+      </w:rPr>
+    </w:lvl>
+    <w:lvl w:ilvl="7" w:tentative="1">
+      <w:start w:val="1"/>
+      <w:numFmt w:val="bullet"/>
+      <w:lvlText w:val=""/>
+      <w:lvlJc w:val="left"/>
+      <w:pPr>
+        <w:tabs>
+          <w:tab w:val="num" w:pos="5760"/>
+        </w:tabs>
+        <w:ind w:left="5760" w:hanging="360"/>
+      </w:pPr>
+      <w:rPr>
+        <w:rFonts w:ascii="Symbol" w:hAnsi="Symbol" w:hint="default"/>
+        <w:sz w:val="20"/>
+      </w:rPr>
+    </w:lvl>
+    <w:lvl w:ilvl="8" w:tentative="1">
+      <w:start w:val="1"/>
+      <w:numFmt w:val="bullet"/>
+      <w:lvlText w:val=""/>
+      <w:lvlJc w:val="left"/>
+      <w:pPr>
+        <w:tabs>
+          <w:tab w:val="num" w:pos="6480"/>
+        </w:tabs>
+        <w:ind w:left="6480" w:hanging="360"/>
+      </w:pPr>
+      <w:rPr>
+        <w:rFonts w:ascii="Symbol" w:hAnsi="Symbol" w:hint="default"/>
+        <w:sz w:val="20"/>
+      </w:rPr>
+    </w:lvl>
+  </w:abstractNum>
+  <w:abstractNum w:abstractNumId="5" w15:restartNumberingAfterBreak="0">
+    <w:nsid w:val="4BA077BA"/>
+    <w:multiLevelType w:val="multilevel"/>
+    <w:tmpl w:val="F746BF6A"/>
+    <w:lvl w:ilvl="0">
+      <w:start w:val="1"/>
+      <w:numFmt w:val="bullet"/>
+      <w:lvlText w:val=""/>
+      <w:lvlJc w:val="left"/>
+      <w:pPr>
+        <w:tabs>
+          <w:tab w:val="num" w:pos="720"/>
+        </w:tabs>
+        <w:ind w:left="720" w:hanging="360"/>
+      </w:pPr>
+      <w:rPr>
+        <w:rFonts w:ascii="Symbol" w:hAnsi="Symbol" w:hint="default"/>
+        <w:sz w:val="20"/>
+      </w:rPr>
+    </w:lvl>
+    <w:lvl w:ilvl="1">
+      <w:start w:val="1"/>
+      <w:numFmt w:val="bullet"/>
+      <w:lvlText w:val=""/>
+      <w:lvlJc w:val="left"/>
+      <w:pPr>
+        <w:tabs>
+          <w:tab w:val="num" w:pos="1440"/>
+        </w:tabs>
+        <w:ind w:left="1440" w:hanging="360"/>
+      </w:pPr>
+      <w:rPr>
+        <w:rFonts w:ascii="Symbol" w:hAnsi="Symbol" w:hint="default"/>
+        <w:sz w:val="20"/>
+      </w:rPr>
+    </w:lvl>
+    <w:lvl w:ilvl="2">
+      <w:start w:val="1"/>
+      <w:numFmt w:val="bullet"/>
+      <w:lvlText w:val=""/>
+      <w:lvlJc w:val="left"/>
+      <w:pPr>
+        <w:tabs>
+          <w:tab w:val="num" w:pos="2160"/>
+        </w:tabs>
+        <w:ind w:left="2160" w:hanging="360"/>
+      </w:pPr>
+      <w:rPr>
+        <w:rFonts w:ascii="Symbol" w:hAnsi="Symbol" w:hint="default"/>
+        <w:sz w:val="20"/>
+      </w:rPr>
+    </w:lvl>
+    <w:lvl w:ilvl="3" w:tentative="1">
+      <w:start w:val="1"/>
+      <w:numFmt w:val="bullet"/>
+      <w:lvlText w:val=""/>
+      <w:lvlJc w:val="left"/>
+      <w:pPr>
+        <w:tabs>
+          <w:tab w:val="num" w:pos="2880"/>
+        </w:tabs>
+        <w:ind w:left="2880" w:hanging="360"/>
+      </w:pPr>
+      <w:rPr>
+        <w:rFonts w:ascii="Symbol" w:hAnsi="Symbol" w:hint="default"/>
+        <w:sz w:val="20"/>
+      </w:rPr>
+    </w:lvl>
+    <w:lvl w:ilvl="4" w:tentative="1">
+      <w:start w:val="1"/>
+      <w:numFmt w:val="bullet"/>
+      <w:lvlText w:val=""/>
+      <w:lvlJc w:val="left"/>
+      <w:pPr>
+        <w:tabs>
+          <w:tab w:val="num" w:pos="3600"/>
+        </w:tabs>
+        <w:ind w:left="3600" w:hanging="360"/>
+      </w:pPr>
+      <w:rPr>
+        <w:rFonts w:ascii="Symbol" w:hAnsi="Symbol" w:hint="default"/>
+        <w:sz w:val="20"/>
+      </w:rPr>
+    </w:lvl>
+    <w:lvl w:ilvl="5" w:tentative="1">
+      <w:start w:val="1"/>
+      <w:numFmt w:val="bullet"/>
+      <w:lvlText w:val=""/>
+      <w:lvlJc w:val="left"/>
+      <w:pPr>
+        <w:tabs>
+          <w:tab w:val="num" w:pos="4320"/>
+        </w:tabs>
+        <w:ind w:left="4320" w:hanging="360"/>
+      </w:pPr>
+      <w:rPr>
+        <w:rFonts w:ascii="Symbol" w:hAnsi="Symbol" w:hint="default"/>
+        <w:sz w:val="20"/>
+      </w:rPr>
+    </w:lvl>
+    <w:lvl w:ilvl="6" w:tentative="1">
+      <w:start w:val="1"/>
+      <w:numFmt w:val="bullet"/>
+      <w:lvlText w:val=""/>
+      <w:lvlJc w:val="left"/>
+      <w:pPr>
+        <w:tabs>
+          <w:tab w:val="num" w:pos="5040"/>
+        </w:tabs>
+        <w:ind w:left="5040" w:hanging="360"/>
+      </w:pPr>
+      <w:rPr>
+        <w:rFonts w:ascii="Symbol" w:hAnsi="Symbol" w:hint="default"/>
+        <w:sz w:val="20"/>
+      </w:rPr>
+    </w:lvl>
+    <w:lvl w:ilvl="7" w:tentative="1">
+      <w:start w:val="1"/>
+      <w:numFmt w:val="bullet"/>
+      <w:lvlText w:val=""/>
+      <w:lvlJc w:val="left"/>
+      <w:pPr>
+        <w:tabs>
+          <w:tab w:val="num" w:pos="5760"/>
+        </w:tabs>
+        <w:ind w:left="5760" w:hanging="360"/>
+      </w:pPr>
+      <w:rPr>
+        <w:rFonts w:ascii="Symbol" w:hAnsi="Symbol" w:hint="default"/>
+        <w:sz w:val="20"/>
+      </w:rPr>
+    </w:lvl>
+    <w:lvl w:ilvl="8" w:tentative="1">
+      <w:start w:val="1"/>
+      <w:numFmt w:val="bullet"/>
+      <w:lvlText w:val=""/>
+      <w:lvlJc w:val="left"/>
+      <w:pPr>
+        <w:tabs>
+          <w:tab w:val="num" w:pos="6480"/>
+        </w:tabs>
+        <w:ind w:left="6480" w:hanging="360"/>
+      </w:pPr>
+      <w:rPr>
+        <w:rFonts w:ascii="Symbol" w:hAnsi="Symbol" w:hint="default"/>
+        <w:sz w:val="20"/>
+      </w:rPr>
+    </w:lvl>
+  </w:abstractNum>
+  <w:abstractNum w:abstractNumId="6" w15:restartNumberingAfterBreak="0">
     <w:nsid w:val="5F410964"/>
     <w:multiLevelType w:val="hybridMultilevel"/>
     <w:tmpl w:val="B13AA2A8"/>
@@ -1365,7 +3040,7 @@
       </w:pPr>
     </w:lvl>
   </w:abstractNum>
-  <w:abstractNum w:abstractNumId="4" w15:restartNumberingAfterBreak="0">
+  <w:abstractNum w:abstractNumId="7" w15:restartNumberingAfterBreak="0">
     <w:nsid w:val="61F834EC"/>
     <w:multiLevelType w:val="multilevel"/>
     <w:tmpl w:val="ED28DCA4"/>
@@ -1476,22 +3151,335 @@
         </w:tabs>
         <w:ind w:left="6480" w:hanging="360"/>
       </w:pPr>
+    </w:lvl>
+  </w:abstractNum>
+  <w:abstractNum w:abstractNumId="8" w15:restartNumberingAfterBreak="0">
+    <w:nsid w:val="66370FE7"/>
+    <w:multiLevelType w:val="multilevel"/>
+    <w:tmpl w:val="72FA4064"/>
+    <w:lvl w:ilvl="0">
+      <w:start w:val="1"/>
+      <w:numFmt w:val="bullet"/>
+      <w:lvlText w:val=""/>
+      <w:lvlJc w:val="left"/>
+      <w:pPr>
+        <w:tabs>
+          <w:tab w:val="num" w:pos="720"/>
+        </w:tabs>
+        <w:ind w:left="720" w:hanging="360"/>
+      </w:pPr>
+      <w:rPr>
+        <w:rFonts w:ascii="Symbol" w:hAnsi="Symbol" w:hint="default"/>
+        <w:sz w:val="20"/>
+      </w:rPr>
+    </w:lvl>
+    <w:lvl w:ilvl="1">
+      <w:start w:val="1"/>
+      <w:numFmt w:val="bullet"/>
+      <w:lvlText w:val=""/>
+      <w:lvlJc w:val="left"/>
+      <w:pPr>
+        <w:tabs>
+          <w:tab w:val="num" w:pos="1440"/>
+        </w:tabs>
+        <w:ind w:left="1440" w:hanging="360"/>
+      </w:pPr>
+      <w:rPr>
+        <w:rFonts w:ascii="Symbol" w:hAnsi="Symbol" w:hint="default"/>
+        <w:sz w:val="20"/>
+      </w:rPr>
+    </w:lvl>
+    <w:lvl w:ilvl="2" w:tentative="1">
+      <w:start w:val="1"/>
+      <w:numFmt w:val="bullet"/>
+      <w:lvlText w:val=""/>
+      <w:lvlJc w:val="left"/>
+      <w:pPr>
+        <w:tabs>
+          <w:tab w:val="num" w:pos="2160"/>
+        </w:tabs>
+        <w:ind w:left="2160" w:hanging="360"/>
+      </w:pPr>
+      <w:rPr>
+        <w:rFonts w:ascii="Symbol" w:hAnsi="Symbol" w:hint="default"/>
+        <w:sz w:val="20"/>
+      </w:rPr>
+    </w:lvl>
+    <w:lvl w:ilvl="3" w:tentative="1">
+      <w:start w:val="1"/>
+      <w:numFmt w:val="bullet"/>
+      <w:lvlText w:val=""/>
+      <w:lvlJc w:val="left"/>
+      <w:pPr>
+        <w:tabs>
+          <w:tab w:val="num" w:pos="2880"/>
+        </w:tabs>
+        <w:ind w:left="2880" w:hanging="360"/>
+      </w:pPr>
+      <w:rPr>
+        <w:rFonts w:ascii="Symbol" w:hAnsi="Symbol" w:hint="default"/>
+        <w:sz w:val="20"/>
+      </w:rPr>
+    </w:lvl>
+    <w:lvl w:ilvl="4" w:tentative="1">
+      <w:start w:val="1"/>
+      <w:numFmt w:val="bullet"/>
+      <w:lvlText w:val=""/>
+      <w:lvlJc w:val="left"/>
+      <w:pPr>
+        <w:tabs>
+          <w:tab w:val="num" w:pos="3600"/>
+        </w:tabs>
+        <w:ind w:left="3600" w:hanging="360"/>
+      </w:pPr>
+      <w:rPr>
+        <w:rFonts w:ascii="Symbol" w:hAnsi="Symbol" w:hint="default"/>
+        <w:sz w:val="20"/>
+      </w:rPr>
+    </w:lvl>
+    <w:lvl w:ilvl="5" w:tentative="1">
+      <w:start w:val="1"/>
+      <w:numFmt w:val="bullet"/>
+      <w:lvlText w:val=""/>
+      <w:lvlJc w:val="left"/>
+      <w:pPr>
+        <w:tabs>
+          <w:tab w:val="num" w:pos="4320"/>
+        </w:tabs>
+        <w:ind w:left="4320" w:hanging="360"/>
+      </w:pPr>
+      <w:rPr>
+        <w:rFonts w:ascii="Symbol" w:hAnsi="Symbol" w:hint="default"/>
+        <w:sz w:val="20"/>
+      </w:rPr>
+    </w:lvl>
+    <w:lvl w:ilvl="6" w:tentative="1">
+      <w:start w:val="1"/>
+      <w:numFmt w:val="bullet"/>
+      <w:lvlText w:val=""/>
+      <w:lvlJc w:val="left"/>
+      <w:pPr>
+        <w:tabs>
+          <w:tab w:val="num" w:pos="5040"/>
+        </w:tabs>
+        <w:ind w:left="5040" w:hanging="360"/>
+      </w:pPr>
+      <w:rPr>
+        <w:rFonts w:ascii="Symbol" w:hAnsi="Symbol" w:hint="default"/>
+        <w:sz w:val="20"/>
+      </w:rPr>
+    </w:lvl>
+    <w:lvl w:ilvl="7" w:tentative="1">
+      <w:start w:val="1"/>
+      <w:numFmt w:val="bullet"/>
+      <w:lvlText w:val=""/>
+      <w:lvlJc w:val="left"/>
+      <w:pPr>
+        <w:tabs>
+          <w:tab w:val="num" w:pos="5760"/>
+        </w:tabs>
+        <w:ind w:left="5760" w:hanging="360"/>
+      </w:pPr>
+      <w:rPr>
+        <w:rFonts w:ascii="Symbol" w:hAnsi="Symbol" w:hint="default"/>
+        <w:sz w:val="20"/>
+      </w:rPr>
+    </w:lvl>
+    <w:lvl w:ilvl="8" w:tentative="1">
+      <w:start w:val="1"/>
+      <w:numFmt w:val="bullet"/>
+      <w:lvlText w:val=""/>
+      <w:lvlJc w:val="left"/>
+      <w:pPr>
+        <w:tabs>
+          <w:tab w:val="num" w:pos="6480"/>
+        </w:tabs>
+        <w:ind w:left="6480" w:hanging="360"/>
+      </w:pPr>
+      <w:rPr>
+        <w:rFonts w:ascii="Symbol" w:hAnsi="Symbol" w:hint="default"/>
+        <w:sz w:val="20"/>
+      </w:rPr>
+    </w:lvl>
+  </w:abstractNum>
+  <w:abstractNum w:abstractNumId="9" w15:restartNumberingAfterBreak="0">
+    <w:nsid w:val="76600C69"/>
+    <w:multiLevelType w:val="multilevel"/>
+    <w:tmpl w:val="7E3C51FA"/>
+    <w:lvl w:ilvl="0">
+      <w:start w:val="1"/>
+      <w:numFmt w:val="bullet"/>
+      <w:lvlText w:val=""/>
+      <w:lvlJc w:val="left"/>
+      <w:pPr>
+        <w:tabs>
+          <w:tab w:val="num" w:pos="720"/>
+        </w:tabs>
+        <w:ind w:left="720" w:hanging="360"/>
+      </w:pPr>
+      <w:rPr>
+        <w:rFonts w:ascii="Symbol" w:hAnsi="Symbol" w:hint="default"/>
+        <w:sz w:val="20"/>
+      </w:rPr>
+    </w:lvl>
+    <w:lvl w:ilvl="1">
+      <w:start w:val="1"/>
+      <w:numFmt w:val="bullet"/>
+      <w:lvlText w:val=""/>
+      <w:lvlJc w:val="left"/>
+      <w:pPr>
+        <w:tabs>
+          <w:tab w:val="num" w:pos="1440"/>
+        </w:tabs>
+        <w:ind w:left="1440" w:hanging="360"/>
+      </w:pPr>
+      <w:rPr>
+        <w:rFonts w:ascii="Symbol" w:hAnsi="Symbol" w:hint="default"/>
+        <w:sz w:val="20"/>
+      </w:rPr>
+    </w:lvl>
+    <w:lvl w:ilvl="2" w:tentative="1">
+      <w:start w:val="1"/>
+      <w:numFmt w:val="bullet"/>
+      <w:lvlText w:val=""/>
+      <w:lvlJc w:val="left"/>
+      <w:pPr>
+        <w:tabs>
+          <w:tab w:val="num" w:pos="2160"/>
+        </w:tabs>
+        <w:ind w:left="2160" w:hanging="360"/>
+      </w:pPr>
+      <w:rPr>
+        <w:rFonts w:ascii="Symbol" w:hAnsi="Symbol" w:hint="default"/>
+        <w:sz w:val="20"/>
+      </w:rPr>
+    </w:lvl>
+    <w:lvl w:ilvl="3" w:tentative="1">
+      <w:start w:val="1"/>
+      <w:numFmt w:val="bullet"/>
+      <w:lvlText w:val=""/>
+      <w:lvlJc w:val="left"/>
+      <w:pPr>
+        <w:tabs>
+          <w:tab w:val="num" w:pos="2880"/>
+        </w:tabs>
+        <w:ind w:left="2880" w:hanging="360"/>
+      </w:pPr>
+      <w:rPr>
+        <w:rFonts w:ascii="Symbol" w:hAnsi="Symbol" w:hint="default"/>
+        <w:sz w:val="20"/>
+      </w:rPr>
+    </w:lvl>
+    <w:lvl w:ilvl="4" w:tentative="1">
+      <w:start w:val="1"/>
+      <w:numFmt w:val="bullet"/>
+      <w:lvlText w:val=""/>
+      <w:lvlJc w:val="left"/>
+      <w:pPr>
+        <w:tabs>
+          <w:tab w:val="num" w:pos="3600"/>
+        </w:tabs>
+        <w:ind w:left="3600" w:hanging="360"/>
+      </w:pPr>
+      <w:rPr>
+        <w:rFonts w:ascii="Symbol" w:hAnsi="Symbol" w:hint="default"/>
+        <w:sz w:val="20"/>
+      </w:rPr>
+    </w:lvl>
+    <w:lvl w:ilvl="5" w:tentative="1">
+      <w:start w:val="1"/>
+      <w:numFmt w:val="bullet"/>
+      <w:lvlText w:val=""/>
+      <w:lvlJc w:val="left"/>
+      <w:pPr>
+        <w:tabs>
+          <w:tab w:val="num" w:pos="4320"/>
+        </w:tabs>
+        <w:ind w:left="4320" w:hanging="360"/>
+      </w:pPr>
+      <w:rPr>
+        <w:rFonts w:ascii="Symbol" w:hAnsi="Symbol" w:hint="default"/>
+        <w:sz w:val="20"/>
+      </w:rPr>
+    </w:lvl>
+    <w:lvl w:ilvl="6" w:tentative="1">
+      <w:start w:val="1"/>
+      <w:numFmt w:val="bullet"/>
+      <w:lvlText w:val=""/>
+      <w:lvlJc w:val="left"/>
+      <w:pPr>
+        <w:tabs>
+          <w:tab w:val="num" w:pos="5040"/>
+        </w:tabs>
+        <w:ind w:left="5040" w:hanging="360"/>
+      </w:pPr>
+      <w:rPr>
+        <w:rFonts w:ascii="Symbol" w:hAnsi="Symbol" w:hint="default"/>
+        <w:sz w:val="20"/>
+      </w:rPr>
+    </w:lvl>
+    <w:lvl w:ilvl="7" w:tentative="1">
+      <w:start w:val="1"/>
+      <w:numFmt w:val="bullet"/>
+      <w:lvlText w:val=""/>
+      <w:lvlJc w:val="left"/>
+      <w:pPr>
+        <w:tabs>
+          <w:tab w:val="num" w:pos="5760"/>
+        </w:tabs>
+        <w:ind w:left="5760" w:hanging="360"/>
+      </w:pPr>
+      <w:rPr>
+        <w:rFonts w:ascii="Symbol" w:hAnsi="Symbol" w:hint="default"/>
+        <w:sz w:val="20"/>
+      </w:rPr>
+    </w:lvl>
+    <w:lvl w:ilvl="8" w:tentative="1">
+      <w:start w:val="1"/>
+      <w:numFmt w:val="bullet"/>
+      <w:lvlText w:val=""/>
+      <w:lvlJc w:val="left"/>
+      <w:pPr>
+        <w:tabs>
+          <w:tab w:val="num" w:pos="6480"/>
+        </w:tabs>
+        <w:ind w:left="6480" w:hanging="360"/>
+      </w:pPr>
+      <w:rPr>
+        <w:rFonts w:ascii="Symbol" w:hAnsi="Symbol" w:hint="default"/>
+        <w:sz w:val="20"/>
+      </w:rPr>
     </w:lvl>
   </w:abstractNum>
   <w:num w:numId="1">
     <w:abstractNumId w:val="1"/>
   </w:num>
   <w:num w:numId="2">
-    <w:abstractNumId w:val="2"/>
+    <w:abstractNumId w:val="3"/>
   </w:num>
   <w:num w:numId="3">
-    <w:abstractNumId w:val="4"/>
+    <w:abstractNumId w:val="7"/>
   </w:num>
   <w:num w:numId="4">
     <w:abstractNumId w:val="0"/>
   </w:num>
   <w:num w:numId="5">
-    <w:abstractNumId w:val="3"/>
+    <w:abstractNumId w:val="6"/>
+  </w:num>
+  <w:num w:numId="6">
+    <w:abstractNumId w:val="9"/>
+  </w:num>
+  <w:num w:numId="7">
+    <w:abstractNumId w:val="2"/>
+  </w:num>
+  <w:num w:numId="8">
+    <w:abstractNumId w:val="4"/>
+  </w:num>
+  <w:num w:numId="9">
+    <w:abstractNumId w:val="5"/>
+  </w:num>
+  <w:num w:numId="10">
+    <w:abstractNumId w:val="8"/>
   </w:num>
 </w:numbering>
 </file>
@@ -1889,7 +3877,7 @@
   <w:style w:type="paragraph" w:default="1" w:styleId="Normal">
     <w:name w:val="Normal"/>
     <w:qFormat/>
-    <w:rsid w:val="007B743F"/>
+    <w:rsid w:val="00DF68FB"/>
   </w:style>
   <w:style w:type="paragraph" w:styleId="Heading1">
     <w:name w:val="heading 1"/>

</xml_diff>

<commit_message>
Security Changes: Admin API Key, Registration_PSK, Device-Gateway Encryption.
</commit_message>
<xml_diff>
--- a/Walkthrough.docx
+++ b/Walkthrough.docx
@@ -99,74 +99,6 @@
       </w:r>
     </w:p>
     <w:p>
-      <w:pPr>
-        <w:rPr>
-          <w:color w:val="00B050"/>
-        </w:rPr>
-      </w:pPr>
-      <w:r>
-        <w:rPr>
-          <w:color w:val="00B050"/>
-        </w:rPr>
-        <w:br/>
-      </w:r>
-      <w:r>
-        <w:rPr>
-          <w:highlight w:val="yellow"/>
-        </w:rPr>
-        <w:t># Kill the Node process inside WSL</w:t>
-      </w:r>
-      <w:bookmarkStart w:id="0" w:name="_GoBack"/>
-      <w:bookmarkEnd w:id="0"/>
-    </w:p>
-    <w:p>
-      <w:pPr>
-        <w:rPr>
-          <w:color w:val="00B050"/>
-        </w:rPr>
-      </w:pPr>
-      <w:r>
-        <w:rPr>
-          <w:color w:val="00B050"/>
-        </w:rPr>
-        <w:t>wsl -- bash -c "pkill -f 'node src/app.js'"</w:t>
-      </w:r>
-    </w:p>
-    <w:p>
-      <w:r>
-        <w:rPr>
-          <w:highlight w:val="yellow"/>
-        </w:rPr>
-        <w:t># Kill by PID on the listening port (in Windows Powershell)</w:t>
-      </w:r>
-    </w:p>
-    <w:p>
-      <w:pPr>
-        <w:rPr>
-          <w:color w:val="00B050"/>
-        </w:rPr>
-      </w:pPr>
-      <w:r>
-        <w:rPr>
-          <w:color w:val="00B050"/>
-        </w:rPr>
-        <w:t>$pid = (Get-NetTCPConnection -LocalPort 3000 -State Listen -ErrorAction SilentlyContinue).OwningProcess</w:t>
-      </w:r>
-    </w:p>
-    <w:p>
-      <w:pPr>
-        <w:rPr>
-          <w:color w:val="00B050"/>
-        </w:rPr>
-      </w:pPr>
-      <w:r>
-        <w:rPr>
-          <w:color w:val="00B050"/>
-        </w:rPr>
-        <w:t>if ($pid) { Stop-Process -Id $pid -Force; Write-Host "Killed PID $pid" } else { Write-Host "Nothing listening on :3000" }</w:t>
-      </w:r>
-    </w:p>
-    <w:p>
       <w:r>
         <w:pict>
           <v:rect id="_x0000_i1026" style="width:386.75pt;height:.75pt" o:hrpct="0" o:hralign="center" o:hrstd="t" o:hr="t" fillcolor="#a0a0a0" stroked="f"/>
@@ -343,134 +275,134 @@
           <w:b/>
           <w:bCs/>
         </w:rPr>
+        <w:t>Step 4 — Start the Backend Server</w:t>
+      </w:r>
+    </w:p>
+    <w:p>
+      <w:pPr>
+        <w:rPr>
+          <w:bCs/>
+        </w:rPr>
+      </w:pPr>
+      <w:r>
+        <w:rPr>
+          <w:bCs/>
+          <w:highlight w:val="yellow"/>
+        </w:rPr>
+        <w:t>Windows Backend (from root</w:t>
+      </w:r>
+      <w:r>
+        <w:rPr>
+          <w:bCs/>
+          <w:highlight w:val="yellow"/>
+        </w:rPr>
+        <w:t xml:space="preserve"> AuthApp</w:t>
+      </w:r>
+      <w:r>
+        <w:rPr>
+          <w:bCs/>
+          <w:highlight w:val="yellow"/>
+        </w:rPr>
+        <w:t>):</w:t>
+      </w:r>
+    </w:p>
+    <w:p>
+      <w:pPr>
+        <w:rPr>
+          <w:b/>
+          <w:bCs/>
+        </w:rPr>
+      </w:pPr>
+      <w:r>
+        <w:rPr>
+          <w:b/>
+          <w:bCs/>
+        </w:rPr>
+        <w:t>Org 1</w:t>
+      </w:r>
+      <w:r>
+        <w:rPr>
+          <w:b/>
+          <w:bCs/>
+        </w:rPr>
+        <w:t>:</w:t>
+      </w:r>
+    </w:p>
+    <w:p>
+      <w:pPr>
+        <w:rPr>
+          <w:bCs/>
+          <w:color w:val="00B050"/>
+        </w:rPr>
+      </w:pPr>
+      <w:r>
+        <w:rPr>
+          <w:bCs/>
+          <w:color w:val="00B050"/>
+        </w:rPr>
+        <w:t>powershell -NoProfile -ExecutionPolicy Bypass -File .\backend\startGateway.ps1</w:t>
+      </w:r>
+    </w:p>
+    <w:p>
+      <w:pPr>
+        <w:rPr>
+          <w:b/>
+          <w:bCs/>
+        </w:rPr>
+      </w:pPr>
+      <w:r>
+        <w:rPr>
+          <w:b/>
+          <w:bCs/>
+        </w:rPr>
+        <w:t>Org 2</w:t>
+      </w:r>
+      <w:r>
+        <w:rPr>
+          <w:b/>
+          <w:bCs/>
+        </w:rPr>
+        <w:t>:</w:t>
+      </w:r>
+    </w:p>
+    <w:p>
+      <w:pPr>
+        <w:rPr>
+          <w:bCs/>
+          <w:color w:val="00B050"/>
+        </w:rPr>
+      </w:pPr>
+      <w:r>
+        <w:rPr>
+          <w:bCs/>
+          <w:color w:val="00B050"/>
+        </w:rPr>
+        <w:t>powershell -NoProfile -ExecutionPolicy Bypass -File .\backend\startGateway.ps1</w:t>
+      </w:r>
+      <w:r>
+        <w:t xml:space="preserve"> </w:t>
+      </w:r>
+      <w:r>
+        <w:rPr>
+          <w:bCs/>
+          <w:color w:val="00B050"/>
+        </w:rPr>
+        <w:t>-Org org2</w:t>
+      </w:r>
+    </w:p>
+    <w:p>
+      <w:pPr>
+        <w:rPr>
+          <w:bCs/>
+          <w:color w:val="00B050"/>
+        </w:rPr>
+      </w:pPr>
+      <w:r>
+        <w:rPr>
+          <w:b/>
+          <w:bCs/>
+        </w:rPr>
         <w:lastRenderedPageBreak/>
-        <w:t>Step 4 — Start the Backend Server</w:t>
-      </w:r>
-    </w:p>
-    <w:p>
-      <w:pPr>
-        <w:rPr>
-          <w:bCs/>
-        </w:rPr>
-      </w:pPr>
-      <w:r>
-        <w:rPr>
-          <w:bCs/>
-          <w:highlight w:val="yellow"/>
-        </w:rPr>
-        <w:t>Windows Backend (from root</w:t>
-      </w:r>
-      <w:r>
-        <w:rPr>
-          <w:bCs/>
-          <w:highlight w:val="yellow"/>
-        </w:rPr>
-        <w:t xml:space="preserve"> AuthApp</w:t>
-      </w:r>
-      <w:r>
-        <w:rPr>
-          <w:bCs/>
-          <w:highlight w:val="yellow"/>
-        </w:rPr>
-        <w:t>):</w:t>
-      </w:r>
-    </w:p>
-    <w:p>
-      <w:pPr>
-        <w:rPr>
-          <w:b/>
-          <w:bCs/>
-        </w:rPr>
-      </w:pPr>
-      <w:r>
-        <w:rPr>
-          <w:b/>
-          <w:bCs/>
-        </w:rPr>
-        <w:t>Org 1</w:t>
-      </w:r>
-      <w:r>
-        <w:rPr>
-          <w:b/>
-          <w:bCs/>
-        </w:rPr>
-        <w:t>:</w:t>
-      </w:r>
-    </w:p>
-    <w:p>
-      <w:pPr>
-        <w:rPr>
-          <w:bCs/>
-          <w:color w:val="00B050"/>
-        </w:rPr>
-      </w:pPr>
-      <w:r>
-        <w:rPr>
-          <w:bCs/>
-          <w:color w:val="00B050"/>
-        </w:rPr>
-        <w:t>powershell -NoProfile -ExecutionPolicy Bypass -File .\backend\startGateway.ps1</w:t>
-      </w:r>
-    </w:p>
-    <w:p>
-      <w:pPr>
-        <w:rPr>
-          <w:b/>
-          <w:bCs/>
-        </w:rPr>
-      </w:pPr>
-      <w:r>
-        <w:rPr>
-          <w:b/>
-          <w:bCs/>
-        </w:rPr>
-        <w:t>Org 2</w:t>
-      </w:r>
-      <w:r>
-        <w:rPr>
-          <w:b/>
-          <w:bCs/>
-        </w:rPr>
-        <w:t>:</w:t>
-      </w:r>
-    </w:p>
-    <w:p>
-      <w:pPr>
-        <w:rPr>
-          <w:bCs/>
-          <w:color w:val="00B050"/>
-        </w:rPr>
-      </w:pPr>
-      <w:r>
-        <w:rPr>
-          <w:bCs/>
-          <w:color w:val="00B050"/>
-        </w:rPr>
-        <w:t>powershell -NoProfile -ExecutionPolicy Bypass -File .\backend\startGateway.ps1</w:t>
-      </w:r>
-      <w:r>
-        <w:t xml:space="preserve"> </w:t>
-      </w:r>
-      <w:r>
-        <w:rPr>
-          <w:bCs/>
-          <w:color w:val="00B050"/>
-        </w:rPr>
-        <w:t>-Org org2</w:t>
-      </w:r>
-    </w:p>
-    <w:p>
-      <w:pPr>
-        <w:rPr>
-          <w:bCs/>
-          <w:color w:val="00B050"/>
-        </w:rPr>
-      </w:pPr>
-      <w:r>
-        <w:rPr>
-          <w:b/>
-          <w:bCs/>
-        </w:rPr>
         <w:t>Start both orgs backends:</w:t>
       </w:r>
       <w:r>
@@ -878,7 +810,6 @@
         <w:rPr>
           <w:color w:val="00B050"/>
         </w:rPr>
-        <w:lastRenderedPageBreak/>
         <w:br/>
       </w:r>
       <w:r>
@@ -972,6 +903,7 @@
         </w:numPr>
       </w:pPr>
       <w:r>
+        <w:lastRenderedPageBreak/>
         <w:t xml:space="preserve">Run </w:t>
       </w:r>
       <w:r>
@@ -1160,7 +1092,6 @@
     </w:p>
     <w:p>
       <w:r>
-        <w:lastRenderedPageBreak/>
         <w:t>true</w:t>
       </w:r>
     </w:p>
@@ -1187,7 +1118,18 @@
       </w:r>
     </w:p>
     <w:p>
-      <w:r>
+      <w:pPr>
+        <w:rPr>
+          <w:b/>
+          <w:color w:val="0070C0"/>
+        </w:rPr>
+      </w:pPr>
+      <w:r>
+        <w:rPr>
+          <w:b/>
+          <w:color w:val="0070C0"/>
+          <w:highlight w:val="yellow"/>
+        </w:rPr>
         <w:t>To stop everything:</w:t>
       </w:r>
     </w:p>
@@ -1214,6 +1156,7 @@
         <w:rPr>
           <w:highlight w:val="yellow"/>
         </w:rPr>
+        <w:lastRenderedPageBreak/>
         <w:t>Fabric down:</w:t>
       </w:r>
     </w:p>
@@ -1261,882 +1204,9 @@
         </w:rPr>
         <w:t>docker exec -it peer0.org1.example.com peer channel getinfo -c mychannel</w:t>
       </w:r>
-    </w:p>
-    <w:p/>
-    <w:p/>
-    <w:p/>
-    <w:p/>
-    <w:p/>
-    <w:p/>
-    <w:p/>
-    <w:p/>
-    <w:p/>
-    <w:p/>
-    <w:p/>
-    <w:p/>
-    <w:p/>
-    <w:p/>
-    <w:p/>
-    <w:p/>
-    <w:p/>
-    <w:p/>
-    <w:p/>
-    <w:p/>
-    <w:p/>
-    <w:p/>
-    <w:p/>
-    <w:p/>
-    <w:p/>
-    <w:p/>
-    <w:p>
-      <w:pPr>
-        <w:rPr>
-          <w:b/>
-          <w:sz w:val="28"/>
-          <w:szCs w:val="28"/>
-          <w:u w:val="single"/>
-        </w:rPr>
-      </w:pPr>
-      <w:r>
-        <w:rPr>
-          <w:b/>
-          <w:sz w:val="28"/>
-          <w:szCs w:val="28"/>
-          <w:u w:val="single"/>
-        </w:rPr>
-        <w:t>Presentation</w:t>
-      </w:r>
-      <w:r>
-        <w:rPr>
-          <w:b/>
-          <w:sz w:val="28"/>
-          <w:szCs w:val="28"/>
-          <w:u w:val="single"/>
-        </w:rPr>
-        <w:t>:</w:t>
-      </w:r>
-    </w:p>
-    <w:p>
-      <w:pPr>
-        <w:rPr>
-          <w:b/>
-          <w:bCs/>
-        </w:rPr>
-      </w:pPr>
-      <w:r>
-        <w:rPr>
-          <w:b/>
-          <w:bCs/>
-        </w:rPr>
-        <w:t>1. Introduction &amp; Problem (1 min)</w:t>
-      </w:r>
-    </w:p>
-    <w:p>
-      <w:r>
-        <w:rPr>
-          <w:b/>
-          <w:bCs/>
-        </w:rPr>
-        <w:t>Action:</w:t>
-      </w:r>
-      <w:r>
-        <w:t> Have the document open at the </w:t>
-      </w:r>
-      <w:r>
-        <w:rPr>
-          <w:b/>
-          <w:bCs/>
-        </w:rPr>
-        <w:t>Title and Abstract</w:t>
-      </w:r>
-      <w:r>
-        <w:t>. </w:t>
-      </w:r>
-      <w:r>
-        <w:rPr>
-          <w:b/>
-          <w:bCs/>
-        </w:rPr>
-        <w:t>Goal:</w:t>
-      </w:r>
-      <w:r>
-        <w:t> Hook the audience, define the exact problem, and explain why it matters.</w:t>
-      </w:r>
-    </w:p>
-    <w:p>
-      <w:pPr>
-        <w:numPr>
-          <w:ilvl w:val="0"/>
-          <w:numId w:val="6"/>
-        </w:numPr>
-      </w:pPr>
-      <w:r>
-        <w:rPr>
-          <w:b/>
-          <w:bCs/>
-        </w:rPr>
-        <w:t>The IoT Authentication Problem (Section 1.1)</w:t>
-      </w:r>
-    </w:p>
-    <w:p>
-      <w:pPr>
-        <w:numPr>
-          <w:ilvl w:val="1"/>
-          <w:numId w:val="6"/>
-        </w:numPr>
-      </w:pPr>
-      <w:r>
-        <w:rPr>
-          <w:b/>
-          <w:bCs/>
-        </w:rPr>
-        <w:t>What problem are you solving?</w:t>
-      </w:r>
-      <w:r>
-        <w:t> We are securing IoT devices (sensors, smart homes, industrial) by fixing how they authenticate.</w:t>
-      </w:r>
-    </w:p>
-    <w:p>
-      <w:pPr>
-        <w:numPr>
-          <w:ilvl w:val="1"/>
-          <w:numId w:val="6"/>
-        </w:numPr>
-      </w:pPr>
-      <w:r>
-        <w:rPr>
-          <w:b/>
-          <w:bCs/>
-        </w:rPr>
-        <w:t>Why is it important?</w:t>
-      </w:r>
-      <w:r>
-        <w:t> The current standard relies on centralized servers. If that server goes down (or is attacked via DDoS), the entire fleet of devices goes offline.</w:t>
-      </w:r>
-    </w:p>
-    <w:p>
-      <w:pPr>
-        <w:numPr>
-          <w:ilvl w:val="1"/>
-          <w:numId w:val="6"/>
-        </w:numPr>
-      </w:pPr>
-      <w:r>
-        <w:rPr>
-          <w:b/>
-          <w:bCs/>
-        </w:rPr>
-        <w:t>The Vulnerability:</w:t>
-      </w:r>
-      <w:r>
-        <w:t> Centralized databases are a single point of failure and a massive target for identity spoofing.</w:t>
-      </w:r>
-    </w:p>
-    <w:p>
-      <w:r>
-        <w:pict>
-          <v:rect id="_x0000_i1033" style="width:9in;height:.75pt" o:hrpct="0" o:hralign="center" o:hrstd="t" o:hr="t" fillcolor="#a0a0a0" stroked="f"/>
-        </w:pict>
-      </w:r>
-    </w:p>
-    <w:p>
-      <w:pPr>
-        <w:rPr>
-          <w:b/>
-          <w:bCs/>
-        </w:rPr>
-      </w:pPr>
-      <w:r>
-        <w:rPr>
-          <w:b/>
-          <w:bCs/>
-        </w:rPr>
-        <w:t>2. Motivation &amp; Related Work (1 min)</w:t>
-      </w:r>
-    </w:p>
-    <w:p>
-      <w:r>
-        <w:rPr>
-          <w:b/>
-          <w:bCs/>
-        </w:rPr>
-        <w:t>Action:</w:t>
-      </w:r>
-      <w:r>
-        <w:t> Scroll briefly to </w:t>
-      </w:r>
-      <w:r>
-        <w:rPr>
-          <w:b/>
-          <w:bCs/>
-        </w:rPr>
-        <w:t>Section 1.2 (Motivation)</w:t>
-      </w:r>
-      <w:r>
-        <w:t> or </w:t>
-      </w:r>
-      <w:r>
-        <w:rPr>
-          <w:b/>
-          <w:bCs/>
-        </w:rPr>
-        <w:t>Section 2.1 (Existing Solutions)</w:t>
-      </w:r>
-      <w:r>
-        <w:t>. </w:t>
-      </w:r>
-      <w:r>
-        <w:rPr>
-          <w:b/>
-          <w:bCs/>
-        </w:rPr>
-        <w:t>Goal:</w:t>
-      </w:r>
-      <w:r>
-        <w:t> Show what exists and why your approach is needed.</w:t>
-      </w:r>
-    </w:p>
-    <w:p>
-      <w:pPr>
-        <w:numPr>
-          <w:ilvl w:val="0"/>
-          <w:numId w:val="7"/>
-        </w:numPr>
-      </w:pPr>
-      <w:r>
-        <w:rPr>
-          <w:b/>
-          <w:bCs/>
-        </w:rPr>
-        <w:t>Why Current Solutions are Insufficient</w:t>
-      </w:r>
-    </w:p>
-    <w:p>
-      <w:pPr>
-        <w:numPr>
-          <w:ilvl w:val="1"/>
-          <w:numId w:val="7"/>
-        </w:numPr>
-      </w:pPr>
-      <w:r>
-        <w:rPr>
-          <w:b/>
-          <w:bCs/>
-        </w:rPr>
-        <w:t>What already exists?</w:t>
-      </w:r>
-      <w:r>
-        <w:t> Centralized credential servers and traditional heavy public blockchains (like Ethereum).</w:t>
-      </w:r>
-    </w:p>
-    <w:p>
-      <w:pPr>
-        <w:numPr>
-          <w:ilvl w:val="1"/>
-          <w:numId w:val="7"/>
-        </w:numPr>
-      </w:pPr>
-      <w:r>
-        <w:rPr>
-          <w:b/>
-          <w:bCs/>
-        </w:rPr>
-        <w:t>Why is it insufficient?</w:t>
-      </w:r>
-      <w:r>
-        <w:t> Centralized servers are fragile at the edge (where connectivity drops). Public blockchains are too slow and consume too much energy for lightweight IoT sensors.</w:t>
-      </w:r>
-    </w:p>
-    <w:p>
-      <w:pPr>
-        <w:numPr>
-          <w:ilvl w:val="1"/>
-          <w:numId w:val="7"/>
-        </w:numPr>
-      </w:pPr>
-      <w:r>
-        <w:rPr>
-          <w:b/>
-          <w:bCs/>
-        </w:rPr>
-        <w:t>The Gap:</w:t>
-      </w:r>
-      <w:r>
-        <w:t> We need a system that offers the security of a blockchain without requiring the edge devices to do the heavy crypto-mining.</w:t>
-      </w:r>
-    </w:p>
-    <w:p>
-      <w:r>
-        <w:pict>
-          <v:rect id="_x0000_i1034" style="width:9in;height:.75pt" o:hrpct="0" o:hralign="center" o:hrstd="t" o:hr="t" fillcolor="#a0a0a0" stroked="f"/>
-        </w:pict>
-      </w:r>
-    </w:p>
-    <w:p>
-      <w:pPr>
-        <w:rPr>
-          <w:b/>
-          <w:bCs/>
-        </w:rPr>
-      </w:pPr>
-      <w:r>
-        <w:rPr>
-          <w:b/>
-          <w:bCs/>
-        </w:rPr>
-        <w:t>3. Proposed Solution / Methodology (2.5 min)</w:t>
-      </w:r>
-    </w:p>
-    <w:p>
-      <w:r>
-        <w:rPr>
-          <w:b/>
-          <w:bCs/>
-        </w:rPr>
-        <w:t>Action:</w:t>
-      </w:r>
-      <w:r>
-        <w:t> Scroll to </w:t>
-      </w:r>
-      <w:r>
-        <w:rPr>
-          <w:b/>
-          <w:bCs/>
-        </w:rPr>
-        <w:t>Figure 1 (Architecture)</w:t>
-      </w:r>
-      <w:r>
-        <w:t> and then to </w:t>
-      </w:r>
-      <w:r>
-        <w:rPr>
-          <w:b/>
-          <w:bCs/>
-        </w:rPr>
-        <w:t>Figure 7 (Sequence Diagram)</w:t>
-      </w:r>
-      <w:r>
-        <w:t>. </w:t>
-      </w:r>
-      <w:r>
-        <w:rPr>
-          <w:b/>
-          <w:bCs/>
-        </w:rPr>
-        <w:t>Goal:</w:t>
-      </w:r>
-      <w:r>
-        <w:t> Explain your architecture, technologies, and design decisions clearly by pointing at the diagrams.</w:t>
-      </w:r>
-    </w:p>
-    <w:p>
-      <w:pPr>
-        <w:numPr>
-          <w:ilvl w:val="0"/>
-          <w:numId w:val="8"/>
-        </w:numPr>
-      </w:pPr>
-      <w:r>
-        <w:rPr>
-          <w:b/>
-          <w:bCs/>
-        </w:rPr>
-        <w:lastRenderedPageBreak/>
-        <w:t>The Architecture &amp; Innovation (Show Figure 1)</w:t>
-      </w:r>
-    </w:p>
-    <w:p>
-      <w:pPr>
-        <w:numPr>
-          <w:ilvl w:val="1"/>
-          <w:numId w:val="8"/>
-        </w:numPr>
-      </w:pPr>
-      <w:r>
-        <w:rPr>
-          <w:b/>
-          <w:bCs/>
-        </w:rPr>
-        <w:t>What is innovative?</w:t>
-      </w:r>
-      <w:r>
-        <w:t> A 4-layer hybrid architecture that completely offloads blockchain consensus away from the weak edge devices.</w:t>
-      </w:r>
-    </w:p>
-    <w:p>
-      <w:pPr>
-        <w:numPr>
-          <w:ilvl w:val="1"/>
-          <w:numId w:val="8"/>
-        </w:numPr>
-      </w:pPr>
-      <w:r>
-        <w:rPr>
-          <w:b/>
-          <w:bCs/>
-        </w:rPr>
-        <w:t>Technologies:</w:t>
-      </w:r>
-      <w:r>
-        <w:t> Hyperledger Fabric (permissioned, fast), Node.js middleware, React dashboard.</w:t>
-      </w:r>
-    </w:p>
-    <w:p>
-      <w:pPr>
-        <w:numPr>
-          <w:ilvl w:val="1"/>
-          <w:numId w:val="8"/>
-        </w:numPr>
-      </w:pPr>
-      <w:r>
-        <w:rPr>
-          <w:b/>
-          <w:bCs/>
-        </w:rPr>
-        <w:t>Design Decision:</w:t>
-      </w:r>
-      <w:r>
-        <w:t> We use a dual-protocol gateway. Legacy devices can use HTTP/TCP, while modern constrained devices use lightweight CoAP/UDP.</w:t>
-      </w:r>
-    </w:p>
-    <w:p>
-      <w:pPr>
-        <w:numPr>
-          <w:ilvl w:val="0"/>
-          <w:numId w:val="8"/>
-        </w:numPr>
-      </w:pPr>
-      <w:r>
-        <w:rPr>
-          <w:b/>
-          <w:bCs/>
-        </w:rPr>
-        <w:t>The Workflow &amp; State Machine (Section 3.2)</w:t>
-      </w:r>
-    </w:p>
-    <w:p>
-      <w:pPr>
-        <w:numPr>
-          <w:ilvl w:val="1"/>
-          <w:numId w:val="8"/>
-        </w:numPr>
-      </w:pPr>
-      <w:r>
-        <w:rPr>
-          <w:b/>
-          <w:bCs/>
-        </w:rPr>
-        <w:t>Explanation:</w:t>
-      </w:r>
-      <w:r>
-        <w:t> The Hyperledger Smart Contract (DeviceAuthContract) mathematically enforces a 4-state lifecycle (Registered → Active → Suspended → Revoked) directly on-chain.</w:t>
-      </w:r>
-    </w:p>
-    <w:p>
-      <w:pPr>
-        <w:numPr>
-          <w:ilvl w:val="0"/>
-          <w:numId w:val="8"/>
-        </w:numPr>
-      </w:pPr>
-      <w:r>
-        <w:rPr>
-          <w:b/>
-          <w:bCs/>
-        </w:rPr>
-        <w:t>Challenge-Response Protocol (Show Figure 7)</w:t>
-      </w:r>
-    </w:p>
-    <w:p>
-      <w:pPr>
-        <w:numPr>
-          <w:ilvl w:val="1"/>
-          <w:numId w:val="8"/>
-        </w:numPr>
-      </w:pPr>
-      <w:r>
-        <w:rPr>
-          <w:b/>
-          <w:bCs/>
-        </w:rPr>
-        <w:t>Why trust it?</w:t>
-      </w:r>
-      <w:r>
-        <w:t> Walk them through the sequence diagram. Private keys never leave the IoT device. The gateway issues a random nonce (challenge), the device signs it using ECDSA secp256r1, and Fabric verifies the signature on-chain.</w:t>
-      </w:r>
-    </w:p>
-    <w:p>
-      <w:r>
-        <w:pict>
-          <v:rect id="_x0000_i1035" style="width:9in;height:.75pt" o:hrpct="0" o:hralign="center" o:hrstd="t" o:hr="t" fillcolor="#a0a0a0" stroked="f"/>
-        </w:pict>
-      </w:r>
-    </w:p>
-    <w:p>
-      <w:pPr>
-        <w:rPr>
-          <w:b/>
-          <w:bCs/>
-        </w:rPr>
-      </w:pPr>
-      <w:r>
-        <w:rPr>
-          <w:b/>
-          <w:bCs/>
-        </w:rPr>
-        <w:t>4. Results / Demo / Evaluation (2.5 min)</w:t>
-      </w:r>
-    </w:p>
-    <w:p>
-      <w:r>
-        <w:rPr>
-          <w:b/>
-          <w:bCs/>
-        </w:rPr>
-        <w:t>Action:</w:t>
-      </w:r>
-      <w:r>
-        <w:t> Scroll to the </w:t>
-      </w:r>
-      <w:r>
-        <w:rPr>
-          <w:b/>
-          <w:bCs/>
-        </w:rPr>
-        <w:t>Methodology (Section 4)</w:t>
-      </w:r>
-      <w:r>
-        <w:t> and </w:t>
-      </w:r>
-      <w:r>
-        <w:rPr>
-          <w:b/>
-          <w:bCs/>
-        </w:rPr>
-        <w:t>Results (Section 5 / Figure 5)</w:t>
-      </w:r>
-      <w:r>
-        <w:t>. If you have a live demo or a separate screenshot of the Dashboard (Figure 3), switch to it here. </w:t>
-      </w:r>
-      <w:r>
-        <w:rPr>
-          <w:b/>
-          <w:bCs/>
-        </w:rPr>
-        <w:t>Goal:</w:t>
-      </w:r>
-      <w:r>
-        <w:t> Prove that your system works under realistic constraints.</w:t>
-      </w:r>
-    </w:p>
-    <w:p>
-      <w:pPr>
-        <w:numPr>
-          <w:ilvl w:val="0"/>
-          <w:numId w:val="9"/>
-        </w:numPr>
-      </w:pPr>
-      <w:r>
-        <w:rPr>
-          <w:b/>
-          <w:bCs/>
-        </w:rPr>
-        <w:t>Experiment Logic &amp; Setup (Section 4.2)</w:t>
-      </w:r>
-    </w:p>
-    <w:p>
-      <w:pPr>
-        <w:numPr>
-          <w:ilvl w:val="1"/>
-          <w:numId w:val="9"/>
-        </w:numPr>
-      </w:pPr>
-      <w:r>
-        <w:rPr>
-          <w:b/>
-          <w:bCs/>
-        </w:rPr>
-        <w:t>Methodology:</w:t>
-      </w:r>
-      <w:r>
-        <w:t> Explain that you simulated real-world edge constraints using three environments: Browser (baseline), Docker Fleet (CoAP stress-test), and QEMU ARM Emulator (legacy hardware).</w:t>
-      </w:r>
-    </w:p>
-    <w:p>
-      <w:pPr>
-        <w:numPr>
-          <w:ilvl w:val="0"/>
-          <w:numId w:val="9"/>
-        </w:numPr>
-      </w:pPr>
-      <w:r>
-        <w:rPr>
-          <w:b/>
-          <w:bCs/>
-        </w:rPr>
-        <w:t>The Results (Latency &amp; Payload - Section 5.1/5.2)</w:t>
-      </w:r>
-    </w:p>
-    <w:p>
-      <w:pPr>
-        <w:numPr>
-          <w:ilvl w:val="1"/>
-          <w:numId w:val="9"/>
-        </w:numPr>
-      </w:pPr>
-      <w:r>
-        <w:rPr>
-          <w:b/>
-          <w:bCs/>
-        </w:rPr>
-        <w:t>What are the results?</w:t>
-      </w:r>
-    </w:p>
-    <w:p>
-      <w:pPr>
-        <w:numPr>
-          <w:ilvl w:val="2"/>
-          <w:numId w:val="9"/>
-        </w:numPr>
-      </w:pPr>
-      <w:r>
-        <w:rPr>
-          <w:b/>
-          <w:bCs/>
-        </w:rPr>
-        <w:t>Speed:</w:t>
-      </w:r>
-      <w:r>
-        <w:t> Even with up to 200 concurrent devices, end-to-end authentication stabilized at ~1.8 seconds.</w:t>
-      </w:r>
-    </w:p>
-    <w:p>
-      <w:pPr>
-        <w:numPr>
-          <w:ilvl w:val="2"/>
-          <w:numId w:val="9"/>
-        </w:numPr>
-      </w:pPr>
-      <w:r>
-        <w:rPr>
-          <w:b/>
-          <w:bCs/>
-        </w:rPr>
-        <w:t>Payload:</w:t>
-      </w:r>
-      <w:r>
-        <w:t> Using CoAP/CBOR drastically reduced the network payload compared to HTTP/JSON.</w:t>
-      </w:r>
-    </w:p>
-    <w:p>
-      <w:pPr>
-        <w:numPr>
-          <w:ilvl w:val="2"/>
-          <w:numId w:val="9"/>
-        </w:numPr>
-      </w:pPr>
-      <w:r>
-        <w:rPr>
-          <w:b/>
-          <w:bCs/>
-        </w:rPr>
-        <w:t>Crypto Overhead:</w:t>
-      </w:r>
-      <w:r>
-        <w:t> Even emulated old ARM processors handled the ECDSA signature efficiently.</w:t>
-      </w:r>
-    </w:p>
-    <w:p>
-      <w:pPr>
-        <w:numPr>
-          <w:ilvl w:val="0"/>
-          <w:numId w:val="9"/>
-        </w:numPr>
-      </w:pPr>
-      <w:r>
-        <w:rPr>
-          <w:b/>
-          <w:bCs/>
-        </w:rPr>
-        <w:t>The Dashboard (Demo or Figure 3)</w:t>
-      </w:r>
-    </w:p>
-    <w:p>
-      <w:pPr>
-        <w:numPr>
-          <w:ilvl w:val="1"/>
-          <w:numId w:val="9"/>
-        </w:numPr>
-      </w:pPr>
-      <w:r>
-        <w:rPr>
-          <w:b/>
-          <w:bCs/>
-        </w:rPr>
-        <w:t>Explanation:</w:t>
-      </w:r>
-      <w:r>
-        <w:t> Point out the real-time blockchain height and device state distribution, showing how administrators get a cryptographically proven audit trail.</w:t>
-      </w:r>
-    </w:p>
-    <w:p>
-      <w:r>
-        <w:pict>
-          <v:rect id="_x0000_i1036" style="width:9in;height:.75pt" o:hrpct="0" o:hralign="center" o:hrstd="t" o:hr="t" fillcolor="#a0a0a0" stroked="f"/>
-        </w:pict>
-      </w:r>
-    </w:p>
-    <w:p>
-      <w:pPr>
-        <w:rPr>
-          <w:b/>
-          <w:bCs/>
-        </w:rPr>
-      </w:pPr>
-      <w:r>
-        <w:rPr>
-          <w:b/>
-          <w:bCs/>
-        </w:rPr>
-        <w:lastRenderedPageBreak/>
-        <w:t>5. Conclusion &amp; Future Work (1 min)</w:t>
-      </w:r>
-    </w:p>
-    <w:p>
-      <w:r>
-        <w:rPr>
-          <w:b/>
-          <w:bCs/>
-        </w:rPr>
-        <w:t>Action:</w:t>
-      </w:r>
-      <w:r>
-        <w:t> Scroll to </w:t>
-      </w:r>
-      <w:r>
-        <w:rPr>
-          <w:b/>
-          <w:bCs/>
-        </w:rPr>
-        <w:t>Section 6 (Conclusion) and Figure 8 (Future Architecture)</w:t>
-      </w:r>
-      <w:r>
-        <w:t>. </w:t>
-      </w:r>
-      <w:r>
-        <w:rPr>
-          <w:b/>
-          <w:bCs/>
-        </w:rPr>
-        <w:t>Goal:</w:t>
-      </w:r>
-      <w:r>
-        <w:t> Wrap up strongly and show vision.</w:t>
-      </w:r>
-    </w:p>
-    <w:p>
-      <w:pPr>
-        <w:numPr>
-          <w:ilvl w:val="0"/>
-          <w:numId w:val="10"/>
-        </w:numPr>
-      </w:pPr>
-      <w:r>
-        <w:rPr>
-          <w:b/>
-          <w:bCs/>
-        </w:rPr>
-        <w:t>Conclusion (Section 6.1)</w:t>
-      </w:r>
-    </w:p>
-    <w:p>
-      <w:pPr>
-        <w:numPr>
-          <w:ilvl w:val="1"/>
-          <w:numId w:val="10"/>
-        </w:numPr>
-      </w:pPr>
-      <w:r>
-        <w:rPr>
-          <w:b/>
-          <w:bCs/>
-        </w:rPr>
-        <w:t>Summary:</w:t>
-      </w:r>
-      <w:r>
-        <w:t> We successfully decentralized IoT authentication, eliminated the single point of failure using Hyperledger Fabric, and proved it runs efficiently even on constrained legacy hardware.</w:t>
-      </w:r>
-    </w:p>
-    <w:p>
-      <w:pPr>
-        <w:numPr>
-          <w:ilvl w:val="1"/>
-          <w:numId w:val="10"/>
-        </w:numPr>
-      </w:pPr>
-      <w:r>
-        <w:rPr>
-          <w:b/>
-          <w:bCs/>
-        </w:rPr>
-        <w:t>Impact:</w:t>
-      </w:r>
-      <w:r>
-        <w:t> Factories can retrofit existing sensors with modern security without ripping out physical hardware.</w:t>
-      </w:r>
-    </w:p>
-    <w:p>
-      <w:pPr>
-        <w:numPr>
-          <w:ilvl w:val="0"/>
-          <w:numId w:val="10"/>
-        </w:numPr>
-      </w:pPr>
-      <w:r>
-        <w:rPr>
-          <w:b/>
-          <w:bCs/>
-        </w:rPr>
-        <w:t>Future Work (Show Figure 8)</w:t>
-      </w:r>
-    </w:p>
-    <w:p>
-      <w:pPr>
-        <w:numPr>
-          <w:ilvl w:val="1"/>
-          <w:numId w:val="10"/>
-        </w:numPr>
-      </w:pPr>
-      <w:r>
-        <w:rPr>
-          <w:b/>
-          <w:bCs/>
-        </w:rPr>
-        <w:t>Hardware Security:</w:t>
-      </w:r>
-      <w:r>
-        <w:t> Integrating physical Trusted Platform Modules (TPMs).</w:t>
-      </w:r>
-    </w:p>
-    <w:p>
-      <w:pPr>
-        <w:numPr>
-          <w:ilvl w:val="1"/>
-          <w:numId w:val="10"/>
-        </w:numPr>
-      </w:pPr>
-      <w:r>
-        <w:rPr>
-          <w:b/>
-          <w:bCs/>
-        </w:rPr>
-        <w:t>Post-Quantum:</w:t>
-      </w:r>
-      <w:r>
-        <w:t> Upgrading to quantum-resistant algorithms to future-proof against upcoming threats.</w:t>
-      </w:r>
-    </w:p>
-    <w:p/>
+      <w:bookmarkStart w:id="0" w:name="_GoBack"/>
+      <w:bookmarkEnd w:id="0"/>
+    </w:p>
     <w:sectPr>
       <w:pgSz w:w="11906" w:h="16838"/>
       <w:pgMar w:top="1417" w:right="1417" w:bottom="1417" w:left="1417" w:header="708" w:footer="708" w:gutter="0"/>

</xml_diff>

<commit_message>
Frontend change: useRef guards for multi-clicks on Dashboard
</commit_message>
<xml_diff>
--- a/Walkthrough.docx
+++ b/Walkthrough.docx
@@ -49,6 +49,11 @@
     </w:p>
     <w:p>
       <w:r>
+        <w:t xml:space="preserve">Note: We need all the relevant Images in Docker Desktop! </w:t>
+      </w:r>
+    </w:p>
+    <w:p>
+      <w:r>
         <w:pict>
           <v:rect id="_x0000_i1025" style="width:386.75pt;height:.75pt" o:hrpct="0" o:hralign="center" o:hrstd="t" o:hr="t" fillcolor="#a0a0a0" stroked="f"/>
         </w:pict>
@@ -287,124 +292,138 @@
       <w:r>
         <w:rPr>
           <w:bCs/>
+        </w:rPr>
+        <w:t>Windows Backend (from root</w:t>
+      </w:r>
+      <w:r>
+        <w:rPr>
+          <w:bCs/>
+        </w:rPr>
+        <w:t xml:space="preserve"> AuthApp</w:t>
+      </w:r>
+      <w:r>
+        <w:rPr>
+          <w:bCs/>
+        </w:rPr>
+        <w:t>):</w:t>
+      </w:r>
+    </w:p>
+    <w:p>
+      <w:pPr>
+        <w:rPr>
+          <w:b/>
+          <w:bCs/>
+        </w:rPr>
+      </w:pPr>
+      <w:r>
+        <w:rPr>
+          <w:b/>
+          <w:bCs/>
+        </w:rPr>
+        <w:t>Org 1</w:t>
+      </w:r>
+      <w:r>
+        <w:rPr>
+          <w:b/>
+          <w:bCs/>
+        </w:rPr>
+        <w:t>:</w:t>
+      </w:r>
+    </w:p>
+    <w:p>
+      <w:pPr>
+        <w:rPr>
+          <w:bCs/>
+          <w:color w:val="00B050"/>
+        </w:rPr>
+      </w:pPr>
+      <w:r>
+        <w:rPr>
+          <w:bCs/>
+          <w:color w:val="00B050"/>
+        </w:rPr>
+        <w:t>powershell -NoProfile -ExecutionPolicy Bypass -File .\backend\startGateway.ps1</w:t>
+      </w:r>
+    </w:p>
+    <w:p>
+      <w:pPr>
+        <w:rPr>
+          <w:b/>
+          <w:bCs/>
+        </w:rPr>
+      </w:pPr>
+      <w:r>
+        <w:rPr>
+          <w:b/>
+          <w:bCs/>
+        </w:rPr>
+        <w:t>Org 2</w:t>
+      </w:r>
+      <w:r>
+        <w:rPr>
+          <w:b/>
+          <w:bCs/>
+        </w:rPr>
+        <w:t>:</w:t>
+      </w:r>
+    </w:p>
+    <w:p>
+      <w:pPr>
+        <w:rPr>
+          <w:bCs/>
+          <w:color w:val="00B050"/>
+        </w:rPr>
+      </w:pPr>
+      <w:r>
+        <w:rPr>
+          <w:bCs/>
+          <w:color w:val="00B050"/>
+        </w:rPr>
+        <w:t>powershell -NoProfile -ExecutionPolicy Bypass -File .\backend\startGateway.ps1</w:t>
+      </w:r>
+      <w:r>
+        <w:t xml:space="preserve"> </w:t>
+      </w:r>
+      <w:r>
+        <w:rPr>
+          <w:bCs/>
+          <w:color w:val="00B050"/>
+        </w:rPr>
+        <w:t>-Org org2</w:t>
+      </w:r>
+    </w:p>
+    <w:p>
+      <w:pPr>
+        <w:rPr>
+          <w:bCs/>
+          <w:color w:val="00B050"/>
+        </w:rPr>
+      </w:pPr>
+      <w:r>
+        <w:rPr>
+          <w:b/>
+          <w:bCs/>
           <w:highlight w:val="yellow"/>
         </w:rPr>
-        <w:t>Windows Backend (from root</w:t>
-      </w:r>
-      <w:r>
-        <w:rPr>
+        <w:lastRenderedPageBreak/>
+        <w:t>Start both orgs backends</w:t>
+      </w:r>
+      <w:r>
+        <w:rPr>
+          <w:b/>
           <w:bCs/>
           <w:highlight w:val="yellow"/>
         </w:rPr>
-        <w:t xml:space="preserve"> AuthApp</w:t>
-      </w:r>
-      <w:r>
-        <w:rPr>
+        <w:t xml:space="preserve"> (on Windows)</w:t>
+      </w:r>
+      <w:r>
+        <w:rPr>
+          <w:b/>
           <w:bCs/>
           <w:highlight w:val="yellow"/>
         </w:rPr>
-        <w:t>):</w:t>
-      </w:r>
-    </w:p>
-    <w:p>
-      <w:pPr>
-        <w:rPr>
-          <w:b/>
-          <w:bCs/>
-        </w:rPr>
-      </w:pPr>
-      <w:r>
-        <w:rPr>
-          <w:b/>
-          <w:bCs/>
-        </w:rPr>
-        <w:t>Org 1</w:t>
-      </w:r>
-      <w:r>
-        <w:rPr>
-          <w:b/>
-          <w:bCs/>
-        </w:rPr>
         <w:t>:</w:t>
       </w:r>
-    </w:p>
-    <w:p>
-      <w:pPr>
-        <w:rPr>
-          <w:bCs/>
-          <w:color w:val="00B050"/>
-        </w:rPr>
-      </w:pPr>
-      <w:r>
-        <w:rPr>
-          <w:bCs/>
-          <w:color w:val="00B050"/>
-        </w:rPr>
-        <w:t>powershell -NoProfile -ExecutionPolicy Bypass -File .\backend\startGateway.ps1</w:t>
-      </w:r>
-    </w:p>
-    <w:p>
-      <w:pPr>
-        <w:rPr>
-          <w:b/>
-          <w:bCs/>
-        </w:rPr>
-      </w:pPr>
-      <w:r>
-        <w:rPr>
-          <w:b/>
-          <w:bCs/>
-        </w:rPr>
-        <w:t>Org 2</w:t>
-      </w:r>
-      <w:r>
-        <w:rPr>
-          <w:b/>
-          <w:bCs/>
-        </w:rPr>
-        <w:t>:</w:t>
-      </w:r>
-    </w:p>
-    <w:p>
-      <w:pPr>
-        <w:rPr>
-          <w:bCs/>
-          <w:color w:val="00B050"/>
-        </w:rPr>
-      </w:pPr>
-      <w:r>
-        <w:rPr>
-          <w:bCs/>
-          <w:color w:val="00B050"/>
-        </w:rPr>
-        <w:t>powershell -NoProfile -ExecutionPolicy Bypass -File .\backend\startGateway.ps1</w:t>
-      </w:r>
-      <w:r>
-        <w:t xml:space="preserve"> </w:t>
-      </w:r>
-      <w:r>
-        <w:rPr>
-          <w:bCs/>
-          <w:color w:val="00B050"/>
-        </w:rPr>
-        <w:t>-Org org2</w:t>
-      </w:r>
-    </w:p>
-    <w:p>
-      <w:pPr>
-        <w:rPr>
-          <w:bCs/>
-          <w:color w:val="00B050"/>
-        </w:rPr>
-      </w:pPr>
-      <w:r>
-        <w:rPr>
-          <w:b/>
-          <w:bCs/>
-        </w:rPr>
-        <w:lastRenderedPageBreak/>
-        <w:t>Start both orgs backends:</w:t>
-      </w:r>
       <w:r>
         <w:rPr>
           <w:bCs/>
@@ -435,82 +454,90 @@
       </w:r>
     </w:p>
     <w:p>
-      <w:r>
-        <w:rPr>
-          <w:highlight w:val="yellow"/>
-        </w:rPr>
-        <w:t>Start both gateways (WSL</w:t>
-      </w:r>
-      <w:r>
-        <w:rPr>
-          <w:highlight w:val="yellow"/>
-        </w:rPr>
-        <w:t xml:space="preserve"> in</w:t>
-      </w:r>
-      <w:r>
-        <w:rPr>
-          <w:highlight w:val="yellow"/>
-        </w:rPr>
-        <w:t xml:space="preserve"> root</w:t>
-      </w:r>
-      <w:r>
-        <w:rPr>
-          <w:highlight w:val="yellow"/>
-        </w:rPr>
-        <w:t xml:space="preserve"> AuthApp</w:t>
-      </w:r>
-      <w:r>
-        <w:rPr>
-          <w:highlight w:val="yellow"/>
-        </w:rPr>
-        <w:t>):</w:t>
-      </w:r>
-    </w:p>
-    <w:p>
-      <w:pPr>
-        <w:rPr>
-          <w:color w:val="7030A0"/>
-        </w:rPr>
-      </w:pPr>
-      <w:r>
-        <w:rPr>
-          <w:color w:val="7030A0"/>
-        </w:rPr>
-        <w:t>w</w:t>
-      </w:r>
-      <w:r>
-        <w:rPr>
-          <w:color w:val="7030A0"/>
-        </w:rPr>
-        <w:t xml:space="preserve">sl bash </w:t>
-      </w:r>
-      <w:r>
-        <w:rPr>
-          <w:color w:val="7030A0"/>
-        </w:rPr>
-        <w:t xml:space="preserve">./startGateways.sh </w:t>
-      </w:r>
-    </w:p>
-    <w:p>
-      <w:pPr>
-        <w:rPr>
-          <w:color w:val="00B050"/>
-        </w:rPr>
-      </w:pPr>
-      <w:r>
-        <w:rPr>
-          <w:b/>
-        </w:rPr>
-        <w:t xml:space="preserve">Check </w:t>
-      </w:r>
-      <w:r>
-        <w:rPr>
-          <w:b/>
-        </w:rPr>
-        <w:t xml:space="preserve">Org1 </w:t>
-      </w:r>
+      <w:pPr>
+        <w:rPr>
+          <w:bCs/>
+          <w:color w:val="00B050"/>
+        </w:rPr>
+      </w:pPr>
       <w:bookmarkStart w:id="0" w:name="_GoBack"/>
       <w:bookmarkEnd w:id="0"/>
+    </w:p>
+    <w:p>
+      <w:r>
+        <w:rPr>
+          <w:highlight w:val="lightGray"/>
+        </w:rPr>
+        <w:t>Start both gateways (WSL</w:t>
+      </w:r>
+      <w:r>
+        <w:rPr>
+          <w:highlight w:val="lightGray"/>
+        </w:rPr>
+        <w:t xml:space="preserve"> in</w:t>
+      </w:r>
+      <w:r>
+        <w:rPr>
+          <w:highlight w:val="lightGray"/>
+        </w:rPr>
+        <w:t xml:space="preserve"> root</w:t>
+      </w:r>
+      <w:r>
+        <w:rPr>
+          <w:highlight w:val="lightGray"/>
+        </w:rPr>
+        <w:t xml:space="preserve"> AuthApp</w:t>
+      </w:r>
+      <w:r>
+        <w:rPr>
+          <w:highlight w:val="lightGray"/>
+        </w:rPr>
+        <w:t>):</w:t>
+      </w:r>
+    </w:p>
+    <w:p>
+      <w:pPr>
+        <w:rPr>
+          <w:color w:val="7030A0"/>
+        </w:rPr>
+      </w:pPr>
+      <w:r>
+        <w:rPr>
+          <w:color w:val="7030A0"/>
+        </w:rPr>
+        <w:t>w</w:t>
+      </w:r>
+      <w:r>
+        <w:rPr>
+          <w:color w:val="7030A0"/>
+        </w:rPr>
+        <w:t xml:space="preserve">sl bash </w:t>
+      </w:r>
+      <w:r>
+        <w:rPr>
+          <w:color w:val="7030A0"/>
+        </w:rPr>
+        <w:t xml:space="preserve">./startGateways.sh </w:t>
+      </w:r>
+    </w:p>
+    <w:p>
+      <w:pPr>
+        <w:rPr>
+          <w:color w:val="00B050"/>
+        </w:rPr>
+      </w:pPr>
+      <w:r>
+        <w:rPr>
+          <w:b/>
+        </w:rPr>
+        <w:t xml:space="preserve">Check </w:t>
+      </w:r>
+      <w:r>
+        <w:rPr>
+          <w:b/>
+        </w:rPr>
+        <w:t xml:space="preserve">Org1 </w:t>
+      </w:r>
       <w:r>
         <w:rPr>
           <w:b/>
@@ -895,6 +922,13 @@
     </w:p>
     <w:p>
       <w:pPr>
+        <w:rPr>
+          <w:color w:val="FF0000"/>
+        </w:rPr>
+      </w:pPr>
+    </w:p>
+    <w:p>
+      <w:pPr>
         <w:pStyle w:val="Heading2"/>
         <w:rPr>
           <w:u w:val="single"/>
@@ -904,6 +938,7 @@
         <w:rPr>
           <w:u w:val="single"/>
         </w:rPr>
+        <w:lastRenderedPageBreak/>
         <w:t>2. QEMU (realistic simulation)</w:t>
       </w:r>
     </w:p>
@@ -917,7 +952,6 @@
         </w:numPr>
       </w:pPr>
       <w:r>
-        <w:lastRenderedPageBreak/>
         <w:t xml:space="preserve">Run </w:t>
       </w:r>
       <w:r>
@@ -1123,12 +1157,45 @@
           <w:bCs/>
         </w:rPr>
       </w:pPr>
-      <w:r>
-        <w:rPr>
-          <w:b/>
-          <w:bCs/>
-        </w:rPr>
+    </w:p>
+    <w:p>
+      <w:pPr>
+        <w:rPr>
+          <w:b/>
+          <w:bCs/>
+        </w:rPr>
+      </w:pPr>
+    </w:p>
+    <w:p>
+      <w:pPr>
+        <w:rPr>
+          <w:b/>
+          <w:bCs/>
+          <w:sz w:val="28"/>
+          <w:szCs w:val="28"/>
+          <w:u w:val="single"/>
+        </w:rPr>
+      </w:pPr>
+      <w:r>
+        <w:rPr>
+          <w:b/>
+          <w:bCs/>
+          <w:sz w:val="28"/>
+          <w:szCs w:val="28"/>
+          <w:u w:val="single"/>
+        </w:rPr>
+        <w:lastRenderedPageBreak/>
         <w:t>Cleanup</w:t>
+      </w:r>
+      <w:r>
+        <w:rPr>
+          <w:b/>
+          <w:bCs/>
+          <w:sz w:val="28"/>
+          <w:szCs w:val="28"/>
+          <w:u w:val="single"/>
+        </w:rPr>
+        <w:t>:</w:t>
       </w:r>
     </w:p>
     <w:p>
@@ -1170,7 +1237,6 @@
         <w:rPr>
           <w:highlight w:val="yellow"/>
         </w:rPr>
-        <w:lastRenderedPageBreak/>
         <w:t>Fabric down:</w:t>
       </w:r>
     </w:p>

</xml_diff>

<commit_message>
Testing Suite for chaincode & backend, plus stored the images used in the Thesis Paper.
</commit_message>
<xml_diff>
--- a/Walkthrough.docx
+++ b/Walkthrough.docx
@@ -460,8 +460,6 @@
           <w:color w:val="00B050"/>
         </w:rPr>
       </w:pPr>
-      <w:bookmarkStart w:id="0" w:name="_GoBack"/>
-      <w:bookmarkEnd w:id="0"/>
     </w:p>
     <w:p>
       <w:r>
@@ -720,6 +718,35 @@
     </w:p>
     <w:p/>
     <w:p>
+      <w:r>
+        <w:rPr>
+          <w:highlight w:val="green"/>
+        </w:rPr>
+        <w:t>Stress Testing:</w:t>
+      </w:r>
+      <w:r>
+        <w:br/>
+      </w:r>
+      <w:r>
+        <w:rPr>
+          <w:color w:val="00B050"/>
+        </w:rPr>
+        <w:t>wsl bash ./</w:t>
+      </w:r>
+      <w:r>
+        <w:rPr>
+          <w:color w:val="00B050"/>
+        </w:rPr>
+        <w:t>stress-test.sh 10</w:t>
+      </w:r>
+      <w:r>
+        <w:rPr>
+          <w:color w:val="00B050"/>
+        </w:rPr>
+        <w:t xml:space="preserve"> </w:t>
+      </w:r>
+    </w:p>
+    <w:p>
       <w:pPr>
         <w:rPr>
           <w:color w:val="FF0000"/>
@@ -810,20 +837,20 @@
     <w:p>
       <w:r>
         <w:rPr>
-          <w:highlight w:val="cyan"/>
+          <w:highlight w:val="green"/>
         </w:rPr>
         <w:t xml:space="preserve">AuthApp/simulator (1 gateway – </w:t>
       </w:r>
       <w:r>
         <w:rPr>
           <w:b/>
-          <w:highlight w:val="cyan"/>
+          <w:highlight w:val="green"/>
         </w:rPr>
         <w:t>CoAP</w:t>
       </w:r>
       <w:r>
         <w:rPr>
-          <w:highlight w:val="cyan"/>
+          <w:highlight w:val="green"/>
         </w:rPr>
         <w:t>): (5, 10 ,50)</w:t>
       </w:r>
@@ -856,14 +883,14 @@
       <w:r>
         <w:rPr>
           <w:b/>
-          <w:highlight w:val="cyan"/>
+          <w:highlight w:val="yellow"/>
         </w:rPr>
         <w:t>Run against both ga</w:t>
       </w:r>
       <w:r>
         <w:rPr>
           <w:b/>
-          <w:highlight w:val="cyan"/>
+          <w:highlight w:val="yellow"/>
         </w:rPr>
         <w:t>teways (needs Windows implementation):</w:t>
       </w:r>
@@ -917,6 +944,7 @@
         <w:rPr>
           <w:color w:val="FF0000"/>
         </w:rPr>
+        <w:lastRenderedPageBreak/>
         <w:t>bash clean-sensors.sh</w:t>
       </w:r>
     </w:p>
@@ -938,7 +966,6 @@
         <w:rPr>
           <w:u w:val="single"/>
         </w:rPr>
-        <w:lastRenderedPageBreak/>
         <w:t>2. QEMU (realistic simulation)</w:t>
       </w:r>
     </w:p>
@@ -1184,7 +1211,6 @@
           <w:szCs w:val="28"/>
           <w:u w:val="single"/>
         </w:rPr>
-        <w:lastRenderedPageBreak/>
         <w:t>Cleanup</w:t>
       </w:r>
       <w:r>
@@ -1283,6 +1309,68 @@
           <w:color w:val="7030A0"/>
         </w:rPr>
         <w:t>docker exec -it peer0.org1.example.com peer channel getinfo -c mychannel</w:t>
+      </w:r>
+    </w:p>
+    <w:p>
+      <w:pPr>
+        <w:rPr>
+          <w:color w:val="7030A0"/>
+        </w:rPr>
+      </w:pPr>
+      <w:bookmarkStart w:id="0" w:name="_GoBack"/>
+      <w:bookmarkEnd w:id="0"/>
+    </w:p>
+    <w:p>
+      <w:pPr>
+        <w:rPr>
+          <w:sz w:val="28"/>
+          <w:szCs w:val="28"/>
+          <w:u w:val="single"/>
+        </w:rPr>
+      </w:pPr>
+      <w:r>
+        <w:rPr>
+          <w:sz w:val="28"/>
+          <w:szCs w:val="28"/>
+          <w:u w:val="single"/>
+        </w:rPr>
+        <w:t>Testing:</w:t>
+      </w:r>
+      <w:r>
+        <w:rPr>
+          <w:sz w:val="28"/>
+          <w:szCs w:val="28"/>
+          <w:u w:val="single"/>
+        </w:rPr>
+        <w:t xml:space="preserve"> </w:t>
+      </w:r>
+    </w:p>
+    <w:p>
+      <w:r>
+        <w:t>AuthApp/backend</w:t>
+      </w:r>
+      <w:r>
+        <w:t xml:space="preserve"> </w:t>
+      </w:r>
+      <w:r>
+        <w:sym w:font="Wingdings" w:char="F0E0"/>
+      </w:r>
+      <w:r>
+        <w:t xml:space="preserve"> npm test</w:t>
+      </w:r>
+    </w:p>
+    <w:p>
+      <w:r>
+        <w:t>AuthApp/chaincode/iot-auth</w:t>
+      </w:r>
+      <w:r>
+        <w:t xml:space="preserve"> </w:t>
+      </w:r>
+      <w:r>
+        <w:sym w:font="Wingdings" w:char="F0E0"/>
+      </w:r>
+      <w:r>
+        <w:t xml:space="preserve"> npm test</w:t>
       </w:r>
     </w:p>
     <w:sectPr>

</xml_diff>

<commit_message>
Final Changes for Presentation.
</commit_message>
<xml_diff>
--- a/Walkthrough.docx
+++ b/Walkthrough.docx
@@ -883,54 +883,63 @@
       <w:r>
         <w:rPr>
           <w:b/>
+          <w:highlight w:val="magenta"/>
+        </w:rPr>
+        <w:t>Run against both ga</w:t>
+      </w:r>
+      <w:r>
+        <w:rPr>
+          <w:b/>
+          <w:highlight w:val="magenta"/>
+        </w:rPr>
+        <w:t>teways (needs Windows implementation):</w:t>
+      </w:r>
+      <w:r>
+        <w:rPr>
+          <w:b/>
+        </w:rPr>
+        <w:t xml:space="preserve"> </w:t>
+      </w:r>
+      <w:r>
+        <w:rPr>
+          <w:color w:val="00B050"/>
+        </w:rPr>
+        <w:br/>
+      </w:r>
+      <w:r>
+        <w:rPr>
+          <w:color w:val="00B050"/>
+        </w:rPr>
+        <w:t>wsl bash</w:t>
+      </w:r>
+      <w:r>
+        <w:rPr>
+          <w:color w:val="00B050"/>
+        </w:rPr>
+        <w:t xml:space="preserve"> ./demo-dual-gateway.sh 5</w:t>
+      </w:r>
+    </w:p>
+    <w:p>
+      <w:pPr>
+        <w:rPr>
+          <w:b/>
           <w:highlight w:val="yellow"/>
         </w:rPr>
-        <w:t>Run against both ga</w:t>
-      </w:r>
+      </w:pPr>
+    </w:p>
+    <w:p>
       <w:r>
         <w:rPr>
           <w:b/>
           <w:highlight w:val="yellow"/>
         </w:rPr>
-        <w:t>teways (needs Windows implementation):</w:t>
-      </w:r>
-      <w:r>
-        <w:rPr>
-          <w:b/>
-        </w:rPr>
-        <w:t xml:space="preserve"> </w:t>
-      </w:r>
-      <w:r>
-        <w:rPr>
-          <w:color w:val="00B050"/>
-        </w:rPr>
-        <w:br/>
-      </w:r>
-      <w:r>
-        <w:rPr>
-          <w:color w:val="00B050"/>
-        </w:rPr>
-        <w:t>wsl bash</w:t>
-      </w:r>
-      <w:r>
-        <w:rPr>
-          <w:color w:val="00B050"/>
-        </w:rPr>
-        <w:t xml:space="preserve"> ./demo-dual-gateway.sh 5</w:t>
-      </w:r>
-    </w:p>
-    <w:p>
-      <w:r>
-        <w:rPr>
-          <w:b/>
+        <w:lastRenderedPageBreak/>
+        <w:t>Clean</w:t>
+      </w:r>
+      <w:r>
+        <w:rPr>
           <w:highlight w:val="yellow"/>
         </w:rPr>
-        <w:t>Clean</w:t>
-      </w:r>
-      <w:r>
-        <w:rPr>
-          <w:highlight w:val="yellow"/>
-        </w:rPr>
         <w:t xml:space="preserve"> (/simulator cmd):</w:t>
       </w:r>
     </w:p>
@@ -944,7 +953,6 @@
         <w:rPr>
           <w:color w:val="FF0000"/>
         </w:rPr>
-        <w:lastRenderedPageBreak/>
         <w:t>bash clean-sensors.sh</w:t>
       </w:r>
     </w:p>
@@ -1172,6 +1180,7 @@
     </w:p>
     <w:p>
       <w:r>
+        <w:lastRenderedPageBreak/>
         <w:pict>
           <v:rect id="_x0000_i1032" style="width:386.75pt;height:.75pt" o:hrpct="0" o:hralign="center" o:hrstd="t" o:hr="t" fillcolor="#a0a0a0" stroked="f"/>
         </w:pict>
@@ -1332,6 +1341,7 @@
         <w:rPr>
           <w:sz w:val="28"/>
           <w:szCs w:val="28"/>
+          <w:highlight w:val="yellow"/>
           <w:u w:val="single"/>
         </w:rPr>
         <w:t>Testing:</w:t>

</xml_diff>